<commit_message>
V21: Updated score with latest response from client. Checked and added attack numbers for rehearsal C section.
</commit_message>
<xml_diff>
--- a/2 Proofreading and Review/LARA Mosaic Maze - Errata_v2 (Page 1-60) - Major Changes.docx
+++ b/2 Proofreading and Review/LARA Mosaic Maze - Errata_v2 (Page 1-60) - Major Changes.docx
@@ -6639,6 +6639,8 @@
       <w:pPr>
         <w:rPr>
           <w:rFonts w:ascii="Aptos Display" w:hAnsi="Aptos Display"/>
+          <w:b/>
+          <w:bCs/>
           <w:sz w:val="28"/>
           <w:szCs w:val="28"/>
         </w:rPr>
@@ -6651,6 +6653,7 @@
           <w:szCs w:val="28"/>
           <w14:ligatures w14:val="standardContextual"/>
         </w:rPr>
+        <w:lastRenderedPageBreak/>
         <w:drawing>
           <wp:inline distT="0" distB="0" distL="0" distR="0" wp14:anchorId="6586C28C" wp14:editId="0287AE72">
             <wp:extent cx="5943600" cy="412115"/>
@@ -6693,6 +6696,901 @@
           </wp:inline>
         </w:drawing>
       </w:r>
+      <w:r>
+        <w:rPr>
+          <w:rFonts w:ascii="Aptos Display" w:hAnsi="Aptos Display"/>
+          <w:sz w:val="28"/>
+          <w:szCs w:val="28"/>
+        </w:rPr>
+        <w:br/>
+      </w:r>
+      <w:r>
+        <w:rPr>
+          <w:rFonts w:ascii="Aptos Display" w:hAnsi="Aptos Display"/>
+          <w:sz w:val="28"/>
+          <w:szCs w:val="28"/>
+        </w:rPr>
+        <w:br/>
+      </w:r>
+      <w:r>
+        <w:rPr>
+          <w:rFonts w:ascii="Aptos Display" w:hAnsi="Aptos Display"/>
+          <w:sz w:val="28"/>
+          <w:szCs w:val="28"/>
+        </w:rPr>
+        <w:br/>
+      </w:r>
+      <w:r>
+        <w:rPr>
+          <w:rFonts w:ascii="Aptos Display" w:hAnsi="Aptos Display"/>
+          <w:sz w:val="28"/>
+          <w:szCs w:val="28"/>
+        </w:rPr>
+        <w:br/>
+      </w:r>
+      <w:r>
+        <w:rPr>
+          <w:rFonts w:ascii="Aptos Display" w:hAnsi="Aptos Display"/>
+          <w:b/>
+          <w:bCs/>
+          <w:sz w:val="28"/>
+          <w:szCs w:val="28"/>
+        </w:rPr>
+        <w:t>Further changes (30 Mar)</w:t>
+      </w:r>
+    </w:p>
+    <w:p>
+      <w:pPr>
+        <w:rPr>
+          <w:color w:val="500050"/>
+          <w:shd w:val="clear" w:color="auto" w:fill="FFFFFF"/>
+        </w:rPr>
+      </w:pPr>
+      <w:r>
+        <w:rPr>
+          <w:color w:val="500050"/>
+          <w:shd w:val="clear" w:color="auto" w:fill="FFFFFF"/>
+        </w:rPr>
+        <w:t>1. </w:t>
+      </w:r>
+      <w:r>
+        <w:rPr>
+          <w:rFonts w:ascii="Arial" w:hAnsi="Arial" w:cs="Arial"/>
+          <w:color w:val="500050"/>
+          <w:shd w:val="clear" w:color="auto" w:fill="FFFFFF"/>
+        </w:rPr>
+        <w:t>- M86, flute and clarinet: replace rest in Beat 4 with D, which should now start from niente on beat 4 M86 and crescendo through 87 on both parts.</w:t>
+      </w:r>
+    </w:p>
+    <w:p>
+      <w:pPr>
+        <w:rPr>
+          <w:color w:val="500050"/>
+          <w:shd w:val="clear" w:color="auto" w:fill="FFFFFF"/>
+        </w:rPr>
+      </w:pPr>
+      <w:r>
+        <w:rPr>
+          <w:b/>
+          <w:bCs/>
+          <w:color w:val="500050"/>
+          <w:shd w:val="clear" w:color="auto" w:fill="FFFFFF"/>
+        </w:rPr>
+        <w:t>Could you clarify this - In m. 88 the clarinet still is tied to the B 1/4 flat from the previous bar. Should I change that to D also? Here's what I have so far - changed the flute but not the clarinet yet. </w:t>
+      </w:r>
+      <w:r>
+        <w:rPr>
+          <w:color w:val="500050"/>
+          <w:shd w:val="clear" w:color="auto" w:fill="FFFFFF"/>
+        </w:rPr>
+        <w:fldChar w:fldCharType="begin"/>
+      </w:r>
+      <w:r>
+        <w:rPr>
+          <w:color w:val="500050"/>
+          <w:shd w:val="clear" w:color="auto" w:fill="FFFFFF"/>
+        </w:rPr>
+        <w:instrText xml:space="preserve"> INCLUDEPICTURE "https://mail.google.com/mail/u/0?ui=2&amp;ik=2652d32d0a&amp;attid=0.1&amp;permmsgid=msg-f:1794858290058637249&amp;th=18e89e1af11c2fc1&amp;view=fimg&amp;fur=ip&amp;sz=s0-l75-ft&amp;attbid=ANGjdJ8knk8gYZZXlVe2nDhixL3AEQmV0xhBbhob4maHzqOUIU2sVHs7BVOhJsOimFH3uKdxC8VO2-DjBPmraT9tJkBqym-pscoEL_HDmroYkfNEpvsQ7yeL5_sZWUY&amp;disp=emb" \* MERGEFORMATINET </w:instrText>
+      </w:r>
+      <w:r>
+        <w:rPr>
+          <w:color w:val="500050"/>
+          <w:shd w:val="clear" w:color="auto" w:fill="FFFFFF"/>
+        </w:rPr>
+        <w:fldChar w:fldCharType="separate"/>
+      </w:r>
+      <w:r>
+        <w:rPr>
+          <w:color w:val="500050"/>
+          <w:shd w:val="clear" w:color="auto" w:fill="FFFFFF"/>
+        </w:rPr>
+        <w:fldChar w:fldCharType="end"/>
+      </w:r>
+    </w:p>
+    <w:p>
+      <w:pPr>
+        <w:shd w:val="clear" w:color="auto" w:fill="FFFFFF"/>
+        <w:rPr>
+          <w:color w:val="ED5C57"/>
+        </w:rPr>
+      </w:pPr>
+      <w:r>
+        <w:rPr>
+          <w:color w:val="ED5C57"/>
+        </w:rPr>
+        <w:t>My mistake, in the case of Clarinet, I make, make B ¼ flat start on bet 4....as the D on flute.</w:t>
+      </w:r>
+    </w:p>
+    <w:p>
+      <w:pPr>
+        <w:rPr>
+          <w:color w:val="500050"/>
+          <w:shd w:val="clear" w:color="auto" w:fill="FFFFFF"/>
+        </w:rPr>
+      </w:pPr>
+    </w:p>
+    <w:p>
+      <w:pPr>
+        <w:rPr>
+          <w:color w:val="500050"/>
+          <w:shd w:val="clear" w:color="auto" w:fill="FFFFFF"/>
+        </w:rPr>
+      </w:pPr>
+    </w:p>
+    <w:p>
+      <w:pPr>
+        <w:rPr>
+          <w:color w:val="500050"/>
+          <w:shd w:val="clear" w:color="auto" w:fill="FFFFFF"/>
+        </w:rPr>
+      </w:pPr>
+      <w:r>
+        <w:rPr>
+          <w:color w:val="500050"/>
+          <w:shd w:val="clear" w:color="auto" w:fill="FFFFFF"/>
+        </w:rPr>
+        <w:t xml:space="preserve">3. - M154, Oboe and Flute: delete tie from oboe bar before and swap notes between </w:t>
+      </w:r>
+      <w:proofErr w:type="spellStart"/>
+      <w:r>
+        <w:rPr>
+          <w:color w:val="500050"/>
+          <w:shd w:val="clear" w:color="auto" w:fill="FFFFFF"/>
+        </w:rPr>
+        <w:t>ob</w:t>
+      </w:r>
+      <w:proofErr w:type="spellEnd"/>
+      <w:r>
+        <w:rPr>
+          <w:color w:val="500050"/>
+          <w:shd w:val="clear" w:color="auto" w:fill="FFFFFF"/>
+        </w:rPr>
+        <w:t xml:space="preserve"> and flute…</w:t>
+      </w:r>
+    </w:p>
+    <w:p>
+      <w:pPr>
+        <w:rPr>
+          <w:color w:val="500050"/>
+          <w:shd w:val="clear" w:color="auto" w:fill="FFFFFF"/>
+        </w:rPr>
+      </w:pPr>
+      <w:r>
+        <w:rPr>
+          <w:b/>
+          <w:bCs/>
+          <w:color w:val="500050"/>
+          <w:shd w:val="clear" w:color="auto" w:fill="FFFFFF"/>
+        </w:rPr>
+        <w:t>Would you like the slur to end in m. 153 as well or keep it until 154?</w:t>
+      </w:r>
+    </w:p>
+    <w:p>
+      <w:pPr>
+        <w:shd w:val="clear" w:color="auto" w:fill="FFFFFF"/>
+        <w:rPr>
+          <w:color w:val="ED5C57"/>
+        </w:rPr>
+      </w:pPr>
+      <w:r>
+        <w:rPr>
+          <w:color w:val="ED5C57"/>
+        </w:rPr>
+        <w:t xml:space="preserve">Slur can end on </w:t>
+      </w:r>
+      <w:proofErr w:type="gramStart"/>
+      <w:r>
+        <w:rPr>
+          <w:color w:val="ED5C57"/>
+        </w:rPr>
+        <w:t>153</w:t>
+      </w:r>
+      <w:proofErr w:type="gramEnd"/>
+    </w:p>
+    <w:p>
+      <w:pPr>
+        <w:rPr>
+          <w:color w:val="500050"/>
+          <w:shd w:val="clear" w:color="auto" w:fill="FFFFFF"/>
+        </w:rPr>
+      </w:pPr>
+    </w:p>
+    <w:p>
+      <w:pPr>
+        <w:rPr>
+          <w:color w:val="500050"/>
+          <w:shd w:val="clear" w:color="auto" w:fill="FFFFFF"/>
+        </w:rPr>
+      </w:pPr>
+      <w:r>
+        <w:rPr>
+          <w:color w:val="500050"/>
+          <w:shd w:val="clear" w:color="auto" w:fill="FFFFFF"/>
+        </w:rPr>
+        <w:t>4. For the Skins in Perc. 2 - right now the noteheads fall on the same spaces as the Temple blocks. Should we approach it differently?</w:t>
+      </w:r>
+      <w:r>
+        <w:rPr>
+          <w:color w:val="500050"/>
+          <w:shd w:val="clear" w:color="auto" w:fill="FFFFFF"/>
+        </w:rPr>
+        <w:fldChar w:fldCharType="begin"/>
+      </w:r>
+      <w:r>
+        <w:rPr>
+          <w:color w:val="500050"/>
+          <w:shd w:val="clear" w:color="auto" w:fill="FFFFFF"/>
+        </w:rPr>
+        <w:instrText xml:space="preserve"> INCLUDEPICTURE "https://mail.google.com/mail/u/0?ui=2&amp;ik=2652d32d0a&amp;attid=0.3&amp;permmsgid=msg-f:1794858290058637249&amp;th=18e89e1af11c2fc1&amp;view=fimg&amp;fur=ip&amp;sz=s0-l75-ft&amp;attbid=ANGjdJ-PG4M9blaisRXXjlaZTgFrKe7KvG-FRxmSzD96ayxhPILFExXEoapA7Fkp3yOElFyS9hY2FauYhU9hr2OaCbCVskfLgxcVahPZIfOFMchyOEWr4LcHmnycb6o&amp;disp=emb" \* MERGEFORMATINET </w:instrText>
+      </w:r>
+      <w:r>
+        <w:rPr>
+          <w:color w:val="500050"/>
+          <w:shd w:val="clear" w:color="auto" w:fill="FFFFFF"/>
+        </w:rPr>
+        <w:fldChar w:fldCharType="separate"/>
+      </w:r>
+      <w:r>
+        <w:rPr>
+          <w:color w:val="500050"/>
+          <w:shd w:val="clear" w:color="auto" w:fill="FFFFFF"/>
+        </w:rPr>
+        <w:fldChar w:fldCharType="end"/>
+      </w:r>
+    </w:p>
+    <w:p>
+      <w:pPr>
+        <w:rPr>
+          <w:color w:val="500050"/>
+          <w:shd w:val="clear" w:color="auto" w:fill="FFFFFF"/>
+        </w:rPr>
+      </w:pPr>
+    </w:p>
+    <w:p>
+      <w:pPr>
+        <w:shd w:val="clear" w:color="auto" w:fill="FFFFFF"/>
+        <w:rPr>
+          <w:color w:val="ED5C57"/>
+        </w:rPr>
+      </w:pPr>
+      <w:proofErr w:type="spellStart"/>
+      <w:proofErr w:type="gramStart"/>
+      <w:r>
+        <w:rPr>
+          <w:color w:val="ED5C57"/>
+        </w:rPr>
+        <w:t>lets</w:t>
+      </w:r>
+      <w:proofErr w:type="spellEnd"/>
+      <w:proofErr w:type="gramEnd"/>
+      <w:r>
+        <w:rPr>
+          <w:color w:val="ED5C57"/>
+        </w:rPr>
+        <w:t xml:space="preserve"> definitely move skins to lines</w:t>
+      </w:r>
+    </w:p>
+    <w:p>
+      <w:pPr>
+        <w:rPr>
+          <w:rFonts w:ascii="Aptos Display" w:hAnsi="Aptos Display"/>
+          <w:b/>
+          <w:bCs/>
+          <w:sz w:val="28"/>
+          <w:szCs w:val="28"/>
+        </w:rPr>
+      </w:pPr>
+    </w:p>
+    <w:p>
+      <w:pPr>
+        <w:rPr>
+          <w:rFonts w:ascii="Aptos Display" w:hAnsi="Aptos Display"/>
+          <w:b/>
+          <w:bCs/>
+          <w:sz w:val="28"/>
+          <w:szCs w:val="28"/>
+        </w:rPr>
+      </w:pPr>
+    </w:p>
+    <w:p>
+      <w:pPr>
+        <w:rPr>
+          <w:rFonts w:ascii="Aptos Display" w:hAnsi="Aptos Display"/>
+          <w:b/>
+          <w:bCs/>
+          <w:sz w:val="28"/>
+          <w:szCs w:val="28"/>
+        </w:rPr>
+      </w:pPr>
+    </w:p>
+    <w:p>
+      <w:pPr>
+        <w:shd w:val="clear" w:color="auto" w:fill="FFFFFF"/>
+        <w:rPr>
+          <w:rFonts w:ascii="Calibri" w:hAnsi="Calibri" w:cs="Calibri"/>
+          <w:color w:val="000000"/>
+          <w:sz w:val="28"/>
+          <w:szCs w:val="28"/>
+        </w:rPr>
+      </w:pPr>
+      <w:r>
+        <w:rPr>
+          <w:rFonts w:ascii="Calibri" w:hAnsi="Calibri" w:cs="Calibri"/>
+          <w:color w:val="000000"/>
+          <w:sz w:val="28"/>
+          <w:szCs w:val="28"/>
+        </w:rPr>
+        <w:t>M1 - PERC 1 – sorry, let’s just call RH “5 Wood Planks” throughout the piece, remove “Low” (Same for percussion diagram in the beginning).</w:t>
+      </w:r>
+    </w:p>
+    <w:p>
+      <w:pPr>
+        <w:shd w:val="clear" w:color="auto" w:fill="FFFFFF"/>
+        <w:rPr>
+          <w:rFonts w:ascii="Calibri" w:hAnsi="Calibri" w:cs="Calibri"/>
+          <w:color w:val="000000"/>
+          <w:sz w:val="28"/>
+          <w:szCs w:val="28"/>
+        </w:rPr>
+      </w:pPr>
+    </w:p>
+    <w:p>
+      <w:pPr>
+        <w:shd w:val="clear" w:color="auto" w:fill="FFFFFF"/>
+        <w:rPr>
+          <w:rFonts w:ascii="Calibri" w:hAnsi="Calibri" w:cs="Calibri"/>
+          <w:b/>
+          <w:bCs/>
+          <w:color w:val="000000"/>
+          <w:sz w:val="28"/>
+          <w:szCs w:val="28"/>
+        </w:rPr>
+      </w:pPr>
+      <w:r>
+        <w:rPr>
+          <w:rFonts w:ascii="Calibri" w:hAnsi="Calibri" w:cs="Calibri"/>
+          <w:b/>
+          <w:bCs/>
+          <w:color w:val="000000"/>
+          <w:sz w:val="28"/>
+          <w:szCs w:val="28"/>
+        </w:rPr>
+        <w:t>M</w:t>
+      </w:r>
+      <w:r>
+        <w:rPr>
+          <w:rFonts w:ascii="Calibri" w:hAnsi="Calibri" w:cs="Calibri"/>
+          <w:b/>
+          <w:bCs/>
+          <w:color w:val="000000"/>
+          <w:sz w:val="28"/>
+          <w:szCs w:val="28"/>
+        </w:rPr>
+        <w:t>80, harp should be a half pedal buzz. </w:t>
+      </w:r>
+    </w:p>
+    <w:p>
+      <w:pPr>
+        <w:shd w:val="clear" w:color="auto" w:fill="FFFFFF"/>
+        <w:rPr>
+          <w:rFonts w:ascii="Calibri" w:hAnsi="Calibri" w:cs="Calibri"/>
+          <w:b/>
+          <w:bCs/>
+          <w:color w:val="000000"/>
+          <w:sz w:val="28"/>
+          <w:szCs w:val="28"/>
+        </w:rPr>
+      </w:pPr>
+    </w:p>
+    <w:p>
+      <w:pPr>
+        <w:shd w:val="clear" w:color="auto" w:fill="FFFFFF"/>
+        <w:rPr>
+          <w:rFonts w:ascii="Calibri" w:hAnsi="Calibri" w:cs="Calibri"/>
+          <w:color w:val="000000"/>
+          <w:sz w:val="28"/>
+          <w:szCs w:val="28"/>
+        </w:rPr>
+      </w:pPr>
+      <w:r>
+        <w:rPr>
+          <w:rFonts w:ascii="Calibri" w:hAnsi="Calibri" w:cs="Calibri"/>
+          <w:color w:val="000000"/>
+          <w:sz w:val="28"/>
+          <w:szCs w:val="28"/>
+        </w:rPr>
+        <w:t xml:space="preserve">Oboe solo parts – remove mf-f sempre as applicable. </w:t>
+      </w:r>
+    </w:p>
+    <w:p>
+      <w:pPr>
+        <w:shd w:val="clear" w:color="auto" w:fill="FFFFFF"/>
+        <w:rPr>
+          <w:color w:val="222222"/>
+        </w:rPr>
+      </w:pPr>
+    </w:p>
+    <w:p>
+      <w:pPr>
+        <w:shd w:val="clear" w:color="auto" w:fill="FFFFFF"/>
+        <w:rPr>
+          <w:rFonts w:ascii="Futura" w:hAnsi="Futura"/>
+          <w:b/>
+          <w:bCs/>
+          <w:color w:val="FF0000"/>
+          <w:sz w:val="28"/>
+          <w:szCs w:val="28"/>
+          <w:shd w:val="clear" w:color="auto" w:fill="FFFFFF"/>
+        </w:rPr>
+      </w:pPr>
+      <w:r>
+        <w:rPr>
+          <w:rFonts w:ascii="Futura" w:hAnsi="Futura"/>
+          <w:b/>
+          <w:bCs/>
+          <w:color w:val="FF0000"/>
+          <w:sz w:val="28"/>
+          <w:szCs w:val="28"/>
+          <w:shd w:val="clear" w:color="auto" w:fill="FFFFFF"/>
+        </w:rPr>
+        <w:t>For hard section</w:t>
+      </w:r>
+    </w:p>
+    <w:p>
+      <w:pPr>
+        <w:shd w:val="clear" w:color="auto" w:fill="FFFFFF"/>
+        <w:rPr>
+          <w:color w:val="222222"/>
+        </w:rPr>
+      </w:pPr>
+      <w:r>
+        <w:rPr>
+          <w:rFonts w:ascii="Futura" w:hAnsi="Futura"/>
+          <w:color w:val="FF0000"/>
+          <w:sz w:val="28"/>
+          <w:szCs w:val="28"/>
+          <w:shd w:val="clear" w:color="auto" w:fill="FFFFFF"/>
+        </w:rPr>
+        <w:t xml:space="preserve">Let’s actually leave it exactly as manuscript, EXCEPT for M177 </w:t>
+      </w:r>
+      <w:proofErr w:type="gramStart"/>
+      <w:r>
+        <w:rPr>
+          <w:rFonts w:ascii="Futura" w:hAnsi="Futura"/>
+          <w:color w:val="FF0000"/>
+          <w:sz w:val="28"/>
+          <w:szCs w:val="28"/>
+          <w:shd w:val="clear" w:color="auto" w:fill="FFFFFF"/>
+        </w:rPr>
+        <w:t>( manuscript</w:t>
+      </w:r>
+      <w:proofErr w:type="gramEnd"/>
+      <w:r>
+        <w:rPr>
+          <w:rFonts w:ascii="Futura" w:hAnsi="Futura"/>
+          <w:color w:val="FF0000"/>
+          <w:sz w:val="28"/>
+          <w:szCs w:val="28"/>
+          <w:shd w:val="clear" w:color="auto" w:fill="FFFFFF"/>
+        </w:rPr>
+        <w:t>), which we should change it to Skins and only have 1 staff for Perc 1</w:t>
+      </w:r>
+    </w:p>
+    <w:p>
+      <w:pPr>
+        <w:shd w:val="clear" w:color="auto" w:fill="FFFFFF"/>
+        <w:rPr>
+          <w:color w:val="222222"/>
+        </w:rPr>
+      </w:pPr>
+    </w:p>
+    <w:p>
+      <w:pPr>
+        <w:shd w:val="clear" w:color="auto" w:fill="FFFFFF"/>
+        <w:rPr>
+          <w:color w:val="222222"/>
+        </w:rPr>
+      </w:pPr>
+    </w:p>
+    <w:p>
+      <w:pPr>
+        <w:shd w:val="clear" w:color="auto" w:fill="FFFFFF"/>
+        <w:rPr>
+          <w:color w:val="222222"/>
+        </w:rPr>
+      </w:pPr>
+    </w:p>
+    <w:p>
+      <w:pPr>
+        <w:shd w:val="clear" w:color="auto" w:fill="FFFFFF"/>
+        <w:rPr>
+          <w:rFonts w:ascii="Aptos" w:hAnsi="Aptos"/>
+          <w:color w:val="000000"/>
+        </w:rPr>
+      </w:pPr>
+      <w:r>
+        <w:rPr>
+          <w:rFonts w:ascii="Calibri" w:hAnsi="Calibri" w:cs="Calibri"/>
+          <w:color w:val="000000"/>
+          <w:sz w:val="28"/>
+          <w:szCs w:val="28"/>
+        </w:rPr>
+        <w:t xml:space="preserve">M185 – should be Skins for both Perc; one </w:t>
+      </w:r>
+      <w:proofErr w:type="gramStart"/>
+      <w:r>
+        <w:rPr>
+          <w:rFonts w:ascii="Calibri" w:hAnsi="Calibri" w:cs="Calibri"/>
+          <w:color w:val="000000"/>
+          <w:sz w:val="28"/>
+          <w:szCs w:val="28"/>
+        </w:rPr>
+        <w:t>staff</w:t>
+      </w:r>
+      <w:proofErr w:type="gramEnd"/>
+    </w:p>
+    <w:p>
+      <w:pPr>
+        <w:pStyle w:val="NormalWeb"/>
+        <w:shd w:val="clear" w:color="auto" w:fill="FFFFFF"/>
+        <w:spacing w:before="0" w:beforeAutospacing="0" w:after="0" w:afterAutospacing="0"/>
+        <w:ind w:left="60"/>
+        <w:rPr>
+          <w:color w:val="222222"/>
+        </w:rPr>
+      </w:pPr>
+    </w:p>
+    <w:p>
+      <w:pPr>
+        <w:shd w:val="clear" w:color="auto" w:fill="FFFFFF"/>
+        <w:rPr>
+          <w:rFonts w:ascii="Aptos" w:hAnsi="Aptos"/>
+          <w:color w:val="000000"/>
+        </w:rPr>
+      </w:pPr>
+      <w:r>
+        <w:rPr>
+          <w:rFonts w:ascii="Calibri" w:hAnsi="Calibri" w:cs="Calibri"/>
+          <w:color w:val="000000"/>
+          <w:sz w:val="28"/>
+          <w:szCs w:val="28"/>
+        </w:rPr>
+        <w:t xml:space="preserve">M186, FL – Missing natural sign on second </w:t>
+      </w:r>
+      <w:proofErr w:type="gramStart"/>
+      <w:r>
+        <w:rPr>
+          <w:rFonts w:ascii="Calibri" w:hAnsi="Calibri" w:cs="Calibri"/>
+          <w:color w:val="000000"/>
+          <w:sz w:val="28"/>
+          <w:szCs w:val="28"/>
+        </w:rPr>
+        <w:t>note</w:t>
+      </w:r>
+      <w:proofErr w:type="gramEnd"/>
+    </w:p>
+    <w:p>
+      <w:pPr>
+        <w:pStyle w:val="NormalWeb"/>
+        <w:shd w:val="clear" w:color="auto" w:fill="FFFFFF"/>
+        <w:spacing w:before="0" w:beforeAutospacing="0" w:after="0" w:afterAutospacing="0"/>
+        <w:ind w:left="60"/>
+        <w:rPr>
+          <w:color w:val="222222"/>
+        </w:rPr>
+      </w:pPr>
+    </w:p>
+    <w:p>
+      <w:pPr>
+        <w:shd w:val="clear" w:color="auto" w:fill="FFFFFF"/>
+        <w:rPr>
+          <w:rFonts w:ascii="Aptos" w:hAnsi="Aptos"/>
+          <w:color w:val="000000"/>
+        </w:rPr>
+      </w:pPr>
+      <w:r>
+        <w:rPr>
+          <w:rFonts w:ascii="Calibri" w:hAnsi="Calibri" w:cs="Calibri"/>
+          <w:color w:val="000000"/>
+          <w:sz w:val="28"/>
+          <w:szCs w:val="28"/>
+        </w:rPr>
+        <w:t>M186, tutti – stretch bar, rhythm twice longer 2X (like M119-120 of new score)</w:t>
+      </w:r>
+    </w:p>
+    <w:p>
+      <w:pPr>
+        <w:pStyle w:val="NormalWeb"/>
+        <w:shd w:val="clear" w:color="auto" w:fill="FFFFFF"/>
+        <w:spacing w:before="0" w:beforeAutospacing="0" w:after="0" w:afterAutospacing="0"/>
+        <w:ind w:left="60"/>
+        <w:rPr>
+          <w:color w:val="222222"/>
+        </w:rPr>
+      </w:pPr>
+    </w:p>
+    <w:p>
+      <w:pPr>
+        <w:shd w:val="clear" w:color="auto" w:fill="FFFFFF"/>
+        <w:rPr>
+          <w:rFonts w:ascii="Aptos" w:hAnsi="Aptos"/>
+          <w:color w:val="000000"/>
+        </w:rPr>
+      </w:pPr>
+      <w:r>
+        <w:rPr>
+          <w:rFonts w:ascii="Calibri" w:hAnsi="Calibri" w:cs="Calibri"/>
+          <w:color w:val="000000"/>
+          <w:sz w:val="28"/>
+          <w:szCs w:val="28"/>
+        </w:rPr>
+        <w:t xml:space="preserve">M199, Perc 1 and 2: Make both perc </w:t>
+      </w:r>
+      <w:proofErr w:type="gramStart"/>
+      <w:r>
+        <w:rPr>
+          <w:rFonts w:ascii="Calibri" w:hAnsi="Calibri" w:cs="Calibri"/>
+          <w:color w:val="000000"/>
+          <w:sz w:val="28"/>
+          <w:szCs w:val="28"/>
+        </w:rPr>
+        <w:t>Skins</w:t>
+      </w:r>
+      <w:proofErr w:type="gramEnd"/>
+    </w:p>
+    <w:p>
+      <w:pPr>
+        <w:pStyle w:val="NormalWeb"/>
+        <w:shd w:val="clear" w:color="auto" w:fill="FFFFFF"/>
+        <w:spacing w:before="0" w:beforeAutospacing="0" w:after="0" w:afterAutospacing="0"/>
+        <w:ind w:left="60"/>
+        <w:rPr>
+          <w:color w:val="222222"/>
+        </w:rPr>
+      </w:pPr>
+    </w:p>
+    <w:p>
+      <w:pPr>
+        <w:shd w:val="clear" w:color="auto" w:fill="FFFFFF"/>
+        <w:rPr>
+          <w:rFonts w:ascii="Aptos" w:hAnsi="Aptos"/>
+          <w:color w:val="000000"/>
+        </w:rPr>
+      </w:pPr>
+      <w:r>
+        <w:rPr>
+          <w:rFonts w:ascii="Calibri" w:hAnsi="Calibri" w:cs="Calibri"/>
+          <w:color w:val="000000"/>
+          <w:sz w:val="28"/>
+          <w:szCs w:val="28"/>
+        </w:rPr>
+        <w:t xml:space="preserve">M199, fermata: clean up fermata so it </w:t>
+      </w:r>
+      <w:proofErr w:type="spellStart"/>
+      <w:r>
+        <w:rPr>
+          <w:rFonts w:ascii="Calibri" w:hAnsi="Calibri" w:cs="Calibri"/>
+          <w:color w:val="000000"/>
+          <w:sz w:val="28"/>
+          <w:szCs w:val="28"/>
+        </w:rPr>
+        <w:t>doen’t</w:t>
+      </w:r>
+      <w:proofErr w:type="spellEnd"/>
+      <w:r>
+        <w:rPr>
+          <w:rFonts w:ascii="Calibri" w:hAnsi="Calibri" w:cs="Calibri"/>
+          <w:color w:val="000000"/>
+          <w:sz w:val="28"/>
+          <w:szCs w:val="28"/>
+        </w:rPr>
+        <w:t xml:space="preserve"> touch </w:t>
+      </w:r>
+      <w:proofErr w:type="gramStart"/>
+      <w:r>
+        <w:rPr>
+          <w:rFonts w:ascii="Calibri" w:hAnsi="Calibri" w:cs="Calibri"/>
+          <w:color w:val="000000"/>
+          <w:sz w:val="28"/>
+          <w:szCs w:val="28"/>
+        </w:rPr>
+        <w:t>meter</w:t>
+      </w:r>
+      <w:proofErr w:type="gramEnd"/>
+    </w:p>
+    <w:p>
+      <w:pPr>
+        <w:pStyle w:val="NormalWeb"/>
+        <w:shd w:val="clear" w:color="auto" w:fill="FFFFFF"/>
+        <w:spacing w:before="0" w:beforeAutospacing="0" w:after="0" w:afterAutospacing="0"/>
+        <w:ind w:left="60"/>
+        <w:rPr>
+          <w:color w:val="222222"/>
+        </w:rPr>
+      </w:pPr>
+    </w:p>
+    <w:p>
+      <w:pPr>
+        <w:shd w:val="clear" w:color="auto" w:fill="FFFFFF"/>
+        <w:rPr>
+          <w:rFonts w:ascii="Aptos" w:hAnsi="Aptos"/>
+          <w:color w:val="000000"/>
+        </w:rPr>
+      </w:pPr>
+      <w:r>
+        <w:rPr>
+          <w:rFonts w:ascii="Calibri" w:hAnsi="Calibri" w:cs="Calibri"/>
+          <w:color w:val="000000"/>
+          <w:sz w:val="28"/>
+          <w:szCs w:val="28"/>
+        </w:rPr>
+        <w:t xml:space="preserve">M200 – REMOVE REPEATS and percussion back to woods after </w:t>
+      </w:r>
+      <w:proofErr w:type="gramStart"/>
+      <w:r>
+        <w:rPr>
+          <w:rFonts w:ascii="Calibri" w:hAnsi="Calibri" w:cs="Calibri"/>
+          <w:color w:val="000000"/>
+          <w:sz w:val="28"/>
+          <w:szCs w:val="28"/>
+        </w:rPr>
+        <w:t>Skins</w:t>
+      </w:r>
+      <w:proofErr w:type="gramEnd"/>
+    </w:p>
+    <w:p>
+      <w:pPr>
+        <w:pStyle w:val="NormalWeb"/>
+        <w:shd w:val="clear" w:color="auto" w:fill="FFFFFF"/>
+        <w:spacing w:before="0" w:beforeAutospacing="0" w:after="0" w:afterAutospacing="0"/>
+        <w:ind w:left="60"/>
+        <w:rPr>
+          <w:color w:val="222222"/>
+        </w:rPr>
+      </w:pPr>
+    </w:p>
+    <w:p>
+      <w:pPr>
+        <w:shd w:val="clear" w:color="auto" w:fill="FFFFFF"/>
+        <w:rPr>
+          <w:rFonts w:ascii="Aptos" w:hAnsi="Aptos"/>
+          <w:color w:val="000000"/>
+        </w:rPr>
+      </w:pPr>
+      <w:r>
+        <w:rPr>
+          <w:rFonts w:ascii="Calibri" w:hAnsi="Calibri" w:cs="Calibri"/>
+          <w:color w:val="000000"/>
+          <w:sz w:val="28"/>
+          <w:szCs w:val="28"/>
+        </w:rPr>
+        <w:t xml:space="preserve">M235, </w:t>
+      </w:r>
+      <w:proofErr w:type="gramStart"/>
+      <w:r>
+        <w:rPr>
+          <w:rFonts w:ascii="Calibri" w:hAnsi="Calibri" w:cs="Calibri"/>
+          <w:color w:val="000000"/>
+          <w:sz w:val="28"/>
+          <w:szCs w:val="28"/>
+        </w:rPr>
+        <w:t>PERC :</w:t>
+      </w:r>
+      <w:proofErr w:type="gramEnd"/>
+      <w:r>
+        <w:rPr>
+          <w:rFonts w:ascii="Calibri" w:hAnsi="Calibri" w:cs="Calibri"/>
+          <w:color w:val="000000"/>
+          <w:sz w:val="28"/>
+          <w:szCs w:val="28"/>
+        </w:rPr>
+        <w:t xml:space="preserve"> Make M235 both Perc parts Skins;</w:t>
+      </w:r>
+    </w:p>
+    <w:p>
+      <w:pPr>
+        <w:pStyle w:val="NormalWeb"/>
+        <w:shd w:val="clear" w:color="auto" w:fill="FFFFFF"/>
+        <w:spacing w:before="0" w:beforeAutospacing="0" w:after="0" w:afterAutospacing="0"/>
+        <w:ind w:left="60"/>
+        <w:rPr>
+          <w:color w:val="222222"/>
+        </w:rPr>
+      </w:pPr>
+    </w:p>
+    <w:p>
+      <w:pPr>
+        <w:shd w:val="clear" w:color="auto" w:fill="FFFFFF"/>
+        <w:rPr>
+          <w:rFonts w:ascii="Aptos" w:hAnsi="Aptos"/>
+          <w:color w:val="000000"/>
+        </w:rPr>
+      </w:pPr>
+      <w:r>
+        <w:rPr>
+          <w:rFonts w:ascii="Calibri" w:hAnsi="Calibri" w:cs="Calibri"/>
+          <w:color w:val="000000"/>
+          <w:sz w:val="28"/>
+          <w:szCs w:val="28"/>
+        </w:rPr>
+        <w:t>M236 – Perc: Delete Both percussion parts entirely, except for BEAT 4 of M236, which should now have a “</w:t>
+      </w:r>
+      <w:proofErr w:type="spellStart"/>
+      <w:proofErr w:type="gramStart"/>
+      <w:r>
+        <w:rPr>
+          <w:rFonts w:ascii="Calibri" w:hAnsi="Calibri" w:cs="Calibri"/>
+          <w:color w:val="000000"/>
+          <w:sz w:val="28"/>
+          <w:szCs w:val="28"/>
+        </w:rPr>
+        <w:t>fff</w:t>
+      </w:r>
+      <w:proofErr w:type="spellEnd"/>
+      <w:proofErr w:type="gramEnd"/>
+      <w:r>
+        <w:rPr>
+          <w:rFonts w:ascii="Calibri" w:hAnsi="Calibri" w:cs="Calibri"/>
+          <w:color w:val="000000"/>
+          <w:sz w:val="28"/>
+          <w:szCs w:val="28"/>
+        </w:rPr>
+        <w:t>”</w:t>
+      </w:r>
+    </w:p>
+    <w:p>
+      <w:pPr>
+        <w:shd w:val="clear" w:color="auto" w:fill="FFFFFF"/>
+        <w:rPr>
+          <w:color w:val="222222"/>
+        </w:rPr>
+      </w:pPr>
+    </w:p>
+    <w:p>
+      <w:pPr>
+        <w:shd w:val="clear" w:color="auto" w:fill="FFFFFF"/>
+        <w:rPr>
+          <w:color w:val="222222"/>
+        </w:rPr>
+      </w:pPr>
+    </w:p>
+    <w:p>
+      <w:pPr>
+        <w:shd w:val="clear" w:color="auto" w:fill="FFFFFF"/>
+        <w:rPr>
+          <w:color w:val="222222"/>
+        </w:rPr>
+      </w:pPr>
+    </w:p>
+    <w:p/>
+    <w:p>
+      <w:pPr>
+        <w:rPr>
+          <w:rFonts w:ascii="Aptos Display" w:hAnsi="Aptos Display"/>
+          <w:sz w:val="28"/>
+          <w:szCs w:val="28"/>
+        </w:rPr>
+      </w:pPr>
     </w:p>
     <w:sectPr>
       <w:pgSz w:w="12240" w:h="15840"/>
@@ -6707,6 +7605,155 @@
 <file path=word/numbering.xml><?xml version="1.0" encoding="utf-8"?>
 <w:numbering xmlns:wpc="http://schemas.microsoft.com/office/word/2010/wordprocessingCanvas" xmlns:cx="http://schemas.microsoft.com/office/drawing/2014/chartex" xmlns:cx1="http://schemas.microsoft.com/office/drawing/2015/9/8/chartex" xmlns:cx2="http://schemas.microsoft.com/office/drawing/2015/10/21/chartex" xmlns:cx3="http://schemas.microsoft.com/office/drawing/2016/5/9/chartex" xmlns:cx4="http://schemas.microsoft.com/office/drawing/2016/5/10/chartex" xmlns:cx5="http://schemas.microsoft.com/office/drawing/2016/5/11/chartex" xmlns:cx6="http://schemas.microsoft.com/office/drawing/2016/5/12/chartex" xmlns:cx7="http://schemas.microsoft.com/office/drawing/2016/5/13/chartex" xmlns:cx8="http://schemas.microsoft.com/office/drawing/2016/5/14/chartex" xmlns:mc="http://schemas.openxmlformats.org/markup-compatibility/2006" xmlns:aink="http://schemas.microsoft.com/office/drawing/2016/ink" xmlns:am3d="http://schemas.microsoft.com/office/drawing/2017/model3d" xmlns:o="urn:schemas-microsoft-com:office:office" xmlns:oel="http://schemas.microsoft.com/office/2019/extlst" xmlns:r="http://schemas.openxmlformats.org/officeDocument/2006/relationships" xmlns:m="http://schemas.openxmlformats.org/officeDocument/2006/math" xmlns:v="urn:schemas-microsoft-com:vml" xmlns:wp14="http://schemas.microsoft.com/office/word/2010/wordprocessingDrawing" xmlns:wp="http://schemas.openxmlformats.org/drawingml/2006/wordprocessingDrawing" xmlns:w10="urn:schemas-microsoft-com:office:word" xmlns:w="http://schemas.openxmlformats.org/wordprocessingml/2006/main" xmlns:w14="http://schemas.microsoft.com/office/word/2010/wordml" xmlns:w15="http://schemas.microsoft.com/office/word/2012/wordml" xmlns:w16cex="http://schemas.microsoft.com/office/word/2018/wordml/cex" xmlns:w16cid="http://schemas.microsoft.com/office/word/2016/wordml/cid" xmlns:w16="http://schemas.microsoft.com/office/word/2018/wordml" xmlns:w16sdtdh="http://schemas.microsoft.com/office/word/2020/wordml/sdtdatahash" xmlns:w16se="http://schemas.microsoft.com/office/word/2015/wordml/symex" xmlns:wpg="http://schemas.microsoft.com/office/word/2010/wordprocessingGroup" xmlns:wpi="http://schemas.microsoft.com/office/word/2010/wordprocessingInk" xmlns:wne="http://schemas.microsoft.com/office/word/2006/wordml" xmlns:wps="http://schemas.microsoft.com/office/word/2010/wordprocessingShape" mc:Ignorable="w14 w15 w16se w16cid w16 w16cex w16sdtdh wp14">
   <w:abstractNum w:abstractNumId="0" w15:restartNumberingAfterBreak="0">
+    <w:nsid w:val="07C661EE"/>
+    <w:multiLevelType w:val="multilevel"/>
+    <w:tmpl w:val="773E02F0"/>
+    <w:lvl w:ilvl="0">
+      <w:start w:val="1"/>
+      <w:numFmt w:val="bullet"/>
+      <w:lvlText w:val=""/>
+      <w:lvlJc w:val="left"/>
+      <w:pPr>
+        <w:tabs>
+          <w:tab w:val="num" w:pos="720"/>
+        </w:tabs>
+        <w:ind w:left="720" w:hanging="360"/>
+      </w:pPr>
+      <w:rPr>
+        <w:rFonts w:ascii="Symbol" w:hAnsi="Symbol" w:hint="default"/>
+        <w:sz w:val="20"/>
+      </w:rPr>
+    </w:lvl>
+    <w:lvl w:ilvl="1" w:tentative="1">
+      <w:start w:val="1"/>
+      <w:numFmt w:val="bullet"/>
+      <w:lvlText w:val="o"/>
+      <w:lvlJc w:val="left"/>
+      <w:pPr>
+        <w:tabs>
+          <w:tab w:val="num" w:pos="1440"/>
+        </w:tabs>
+        <w:ind w:left="1440" w:hanging="360"/>
+      </w:pPr>
+      <w:rPr>
+        <w:rFonts w:ascii="Courier New" w:hAnsi="Courier New" w:hint="default"/>
+        <w:sz w:val="20"/>
+      </w:rPr>
+    </w:lvl>
+    <w:lvl w:ilvl="2" w:tentative="1">
+      <w:start w:val="1"/>
+      <w:numFmt w:val="bullet"/>
+      <w:lvlText w:val=""/>
+      <w:lvlJc w:val="left"/>
+      <w:pPr>
+        <w:tabs>
+          <w:tab w:val="num" w:pos="2160"/>
+        </w:tabs>
+        <w:ind w:left="2160" w:hanging="360"/>
+      </w:pPr>
+      <w:rPr>
+        <w:rFonts w:ascii="Wingdings" w:hAnsi="Wingdings" w:hint="default"/>
+        <w:sz w:val="20"/>
+      </w:rPr>
+    </w:lvl>
+    <w:lvl w:ilvl="3" w:tentative="1">
+      <w:start w:val="1"/>
+      <w:numFmt w:val="bullet"/>
+      <w:lvlText w:val=""/>
+      <w:lvlJc w:val="left"/>
+      <w:pPr>
+        <w:tabs>
+          <w:tab w:val="num" w:pos="2880"/>
+        </w:tabs>
+        <w:ind w:left="2880" w:hanging="360"/>
+      </w:pPr>
+      <w:rPr>
+        <w:rFonts w:ascii="Wingdings" w:hAnsi="Wingdings" w:hint="default"/>
+        <w:sz w:val="20"/>
+      </w:rPr>
+    </w:lvl>
+    <w:lvl w:ilvl="4" w:tentative="1">
+      <w:start w:val="1"/>
+      <w:numFmt w:val="bullet"/>
+      <w:lvlText w:val=""/>
+      <w:lvlJc w:val="left"/>
+      <w:pPr>
+        <w:tabs>
+          <w:tab w:val="num" w:pos="3600"/>
+        </w:tabs>
+        <w:ind w:left="3600" w:hanging="360"/>
+      </w:pPr>
+      <w:rPr>
+        <w:rFonts w:ascii="Wingdings" w:hAnsi="Wingdings" w:hint="default"/>
+        <w:sz w:val="20"/>
+      </w:rPr>
+    </w:lvl>
+    <w:lvl w:ilvl="5" w:tentative="1">
+      <w:start w:val="1"/>
+      <w:numFmt w:val="bullet"/>
+      <w:lvlText w:val=""/>
+      <w:lvlJc w:val="left"/>
+      <w:pPr>
+        <w:tabs>
+          <w:tab w:val="num" w:pos="4320"/>
+        </w:tabs>
+        <w:ind w:left="4320" w:hanging="360"/>
+      </w:pPr>
+      <w:rPr>
+        <w:rFonts w:ascii="Wingdings" w:hAnsi="Wingdings" w:hint="default"/>
+        <w:sz w:val="20"/>
+      </w:rPr>
+    </w:lvl>
+    <w:lvl w:ilvl="6" w:tentative="1">
+      <w:start w:val="1"/>
+      <w:numFmt w:val="bullet"/>
+      <w:lvlText w:val=""/>
+      <w:lvlJc w:val="left"/>
+      <w:pPr>
+        <w:tabs>
+          <w:tab w:val="num" w:pos="5040"/>
+        </w:tabs>
+        <w:ind w:left="5040" w:hanging="360"/>
+      </w:pPr>
+      <w:rPr>
+        <w:rFonts w:ascii="Wingdings" w:hAnsi="Wingdings" w:hint="default"/>
+        <w:sz w:val="20"/>
+      </w:rPr>
+    </w:lvl>
+    <w:lvl w:ilvl="7" w:tentative="1">
+      <w:start w:val="1"/>
+      <w:numFmt w:val="bullet"/>
+      <w:lvlText w:val=""/>
+      <w:lvlJc w:val="left"/>
+      <w:pPr>
+        <w:tabs>
+          <w:tab w:val="num" w:pos="5760"/>
+        </w:tabs>
+        <w:ind w:left="5760" w:hanging="360"/>
+      </w:pPr>
+      <w:rPr>
+        <w:rFonts w:ascii="Wingdings" w:hAnsi="Wingdings" w:hint="default"/>
+        <w:sz w:val="20"/>
+      </w:rPr>
+    </w:lvl>
+    <w:lvl w:ilvl="8" w:tentative="1">
+      <w:start w:val="1"/>
+      <w:numFmt w:val="bullet"/>
+      <w:lvlText w:val=""/>
+      <w:lvlJc w:val="left"/>
+      <w:pPr>
+        <w:tabs>
+          <w:tab w:val="num" w:pos="6480"/>
+        </w:tabs>
+        <w:ind w:left="6480" w:hanging="360"/>
+      </w:pPr>
+      <w:rPr>
+        <w:rFonts w:ascii="Wingdings" w:hAnsi="Wingdings" w:hint="default"/>
+        <w:sz w:val="20"/>
+      </w:rPr>
+    </w:lvl>
+  </w:abstractNum>
+  <w:abstractNum w:abstractNumId="1" w15:restartNumberingAfterBreak="0">
     <w:nsid w:val="0B2B1685"/>
     <w:multiLevelType w:val="hybridMultilevel"/>
     <w:tmpl w:val="6A140B60"/>
@@ -6818,7 +7865,901 @@
       </w:rPr>
     </w:lvl>
   </w:abstractNum>
-  <w:abstractNum w:abstractNumId="1" w15:restartNumberingAfterBreak="0">
+  <w:abstractNum w:abstractNumId="2" w15:restartNumberingAfterBreak="0">
+    <w:nsid w:val="0F2C3727"/>
+    <w:multiLevelType w:val="multilevel"/>
+    <w:tmpl w:val="1ECAA91C"/>
+    <w:lvl w:ilvl="0">
+      <w:start w:val="1"/>
+      <w:numFmt w:val="bullet"/>
+      <w:lvlText w:val=""/>
+      <w:lvlJc w:val="left"/>
+      <w:pPr>
+        <w:tabs>
+          <w:tab w:val="num" w:pos="720"/>
+        </w:tabs>
+        <w:ind w:left="720" w:hanging="360"/>
+      </w:pPr>
+      <w:rPr>
+        <w:rFonts w:ascii="Symbol" w:hAnsi="Symbol" w:hint="default"/>
+        <w:sz w:val="20"/>
+      </w:rPr>
+    </w:lvl>
+    <w:lvl w:ilvl="1" w:tentative="1">
+      <w:start w:val="1"/>
+      <w:numFmt w:val="bullet"/>
+      <w:lvlText w:val="o"/>
+      <w:lvlJc w:val="left"/>
+      <w:pPr>
+        <w:tabs>
+          <w:tab w:val="num" w:pos="1440"/>
+        </w:tabs>
+        <w:ind w:left="1440" w:hanging="360"/>
+      </w:pPr>
+      <w:rPr>
+        <w:rFonts w:ascii="Courier New" w:hAnsi="Courier New" w:hint="default"/>
+        <w:sz w:val="20"/>
+      </w:rPr>
+    </w:lvl>
+    <w:lvl w:ilvl="2" w:tentative="1">
+      <w:start w:val="1"/>
+      <w:numFmt w:val="bullet"/>
+      <w:lvlText w:val=""/>
+      <w:lvlJc w:val="left"/>
+      <w:pPr>
+        <w:tabs>
+          <w:tab w:val="num" w:pos="2160"/>
+        </w:tabs>
+        <w:ind w:left="2160" w:hanging="360"/>
+      </w:pPr>
+      <w:rPr>
+        <w:rFonts w:ascii="Wingdings" w:hAnsi="Wingdings" w:hint="default"/>
+        <w:sz w:val="20"/>
+      </w:rPr>
+    </w:lvl>
+    <w:lvl w:ilvl="3" w:tentative="1">
+      <w:start w:val="1"/>
+      <w:numFmt w:val="bullet"/>
+      <w:lvlText w:val=""/>
+      <w:lvlJc w:val="left"/>
+      <w:pPr>
+        <w:tabs>
+          <w:tab w:val="num" w:pos="2880"/>
+        </w:tabs>
+        <w:ind w:left="2880" w:hanging="360"/>
+      </w:pPr>
+      <w:rPr>
+        <w:rFonts w:ascii="Wingdings" w:hAnsi="Wingdings" w:hint="default"/>
+        <w:sz w:val="20"/>
+      </w:rPr>
+    </w:lvl>
+    <w:lvl w:ilvl="4" w:tentative="1">
+      <w:start w:val="1"/>
+      <w:numFmt w:val="bullet"/>
+      <w:lvlText w:val=""/>
+      <w:lvlJc w:val="left"/>
+      <w:pPr>
+        <w:tabs>
+          <w:tab w:val="num" w:pos="3600"/>
+        </w:tabs>
+        <w:ind w:left="3600" w:hanging="360"/>
+      </w:pPr>
+      <w:rPr>
+        <w:rFonts w:ascii="Wingdings" w:hAnsi="Wingdings" w:hint="default"/>
+        <w:sz w:val="20"/>
+      </w:rPr>
+    </w:lvl>
+    <w:lvl w:ilvl="5" w:tentative="1">
+      <w:start w:val="1"/>
+      <w:numFmt w:val="bullet"/>
+      <w:lvlText w:val=""/>
+      <w:lvlJc w:val="left"/>
+      <w:pPr>
+        <w:tabs>
+          <w:tab w:val="num" w:pos="4320"/>
+        </w:tabs>
+        <w:ind w:left="4320" w:hanging="360"/>
+      </w:pPr>
+      <w:rPr>
+        <w:rFonts w:ascii="Wingdings" w:hAnsi="Wingdings" w:hint="default"/>
+        <w:sz w:val="20"/>
+      </w:rPr>
+    </w:lvl>
+    <w:lvl w:ilvl="6" w:tentative="1">
+      <w:start w:val="1"/>
+      <w:numFmt w:val="bullet"/>
+      <w:lvlText w:val=""/>
+      <w:lvlJc w:val="left"/>
+      <w:pPr>
+        <w:tabs>
+          <w:tab w:val="num" w:pos="5040"/>
+        </w:tabs>
+        <w:ind w:left="5040" w:hanging="360"/>
+      </w:pPr>
+      <w:rPr>
+        <w:rFonts w:ascii="Wingdings" w:hAnsi="Wingdings" w:hint="default"/>
+        <w:sz w:val="20"/>
+      </w:rPr>
+    </w:lvl>
+    <w:lvl w:ilvl="7" w:tentative="1">
+      <w:start w:val="1"/>
+      <w:numFmt w:val="bullet"/>
+      <w:lvlText w:val=""/>
+      <w:lvlJc w:val="left"/>
+      <w:pPr>
+        <w:tabs>
+          <w:tab w:val="num" w:pos="5760"/>
+        </w:tabs>
+        <w:ind w:left="5760" w:hanging="360"/>
+      </w:pPr>
+      <w:rPr>
+        <w:rFonts w:ascii="Wingdings" w:hAnsi="Wingdings" w:hint="default"/>
+        <w:sz w:val="20"/>
+      </w:rPr>
+    </w:lvl>
+    <w:lvl w:ilvl="8" w:tentative="1">
+      <w:start w:val="1"/>
+      <w:numFmt w:val="bullet"/>
+      <w:lvlText w:val=""/>
+      <w:lvlJc w:val="left"/>
+      <w:pPr>
+        <w:tabs>
+          <w:tab w:val="num" w:pos="6480"/>
+        </w:tabs>
+        <w:ind w:left="6480" w:hanging="360"/>
+      </w:pPr>
+      <w:rPr>
+        <w:rFonts w:ascii="Wingdings" w:hAnsi="Wingdings" w:hint="default"/>
+        <w:sz w:val="20"/>
+      </w:rPr>
+    </w:lvl>
+  </w:abstractNum>
+  <w:abstractNum w:abstractNumId="3" w15:restartNumberingAfterBreak="0">
+    <w:nsid w:val="12795A17"/>
+    <w:multiLevelType w:val="multilevel"/>
+    <w:tmpl w:val="EC422F5A"/>
+    <w:lvl w:ilvl="0">
+      <w:start w:val="1"/>
+      <w:numFmt w:val="bullet"/>
+      <w:lvlText w:val=""/>
+      <w:lvlJc w:val="left"/>
+      <w:pPr>
+        <w:tabs>
+          <w:tab w:val="num" w:pos="720"/>
+        </w:tabs>
+        <w:ind w:left="720" w:hanging="360"/>
+      </w:pPr>
+      <w:rPr>
+        <w:rFonts w:ascii="Symbol" w:hAnsi="Symbol" w:hint="default"/>
+        <w:sz w:val="20"/>
+      </w:rPr>
+    </w:lvl>
+    <w:lvl w:ilvl="1" w:tentative="1">
+      <w:start w:val="1"/>
+      <w:numFmt w:val="bullet"/>
+      <w:lvlText w:val="o"/>
+      <w:lvlJc w:val="left"/>
+      <w:pPr>
+        <w:tabs>
+          <w:tab w:val="num" w:pos="1440"/>
+        </w:tabs>
+        <w:ind w:left="1440" w:hanging="360"/>
+      </w:pPr>
+      <w:rPr>
+        <w:rFonts w:ascii="Courier New" w:hAnsi="Courier New" w:hint="default"/>
+        <w:sz w:val="20"/>
+      </w:rPr>
+    </w:lvl>
+    <w:lvl w:ilvl="2" w:tentative="1">
+      <w:start w:val="1"/>
+      <w:numFmt w:val="bullet"/>
+      <w:lvlText w:val=""/>
+      <w:lvlJc w:val="left"/>
+      <w:pPr>
+        <w:tabs>
+          <w:tab w:val="num" w:pos="2160"/>
+        </w:tabs>
+        <w:ind w:left="2160" w:hanging="360"/>
+      </w:pPr>
+      <w:rPr>
+        <w:rFonts w:ascii="Wingdings" w:hAnsi="Wingdings" w:hint="default"/>
+        <w:sz w:val="20"/>
+      </w:rPr>
+    </w:lvl>
+    <w:lvl w:ilvl="3" w:tentative="1">
+      <w:start w:val="1"/>
+      <w:numFmt w:val="bullet"/>
+      <w:lvlText w:val=""/>
+      <w:lvlJc w:val="left"/>
+      <w:pPr>
+        <w:tabs>
+          <w:tab w:val="num" w:pos="2880"/>
+        </w:tabs>
+        <w:ind w:left="2880" w:hanging="360"/>
+      </w:pPr>
+      <w:rPr>
+        <w:rFonts w:ascii="Wingdings" w:hAnsi="Wingdings" w:hint="default"/>
+        <w:sz w:val="20"/>
+      </w:rPr>
+    </w:lvl>
+    <w:lvl w:ilvl="4" w:tentative="1">
+      <w:start w:val="1"/>
+      <w:numFmt w:val="bullet"/>
+      <w:lvlText w:val=""/>
+      <w:lvlJc w:val="left"/>
+      <w:pPr>
+        <w:tabs>
+          <w:tab w:val="num" w:pos="3600"/>
+        </w:tabs>
+        <w:ind w:left="3600" w:hanging="360"/>
+      </w:pPr>
+      <w:rPr>
+        <w:rFonts w:ascii="Wingdings" w:hAnsi="Wingdings" w:hint="default"/>
+        <w:sz w:val="20"/>
+      </w:rPr>
+    </w:lvl>
+    <w:lvl w:ilvl="5" w:tentative="1">
+      <w:start w:val="1"/>
+      <w:numFmt w:val="bullet"/>
+      <w:lvlText w:val=""/>
+      <w:lvlJc w:val="left"/>
+      <w:pPr>
+        <w:tabs>
+          <w:tab w:val="num" w:pos="4320"/>
+        </w:tabs>
+        <w:ind w:left="4320" w:hanging="360"/>
+      </w:pPr>
+      <w:rPr>
+        <w:rFonts w:ascii="Wingdings" w:hAnsi="Wingdings" w:hint="default"/>
+        <w:sz w:val="20"/>
+      </w:rPr>
+    </w:lvl>
+    <w:lvl w:ilvl="6" w:tentative="1">
+      <w:start w:val="1"/>
+      <w:numFmt w:val="bullet"/>
+      <w:lvlText w:val=""/>
+      <w:lvlJc w:val="left"/>
+      <w:pPr>
+        <w:tabs>
+          <w:tab w:val="num" w:pos="5040"/>
+        </w:tabs>
+        <w:ind w:left="5040" w:hanging="360"/>
+      </w:pPr>
+      <w:rPr>
+        <w:rFonts w:ascii="Wingdings" w:hAnsi="Wingdings" w:hint="default"/>
+        <w:sz w:val="20"/>
+      </w:rPr>
+    </w:lvl>
+    <w:lvl w:ilvl="7" w:tentative="1">
+      <w:start w:val="1"/>
+      <w:numFmt w:val="bullet"/>
+      <w:lvlText w:val=""/>
+      <w:lvlJc w:val="left"/>
+      <w:pPr>
+        <w:tabs>
+          <w:tab w:val="num" w:pos="5760"/>
+        </w:tabs>
+        <w:ind w:left="5760" w:hanging="360"/>
+      </w:pPr>
+      <w:rPr>
+        <w:rFonts w:ascii="Wingdings" w:hAnsi="Wingdings" w:hint="default"/>
+        <w:sz w:val="20"/>
+      </w:rPr>
+    </w:lvl>
+    <w:lvl w:ilvl="8" w:tentative="1">
+      <w:start w:val="1"/>
+      <w:numFmt w:val="bullet"/>
+      <w:lvlText w:val=""/>
+      <w:lvlJc w:val="left"/>
+      <w:pPr>
+        <w:tabs>
+          <w:tab w:val="num" w:pos="6480"/>
+        </w:tabs>
+        <w:ind w:left="6480" w:hanging="360"/>
+      </w:pPr>
+      <w:rPr>
+        <w:rFonts w:ascii="Wingdings" w:hAnsi="Wingdings" w:hint="default"/>
+        <w:sz w:val="20"/>
+      </w:rPr>
+    </w:lvl>
+  </w:abstractNum>
+  <w:abstractNum w:abstractNumId="4" w15:restartNumberingAfterBreak="0">
+    <w:nsid w:val="29846B67"/>
+    <w:multiLevelType w:val="multilevel"/>
+    <w:tmpl w:val="1E702D46"/>
+    <w:lvl w:ilvl="0">
+      <w:start w:val="1"/>
+      <w:numFmt w:val="bullet"/>
+      <w:lvlText w:val=""/>
+      <w:lvlJc w:val="left"/>
+      <w:pPr>
+        <w:tabs>
+          <w:tab w:val="num" w:pos="720"/>
+        </w:tabs>
+        <w:ind w:left="720" w:hanging="360"/>
+      </w:pPr>
+      <w:rPr>
+        <w:rFonts w:ascii="Symbol" w:hAnsi="Symbol" w:hint="default"/>
+        <w:sz w:val="20"/>
+      </w:rPr>
+    </w:lvl>
+    <w:lvl w:ilvl="1" w:tentative="1">
+      <w:start w:val="1"/>
+      <w:numFmt w:val="bullet"/>
+      <w:lvlText w:val="o"/>
+      <w:lvlJc w:val="left"/>
+      <w:pPr>
+        <w:tabs>
+          <w:tab w:val="num" w:pos="1440"/>
+        </w:tabs>
+        <w:ind w:left="1440" w:hanging="360"/>
+      </w:pPr>
+      <w:rPr>
+        <w:rFonts w:ascii="Courier New" w:hAnsi="Courier New" w:hint="default"/>
+        <w:sz w:val="20"/>
+      </w:rPr>
+    </w:lvl>
+    <w:lvl w:ilvl="2" w:tentative="1">
+      <w:start w:val="1"/>
+      <w:numFmt w:val="bullet"/>
+      <w:lvlText w:val=""/>
+      <w:lvlJc w:val="left"/>
+      <w:pPr>
+        <w:tabs>
+          <w:tab w:val="num" w:pos="2160"/>
+        </w:tabs>
+        <w:ind w:left="2160" w:hanging="360"/>
+      </w:pPr>
+      <w:rPr>
+        <w:rFonts w:ascii="Wingdings" w:hAnsi="Wingdings" w:hint="default"/>
+        <w:sz w:val="20"/>
+      </w:rPr>
+    </w:lvl>
+    <w:lvl w:ilvl="3" w:tentative="1">
+      <w:start w:val="1"/>
+      <w:numFmt w:val="bullet"/>
+      <w:lvlText w:val=""/>
+      <w:lvlJc w:val="left"/>
+      <w:pPr>
+        <w:tabs>
+          <w:tab w:val="num" w:pos="2880"/>
+        </w:tabs>
+        <w:ind w:left="2880" w:hanging="360"/>
+      </w:pPr>
+      <w:rPr>
+        <w:rFonts w:ascii="Wingdings" w:hAnsi="Wingdings" w:hint="default"/>
+        <w:sz w:val="20"/>
+      </w:rPr>
+    </w:lvl>
+    <w:lvl w:ilvl="4" w:tentative="1">
+      <w:start w:val="1"/>
+      <w:numFmt w:val="bullet"/>
+      <w:lvlText w:val=""/>
+      <w:lvlJc w:val="left"/>
+      <w:pPr>
+        <w:tabs>
+          <w:tab w:val="num" w:pos="3600"/>
+        </w:tabs>
+        <w:ind w:left="3600" w:hanging="360"/>
+      </w:pPr>
+      <w:rPr>
+        <w:rFonts w:ascii="Wingdings" w:hAnsi="Wingdings" w:hint="default"/>
+        <w:sz w:val="20"/>
+      </w:rPr>
+    </w:lvl>
+    <w:lvl w:ilvl="5" w:tentative="1">
+      <w:start w:val="1"/>
+      <w:numFmt w:val="bullet"/>
+      <w:lvlText w:val=""/>
+      <w:lvlJc w:val="left"/>
+      <w:pPr>
+        <w:tabs>
+          <w:tab w:val="num" w:pos="4320"/>
+        </w:tabs>
+        <w:ind w:left="4320" w:hanging="360"/>
+      </w:pPr>
+      <w:rPr>
+        <w:rFonts w:ascii="Wingdings" w:hAnsi="Wingdings" w:hint="default"/>
+        <w:sz w:val="20"/>
+      </w:rPr>
+    </w:lvl>
+    <w:lvl w:ilvl="6" w:tentative="1">
+      <w:start w:val="1"/>
+      <w:numFmt w:val="bullet"/>
+      <w:lvlText w:val=""/>
+      <w:lvlJc w:val="left"/>
+      <w:pPr>
+        <w:tabs>
+          <w:tab w:val="num" w:pos="5040"/>
+        </w:tabs>
+        <w:ind w:left="5040" w:hanging="360"/>
+      </w:pPr>
+      <w:rPr>
+        <w:rFonts w:ascii="Wingdings" w:hAnsi="Wingdings" w:hint="default"/>
+        <w:sz w:val="20"/>
+      </w:rPr>
+    </w:lvl>
+    <w:lvl w:ilvl="7" w:tentative="1">
+      <w:start w:val="1"/>
+      <w:numFmt w:val="bullet"/>
+      <w:lvlText w:val=""/>
+      <w:lvlJc w:val="left"/>
+      <w:pPr>
+        <w:tabs>
+          <w:tab w:val="num" w:pos="5760"/>
+        </w:tabs>
+        <w:ind w:left="5760" w:hanging="360"/>
+      </w:pPr>
+      <w:rPr>
+        <w:rFonts w:ascii="Wingdings" w:hAnsi="Wingdings" w:hint="default"/>
+        <w:sz w:val="20"/>
+      </w:rPr>
+    </w:lvl>
+    <w:lvl w:ilvl="8" w:tentative="1">
+      <w:start w:val="1"/>
+      <w:numFmt w:val="bullet"/>
+      <w:lvlText w:val=""/>
+      <w:lvlJc w:val="left"/>
+      <w:pPr>
+        <w:tabs>
+          <w:tab w:val="num" w:pos="6480"/>
+        </w:tabs>
+        <w:ind w:left="6480" w:hanging="360"/>
+      </w:pPr>
+      <w:rPr>
+        <w:rFonts w:ascii="Wingdings" w:hAnsi="Wingdings" w:hint="default"/>
+        <w:sz w:val="20"/>
+      </w:rPr>
+    </w:lvl>
+  </w:abstractNum>
+  <w:abstractNum w:abstractNumId="5" w15:restartNumberingAfterBreak="0">
+    <w:nsid w:val="36CC775A"/>
+    <w:multiLevelType w:val="multilevel"/>
+    <w:tmpl w:val="F7004EA2"/>
+    <w:lvl w:ilvl="0">
+      <w:start w:val="1"/>
+      <w:numFmt w:val="bullet"/>
+      <w:lvlText w:val=""/>
+      <w:lvlJc w:val="left"/>
+      <w:pPr>
+        <w:tabs>
+          <w:tab w:val="num" w:pos="720"/>
+        </w:tabs>
+        <w:ind w:left="720" w:hanging="360"/>
+      </w:pPr>
+      <w:rPr>
+        <w:rFonts w:ascii="Symbol" w:hAnsi="Symbol" w:hint="default"/>
+        <w:sz w:val="20"/>
+      </w:rPr>
+    </w:lvl>
+    <w:lvl w:ilvl="1" w:tentative="1">
+      <w:start w:val="1"/>
+      <w:numFmt w:val="bullet"/>
+      <w:lvlText w:val="o"/>
+      <w:lvlJc w:val="left"/>
+      <w:pPr>
+        <w:tabs>
+          <w:tab w:val="num" w:pos="1440"/>
+        </w:tabs>
+        <w:ind w:left="1440" w:hanging="360"/>
+      </w:pPr>
+      <w:rPr>
+        <w:rFonts w:ascii="Courier New" w:hAnsi="Courier New" w:hint="default"/>
+        <w:sz w:val="20"/>
+      </w:rPr>
+    </w:lvl>
+    <w:lvl w:ilvl="2" w:tentative="1">
+      <w:start w:val="1"/>
+      <w:numFmt w:val="bullet"/>
+      <w:lvlText w:val=""/>
+      <w:lvlJc w:val="left"/>
+      <w:pPr>
+        <w:tabs>
+          <w:tab w:val="num" w:pos="2160"/>
+        </w:tabs>
+        <w:ind w:left="2160" w:hanging="360"/>
+      </w:pPr>
+      <w:rPr>
+        <w:rFonts w:ascii="Wingdings" w:hAnsi="Wingdings" w:hint="default"/>
+        <w:sz w:val="20"/>
+      </w:rPr>
+    </w:lvl>
+    <w:lvl w:ilvl="3" w:tentative="1">
+      <w:start w:val="1"/>
+      <w:numFmt w:val="bullet"/>
+      <w:lvlText w:val=""/>
+      <w:lvlJc w:val="left"/>
+      <w:pPr>
+        <w:tabs>
+          <w:tab w:val="num" w:pos="2880"/>
+        </w:tabs>
+        <w:ind w:left="2880" w:hanging="360"/>
+      </w:pPr>
+      <w:rPr>
+        <w:rFonts w:ascii="Wingdings" w:hAnsi="Wingdings" w:hint="default"/>
+        <w:sz w:val="20"/>
+      </w:rPr>
+    </w:lvl>
+    <w:lvl w:ilvl="4" w:tentative="1">
+      <w:start w:val="1"/>
+      <w:numFmt w:val="bullet"/>
+      <w:lvlText w:val=""/>
+      <w:lvlJc w:val="left"/>
+      <w:pPr>
+        <w:tabs>
+          <w:tab w:val="num" w:pos="3600"/>
+        </w:tabs>
+        <w:ind w:left="3600" w:hanging="360"/>
+      </w:pPr>
+      <w:rPr>
+        <w:rFonts w:ascii="Wingdings" w:hAnsi="Wingdings" w:hint="default"/>
+        <w:sz w:val="20"/>
+      </w:rPr>
+    </w:lvl>
+    <w:lvl w:ilvl="5" w:tentative="1">
+      <w:start w:val="1"/>
+      <w:numFmt w:val="bullet"/>
+      <w:lvlText w:val=""/>
+      <w:lvlJc w:val="left"/>
+      <w:pPr>
+        <w:tabs>
+          <w:tab w:val="num" w:pos="4320"/>
+        </w:tabs>
+        <w:ind w:left="4320" w:hanging="360"/>
+      </w:pPr>
+      <w:rPr>
+        <w:rFonts w:ascii="Wingdings" w:hAnsi="Wingdings" w:hint="default"/>
+        <w:sz w:val="20"/>
+      </w:rPr>
+    </w:lvl>
+    <w:lvl w:ilvl="6" w:tentative="1">
+      <w:start w:val="1"/>
+      <w:numFmt w:val="bullet"/>
+      <w:lvlText w:val=""/>
+      <w:lvlJc w:val="left"/>
+      <w:pPr>
+        <w:tabs>
+          <w:tab w:val="num" w:pos="5040"/>
+        </w:tabs>
+        <w:ind w:left="5040" w:hanging="360"/>
+      </w:pPr>
+      <w:rPr>
+        <w:rFonts w:ascii="Wingdings" w:hAnsi="Wingdings" w:hint="default"/>
+        <w:sz w:val="20"/>
+      </w:rPr>
+    </w:lvl>
+    <w:lvl w:ilvl="7" w:tentative="1">
+      <w:start w:val="1"/>
+      <w:numFmt w:val="bullet"/>
+      <w:lvlText w:val=""/>
+      <w:lvlJc w:val="left"/>
+      <w:pPr>
+        <w:tabs>
+          <w:tab w:val="num" w:pos="5760"/>
+        </w:tabs>
+        <w:ind w:left="5760" w:hanging="360"/>
+      </w:pPr>
+      <w:rPr>
+        <w:rFonts w:ascii="Wingdings" w:hAnsi="Wingdings" w:hint="default"/>
+        <w:sz w:val="20"/>
+      </w:rPr>
+    </w:lvl>
+    <w:lvl w:ilvl="8" w:tentative="1">
+      <w:start w:val="1"/>
+      <w:numFmt w:val="bullet"/>
+      <w:lvlText w:val=""/>
+      <w:lvlJc w:val="left"/>
+      <w:pPr>
+        <w:tabs>
+          <w:tab w:val="num" w:pos="6480"/>
+        </w:tabs>
+        <w:ind w:left="6480" w:hanging="360"/>
+      </w:pPr>
+      <w:rPr>
+        <w:rFonts w:ascii="Wingdings" w:hAnsi="Wingdings" w:hint="default"/>
+        <w:sz w:val="20"/>
+      </w:rPr>
+    </w:lvl>
+  </w:abstractNum>
+  <w:abstractNum w:abstractNumId="6" w15:restartNumberingAfterBreak="0">
+    <w:nsid w:val="44802968"/>
+    <w:multiLevelType w:val="multilevel"/>
+    <w:tmpl w:val="6374D116"/>
+    <w:lvl w:ilvl="0">
+      <w:start w:val="1"/>
+      <w:numFmt w:val="bullet"/>
+      <w:lvlText w:val=""/>
+      <w:lvlJc w:val="left"/>
+      <w:pPr>
+        <w:tabs>
+          <w:tab w:val="num" w:pos="720"/>
+        </w:tabs>
+        <w:ind w:left="720" w:hanging="360"/>
+      </w:pPr>
+      <w:rPr>
+        <w:rFonts w:ascii="Symbol" w:hAnsi="Symbol" w:hint="default"/>
+        <w:sz w:val="20"/>
+      </w:rPr>
+    </w:lvl>
+    <w:lvl w:ilvl="1" w:tentative="1">
+      <w:start w:val="1"/>
+      <w:numFmt w:val="bullet"/>
+      <w:lvlText w:val="o"/>
+      <w:lvlJc w:val="left"/>
+      <w:pPr>
+        <w:tabs>
+          <w:tab w:val="num" w:pos="1440"/>
+        </w:tabs>
+        <w:ind w:left="1440" w:hanging="360"/>
+      </w:pPr>
+      <w:rPr>
+        <w:rFonts w:ascii="Courier New" w:hAnsi="Courier New" w:hint="default"/>
+        <w:sz w:val="20"/>
+      </w:rPr>
+    </w:lvl>
+    <w:lvl w:ilvl="2" w:tentative="1">
+      <w:start w:val="1"/>
+      <w:numFmt w:val="bullet"/>
+      <w:lvlText w:val=""/>
+      <w:lvlJc w:val="left"/>
+      <w:pPr>
+        <w:tabs>
+          <w:tab w:val="num" w:pos="2160"/>
+        </w:tabs>
+        <w:ind w:left="2160" w:hanging="360"/>
+      </w:pPr>
+      <w:rPr>
+        <w:rFonts w:ascii="Wingdings" w:hAnsi="Wingdings" w:hint="default"/>
+        <w:sz w:val="20"/>
+      </w:rPr>
+    </w:lvl>
+    <w:lvl w:ilvl="3" w:tentative="1">
+      <w:start w:val="1"/>
+      <w:numFmt w:val="bullet"/>
+      <w:lvlText w:val=""/>
+      <w:lvlJc w:val="left"/>
+      <w:pPr>
+        <w:tabs>
+          <w:tab w:val="num" w:pos="2880"/>
+        </w:tabs>
+        <w:ind w:left="2880" w:hanging="360"/>
+      </w:pPr>
+      <w:rPr>
+        <w:rFonts w:ascii="Wingdings" w:hAnsi="Wingdings" w:hint="default"/>
+        <w:sz w:val="20"/>
+      </w:rPr>
+    </w:lvl>
+    <w:lvl w:ilvl="4" w:tentative="1">
+      <w:start w:val="1"/>
+      <w:numFmt w:val="bullet"/>
+      <w:lvlText w:val=""/>
+      <w:lvlJc w:val="left"/>
+      <w:pPr>
+        <w:tabs>
+          <w:tab w:val="num" w:pos="3600"/>
+        </w:tabs>
+        <w:ind w:left="3600" w:hanging="360"/>
+      </w:pPr>
+      <w:rPr>
+        <w:rFonts w:ascii="Wingdings" w:hAnsi="Wingdings" w:hint="default"/>
+        <w:sz w:val="20"/>
+      </w:rPr>
+    </w:lvl>
+    <w:lvl w:ilvl="5" w:tentative="1">
+      <w:start w:val="1"/>
+      <w:numFmt w:val="bullet"/>
+      <w:lvlText w:val=""/>
+      <w:lvlJc w:val="left"/>
+      <w:pPr>
+        <w:tabs>
+          <w:tab w:val="num" w:pos="4320"/>
+        </w:tabs>
+        <w:ind w:left="4320" w:hanging="360"/>
+      </w:pPr>
+      <w:rPr>
+        <w:rFonts w:ascii="Wingdings" w:hAnsi="Wingdings" w:hint="default"/>
+        <w:sz w:val="20"/>
+      </w:rPr>
+    </w:lvl>
+    <w:lvl w:ilvl="6" w:tentative="1">
+      <w:start w:val="1"/>
+      <w:numFmt w:val="bullet"/>
+      <w:lvlText w:val=""/>
+      <w:lvlJc w:val="left"/>
+      <w:pPr>
+        <w:tabs>
+          <w:tab w:val="num" w:pos="5040"/>
+        </w:tabs>
+        <w:ind w:left="5040" w:hanging="360"/>
+      </w:pPr>
+      <w:rPr>
+        <w:rFonts w:ascii="Wingdings" w:hAnsi="Wingdings" w:hint="default"/>
+        <w:sz w:val="20"/>
+      </w:rPr>
+    </w:lvl>
+    <w:lvl w:ilvl="7" w:tentative="1">
+      <w:start w:val="1"/>
+      <w:numFmt w:val="bullet"/>
+      <w:lvlText w:val=""/>
+      <w:lvlJc w:val="left"/>
+      <w:pPr>
+        <w:tabs>
+          <w:tab w:val="num" w:pos="5760"/>
+        </w:tabs>
+        <w:ind w:left="5760" w:hanging="360"/>
+      </w:pPr>
+      <w:rPr>
+        <w:rFonts w:ascii="Wingdings" w:hAnsi="Wingdings" w:hint="default"/>
+        <w:sz w:val="20"/>
+      </w:rPr>
+    </w:lvl>
+    <w:lvl w:ilvl="8" w:tentative="1">
+      <w:start w:val="1"/>
+      <w:numFmt w:val="bullet"/>
+      <w:lvlText w:val=""/>
+      <w:lvlJc w:val="left"/>
+      <w:pPr>
+        <w:tabs>
+          <w:tab w:val="num" w:pos="6480"/>
+        </w:tabs>
+        <w:ind w:left="6480" w:hanging="360"/>
+      </w:pPr>
+      <w:rPr>
+        <w:rFonts w:ascii="Wingdings" w:hAnsi="Wingdings" w:hint="default"/>
+        <w:sz w:val="20"/>
+      </w:rPr>
+    </w:lvl>
+  </w:abstractNum>
+  <w:abstractNum w:abstractNumId="7" w15:restartNumberingAfterBreak="0">
+    <w:nsid w:val="4A491D04"/>
+    <w:multiLevelType w:val="multilevel"/>
+    <w:tmpl w:val="A172FCFC"/>
+    <w:lvl w:ilvl="0">
+      <w:start w:val="1"/>
+      <w:numFmt w:val="bullet"/>
+      <w:lvlText w:val=""/>
+      <w:lvlJc w:val="left"/>
+      <w:pPr>
+        <w:tabs>
+          <w:tab w:val="num" w:pos="720"/>
+        </w:tabs>
+        <w:ind w:left="720" w:hanging="360"/>
+      </w:pPr>
+      <w:rPr>
+        <w:rFonts w:ascii="Symbol" w:hAnsi="Symbol" w:hint="default"/>
+        <w:sz w:val="20"/>
+      </w:rPr>
+    </w:lvl>
+    <w:lvl w:ilvl="1" w:tentative="1">
+      <w:start w:val="1"/>
+      <w:numFmt w:val="bullet"/>
+      <w:lvlText w:val="o"/>
+      <w:lvlJc w:val="left"/>
+      <w:pPr>
+        <w:tabs>
+          <w:tab w:val="num" w:pos="1440"/>
+        </w:tabs>
+        <w:ind w:left="1440" w:hanging="360"/>
+      </w:pPr>
+      <w:rPr>
+        <w:rFonts w:ascii="Courier New" w:hAnsi="Courier New" w:hint="default"/>
+        <w:sz w:val="20"/>
+      </w:rPr>
+    </w:lvl>
+    <w:lvl w:ilvl="2" w:tentative="1">
+      <w:start w:val="1"/>
+      <w:numFmt w:val="bullet"/>
+      <w:lvlText w:val=""/>
+      <w:lvlJc w:val="left"/>
+      <w:pPr>
+        <w:tabs>
+          <w:tab w:val="num" w:pos="2160"/>
+        </w:tabs>
+        <w:ind w:left="2160" w:hanging="360"/>
+      </w:pPr>
+      <w:rPr>
+        <w:rFonts w:ascii="Wingdings" w:hAnsi="Wingdings" w:hint="default"/>
+        <w:sz w:val="20"/>
+      </w:rPr>
+    </w:lvl>
+    <w:lvl w:ilvl="3" w:tentative="1">
+      <w:start w:val="1"/>
+      <w:numFmt w:val="bullet"/>
+      <w:lvlText w:val=""/>
+      <w:lvlJc w:val="left"/>
+      <w:pPr>
+        <w:tabs>
+          <w:tab w:val="num" w:pos="2880"/>
+        </w:tabs>
+        <w:ind w:left="2880" w:hanging="360"/>
+      </w:pPr>
+      <w:rPr>
+        <w:rFonts w:ascii="Wingdings" w:hAnsi="Wingdings" w:hint="default"/>
+        <w:sz w:val="20"/>
+      </w:rPr>
+    </w:lvl>
+    <w:lvl w:ilvl="4" w:tentative="1">
+      <w:start w:val="1"/>
+      <w:numFmt w:val="bullet"/>
+      <w:lvlText w:val=""/>
+      <w:lvlJc w:val="left"/>
+      <w:pPr>
+        <w:tabs>
+          <w:tab w:val="num" w:pos="3600"/>
+        </w:tabs>
+        <w:ind w:left="3600" w:hanging="360"/>
+      </w:pPr>
+      <w:rPr>
+        <w:rFonts w:ascii="Wingdings" w:hAnsi="Wingdings" w:hint="default"/>
+        <w:sz w:val="20"/>
+      </w:rPr>
+    </w:lvl>
+    <w:lvl w:ilvl="5" w:tentative="1">
+      <w:start w:val="1"/>
+      <w:numFmt w:val="bullet"/>
+      <w:lvlText w:val=""/>
+      <w:lvlJc w:val="left"/>
+      <w:pPr>
+        <w:tabs>
+          <w:tab w:val="num" w:pos="4320"/>
+        </w:tabs>
+        <w:ind w:left="4320" w:hanging="360"/>
+      </w:pPr>
+      <w:rPr>
+        <w:rFonts w:ascii="Wingdings" w:hAnsi="Wingdings" w:hint="default"/>
+        <w:sz w:val="20"/>
+      </w:rPr>
+    </w:lvl>
+    <w:lvl w:ilvl="6" w:tentative="1">
+      <w:start w:val="1"/>
+      <w:numFmt w:val="bullet"/>
+      <w:lvlText w:val=""/>
+      <w:lvlJc w:val="left"/>
+      <w:pPr>
+        <w:tabs>
+          <w:tab w:val="num" w:pos="5040"/>
+        </w:tabs>
+        <w:ind w:left="5040" w:hanging="360"/>
+      </w:pPr>
+      <w:rPr>
+        <w:rFonts w:ascii="Wingdings" w:hAnsi="Wingdings" w:hint="default"/>
+        <w:sz w:val="20"/>
+      </w:rPr>
+    </w:lvl>
+    <w:lvl w:ilvl="7" w:tentative="1">
+      <w:start w:val="1"/>
+      <w:numFmt w:val="bullet"/>
+      <w:lvlText w:val=""/>
+      <w:lvlJc w:val="left"/>
+      <w:pPr>
+        <w:tabs>
+          <w:tab w:val="num" w:pos="5760"/>
+        </w:tabs>
+        <w:ind w:left="5760" w:hanging="360"/>
+      </w:pPr>
+      <w:rPr>
+        <w:rFonts w:ascii="Wingdings" w:hAnsi="Wingdings" w:hint="default"/>
+        <w:sz w:val="20"/>
+      </w:rPr>
+    </w:lvl>
+    <w:lvl w:ilvl="8" w:tentative="1">
+      <w:start w:val="1"/>
+      <w:numFmt w:val="bullet"/>
+      <w:lvlText w:val=""/>
+      <w:lvlJc w:val="left"/>
+      <w:pPr>
+        <w:tabs>
+          <w:tab w:val="num" w:pos="6480"/>
+        </w:tabs>
+        <w:ind w:left="6480" w:hanging="360"/>
+      </w:pPr>
+      <w:rPr>
+        <w:rFonts w:ascii="Wingdings" w:hAnsi="Wingdings" w:hint="default"/>
+        <w:sz w:val="20"/>
+      </w:rPr>
+    </w:lvl>
+  </w:abstractNum>
+  <w:abstractNum w:abstractNumId="8" w15:restartNumberingAfterBreak="0">
     <w:nsid w:val="5B12113F"/>
     <w:multiLevelType w:val="hybridMultilevel"/>
     <w:tmpl w:val="B42A1B88"/>
@@ -6931,11 +8872,452 @@
       </w:rPr>
     </w:lvl>
   </w:abstractNum>
+  <w:abstractNum w:abstractNumId="9" w15:restartNumberingAfterBreak="0">
+    <w:nsid w:val="64E74B8C"/>
+    <w:multiLevelType w:val="hybridMultilevel"/>
+    <w:tmpl w:val="F5102144"/>
+    <w:lvl w:ilvl="0" w:tplc="04090001">
+      <w:start w:val="1"/>
+      <w:numFmt w:val="bullet"/>
+      <w:lvlText w:val=""/>
+      <w:lvlJc w:val="left"/>
+      <w:pPr>
+        <w:ind w:left="720" w:hanging="360"/>
+      </w:pPr>
+      <w:rPr>
+        <w:rFonts w:ascii="Symbol" w:hAnsi="Symbol" w:hint="default"/>
+      </w:rPr>
+    </w:lvl>
+    <w:lvl w:ilvl="1" w:tplc="04090003" w:tentative="1">
+      <w:start w:val="1"/>
+      <w:numFmt w:val="bullet"/>
+      <w:lvlText w:val="o"/>
+      <w:lvlJc w:val="left"/>
+      <w:pPr>
+        <w:ind w:left="1440" w:hanging="360"/>
+      </w:pPr>
+      <w:rPr>
+        <w:rFonts w:ascii="Courier New" w:hAnsi="Courier New" w:cs="Courier New" w:hint="default"/>
+      </w:rPr>
+    </w:lvl>
+    <w:lvl w:ilvl="2" w:tplc="04090005" w:tentative="1">
+      <w:start w:val="1"/>
+      <w:numFmt w:val="bullet"/>
+      <w:lvlText w:val=""/>
+      <w:lvlJc w:val="left"/>
+      <w:pPr>
+        <w:ind w:left="2160" w:hanging="360"/>
+      </w:pPr>
+      <w:rPr>
+        <w:rFonts w:ascii="Wingdings" w:hAnsi="Wingdings" w:hint="default"/>
+      </w:rPr>
+    </w:lvl>
+    <w:lvl w:ilvl="3" w:tplc="04090001" w:tentative="1">
+      <w:start w:val="1"/>
+      <w:numFmt w:val="bullet"/>
+      <w:lvlText w:val=""/>
+      <w:lvlJc w:val="left"/>
+      <w:pPr>
+        <w:ind w:left="2880" w:hanging="360"/>
+      </w:pPr>
+      <w:rPr>
+        <w:rFonts w:ascii="Symbol" w:hAnsi="Symbol" w:hint="default"/>
+      </w:rPr>
+    </w:lvl>
+    <w:lvl w:ilvl="4" w:tplc="04090003" w:tentative="1">
+      <w:start w:val="1"/>
+      <w:numFmt w:val="bullet"/>
+      <w:lvlText w:val="o"/>
+      <w:lvlJc w:val="left"/>
+      <w:pPr>
+        <w:ind w:left="3600" w:hanging="360"/>
+      </w:pPr>
+      <w:rPr>
+        <w:rFonts w:ascii="Courier New" w:hAnsi="Courier New" w:cs="Courier New" w:hint="default"/>
+      </w:rPr>
+    </w:lvl>
+    <w:lvl w:ilvl="5" w:tplc="04090005" w:tentative="1">
+      <w:start w:val="1"/>
+      <w:numFmt w:val="bullet"/>
+      <w:lvlText w:val=""/>
+      <w:lvlJc w:val="left"/>
+      <w:pPr>
+        <w:ind w:left="4320" w:hanging="360"/>
+      </w:pPr>
+      <w:rPr>
+        <w:rFonts w:ascii="Wingdings" w:hAnsi="Wingdings" w:hint="default"/>
+      </w:rPr>
+    </w:lvl>
+    <w:lvl w:ilvl="6" w:tplc="04090001" w:tentative="1">
+      <w:start w:val="1"/>
+      <w:numFmt w:val="bullet"/>
+      <w:lvlText w:val=""/>
+      <w:lvlJc w:val="left"/>
+      <w:pPr>
+        <w:ind w:left="5040" w:hanging="360"/>
+      </w:pPr>
+      <w:rPr>
+        <w:rFonts w:ascii="Symbol" w:hAnsi="Symbol" w:hint="default"/>
+      </w:rPr>
+    </w:lvl>
+    <w:lvl w:ilvl="7" w:tplc="04090003" w:tentative="1">
+      <w:start w:val="1"/>
+      <w:numFmt w:val="bullet"/>
+      <w:lvlText w:val="o"/>
+      <w:lvlJc w:val="left"/>
+      <w:pPr>
+        <w:ind w:left="5760" w:hanging="360"/>
+      </w:pPr>
+      <w:rPr>
+        <w:rFonts w:ascii="Courier New" w:hAnsi="Courier New" w:cs="Courier New" w:hint="default"/>
+      </w:rPr>
+    </w:lvl>
+    <w:lvl w:ilvl="8" w:tplc="04090005" w:tentative="1">
+      <w:start w:val="1"/>
+      <w:numFmt w:val="bullet"/>
+      <w:lvlText w:val=""/>
+      <w:lvlJc w:val="left"/>
+      <w:pPr>
+        <w:ind w:left="6480" w:hanging="360"/>
+      </w:pPr>
+      <w:rPr>
+        <w:rFonts w:ascii="Wingdings" w:hAnsi="Wingdings" w:hint="default"/>
+      </w:rPr>
+    </w:lvl>
+  </w:abstractNum>
+  <w:abstractNum w:abstractNumId="10" w15:restartNumberingAfterBreak="0">
+    <w:nsid w:val="6B352173"/>
+    <w:multiLevelType w:val="multilevel"/>
+    <w:tmpl w:val="EEC0DAC0"/>
+    <w:lvl w:ilvl="0">
+      <w:start w:val="1"/>
+      <w:numFmt w:val="bullet"/>
+      <w:lvlText w:val=""/>
+      <w:lvlJc w:val="left"/>
+      <w:pPr>
+        <w:tabs>
+          <w:tab w:val="num" w:pos="720"/>
+        </w:tabs>
+        <w:ind w:left="720" w:hanging="360"/>
+      </w:pPr>
+      <w:rPr>
+        <w:rFonts w:ascii="Symbol" w:hAnsi="Symbol" w:hint="default"/>
+        <w:sz w:val="20"/>
+      </w:rPr>
+    </w:lvl>
+    <w:lvl w:ilvl="1" w:tentative="1">
+      <w:start w:val="1"/>
+      <w:numFmt w:val="bullet"/>
+      <w:lvlText w:val="o"/>
+      <w:lvlJc w:val="left"/>
+      <w:pPr>
+        <w:tabs>
+          <w:tab w:val="num" w:pos="1440"/>
+        </w:tabs>
+        <w:ind w:left="1440" w:hanging="360"/>
+      </w:pPr>
+      <w:rPr>
+        <w:rFonts w:ascii="Courier New" w:hAnsi="Courier New" w:hint="default"/>
+        <w:sz w:val="20"/>
+      </w:rPr>
+    </w:lvl>
+    <w:lvl w:ilvl="2" w:tentative="1">
+      <w:start w:val="1"/>
+      <w:numFmt w:val="bullet"/>
+      <w:lvlText w:val=""/>
+      <w:lvlJc w:val="left"/>
+      <w:pPr>
+        <w:tabs>
+          <w:tab w:val="num" w:pos="2160"/>
+        </w:tabs>
+        <w:ind w:left="2160" w:hanging="360"/>
+      </w:pPr>
+      <w:rPr>
+        <w:rFonts w:ascii="Wingdings" w:hAnsi="Wingdings" w:hint="default"/>
+        <w:sz w:val="20"/>
+      </w:rPr>
+    </w:lvl>
+    <w:lvl w:ilvl="3" w:tentative="1">
+      <w:start w:val="1"/>
+      <w:numFmt w:val="bullet"/>
+      <w:lvlText w:val=""/>
+      <w:lvlJc w:val="left"/>
+      <w:pPr>
+        <w:tabs>
+          <w:tab w:val="num" w:pos="2880"/>
+        </w:tabs>
+        <w:ind w:left="2880" w:hanging="360"/>
+      </w:pPr>
+      <w:rPr>
+        <w:rFonts w:ascii="Wingdings" w:hAnsi="Wingdings" w:hint="default"/>
+        <w:sz w:val="20"/>
+      </w:rPr>
+    </w:lvl>
+    <w:lvl w:ilvl="4" w:tentative="1">
+      <w:start w:val="1"/>
+      <w:numFmt w:val="bullet"/>
+      <w:lvlText w:val=""/>
+      <w:lvlJc w:val="left"/>
+      <w:pPr>
+        <w:tabs>
+          <w:tab w:val="num" w:pos="3600"/>
+        </w:tabs>
+        <w:ind w:left="3600" w:hanging="360"/>
+      </w:pPr>
+      <w:rPr>
+        <w:rFonts w:ascii="Wingdings" w:hAnsi="Wingdings" w:hint="default"/>
+        <w:sz w:val="20"/>
+      </w:rPr>
+    </w:lvl>
+    <w:lvl w:ilvl="5" w:tentative="1">
+      <w:start w:val="1"/>
+      <w:numFmt w:val="bullet"/>
+      <w:lvlText w:val=""/>
+      <w:lvlJc w:val="left"/>
+      <w:pPr>
+        <w:tabs>
+          <w:tab w:val="num" w:pos="4320"/>
+        </w:tabs>
+        <w:ind w:left="4320" w:hanging="360"/>
+      </w:pPr>
+      <w:rPr>
+        <w:rFonts w:ascii="Wingdings" w:hAnsi="Wingdings" w:hint="default"/>
+        <w:sz w:val="20"/>
+      </w:rPr>
+    </w:lvl>
+    <w:lvl w:ilvl="6" w:tentative="1">
+      <w:start w:val="1"/>
+      <w:numFmt w:val="bullet"/>
+      <w:lvlText w:val=""/>
+      <w:lvlJc w:val="left"/>
+      <w:pPr>
+        <w:tabs>
+          <w:tab w:val="num" w:pos="5040"/>
+        </w:tabs>
+        <w:ind w:left="5040" w:hanging="360"/>
+      </w:pPr>
+      <w:rPr>
+        <w:rFonts w:ascii="Wingdings" w:hAnsi="Wingdings" w:hint="default"/>
+        <w:sz w:val="20"/>
+      </w:rPr>
+    </w:lvl>
+    <w:lvl w:ilvl="7" w:tentative="1">
+      <w:start w:val="1"/>
+      <w:numFmt w:val="bullet"/>
+      <w:lvlText w:val=""/>
+      <w:lvlJc w:val="left"/>
+      <w:pPr>
+        <w:tabs>
+          <w:tab w:val="num" w:pos="5760"/>
+        </w:tabs>
+        <w:ind w:left="5760" w:hanging="360"/>
+      </w:pPr>
+      <w:rPr>
+        <w:rFonts w:ascii="Wingdings" w:hAnsi="Wingdings" w:hint="default"/>
+        <w:sz w:val="20"/>
+      </w:rPr>
+    </w:lvl>
+    <w:lvl w:ilvl="8" w:tentative="1">
+      <w:start w:val="1"/>
+      <w:numFmt w:val="bullet"/>
+      <w:lvlText w:val=""/>
+      <w:lvlJc w:val="left"/>
+      <w:pPr>
+        <w:tabs>
+          <w:tab w:val="num" w:pos="6480"/>
+        </w:tabs>
+        <w:ind w:left="6480" w:hanging="360"/>
+      </w:pPr>
+      <w:rPr>
+        <w:rFonts w:ascii="Wingdings" w:hAnsi="Wingdings" w:hint="default"/>
+        <w:sz w:val="20"/>
+      </w:rPr>
+    </w:lvl>
+  </w:abstractNum>
+  <w:abstractNum w:abstractNumId="11" w15:restartNumberingAfterBreak="0">
+    <w:nsid w:val="70084191"/>
+    <w:multiLevelType w:val="multilevel"/>
+    <w:tmpl w:val="3BB4C66E"/>
+    <w:lvl w:ilvl="0">
+      <w:start w:val="1"/>
+      <w:numFmt w:val="bullet"/>
+      <w:lvlText w:val=""/>
+      <w:lvlJc w:val="left"/>
+      <w:pPr>
+        <w:tabs>
+          <w:tab w:val="num" w:pos="720"/>
+        </w:tabs>
+        <w:ind w:left="720" w:hanging="360"/>
+      </w:pPr>
+      <w:rPr>
+        <w:rFonts w:ascii="Symbol" w:hAnsi="Symbol" w:hint="default"/>
+        <w:sz w:val="20"/>
+      </w:rPr>
+    </w:lvl>
+    <w:lvl w:ilvl="1" w:tentative="1">
+      <w:start w:val="1"/>
+      <w:numFmt w:val="bullet"/>
+      <w:lvlText w:val="o"/>
+      <w:lvlJc w:val="left"/>
+      <w:pPr>
+        <w:tabs>
+          <w:tab w:val="num" w:pos="1440"/>
+        </w:tabs>
+        <w:ind w:left="1440" w:hanging="360"/>
+      </w:pPr>
+      <w:rPr>
+        <w:rFonts w:ascii="Courier New" w:hAnsi="Courier New" w:hint="default"/>
+        <w:sz w:val="20"/>
+      </w:rPr>
+    </w:lvl>
+    <w:lvl w:ilvl="2" w:tentative="1">
+      <w:start w:val="1"/>
+      <w:numFmt w:val="bullet"/>
+      <w:lvlText w:val=""/>
+      <w:lvlJc w:val="left"/>
+      <w:pPr>
+        <w:tabs>
+          <w:tab w:val="num" w:pos="2160"/>
+        </w:tabs>
+        <w:ind w:left="2160" w:hanging="360"/>
+      </w:pPr>
+      <w:rPr>
+        <w:rFonts w:ascii="Wingdings" w:hAnsi="Wingdings" w:hint="default"/>
+        <w:sz w:val="20"/>
+      </w:rPr>
+    </w:lvl>
+    <w:lvl w:ilvl="3" w:tentative="1">
+      <w:start w:val="1"/>
+      <w:numFmt w:val="bullet"/>
+      <w:lvlText w:val=""/>
+      <w:lvlJc w:val="left"/>
+      <w:pPr>
+        <w:tabs>
+          <w:tab w:val="num" w:pos="2880"/>
+        </w:tabs>
+        <w:ind w:left="2880" w:hanging="360"/>
+      </w:pPr>
+      <w:rPr>
+        <w:rFonts w:ascii="Wingdings" w:hAnsi="Wingdings" w:hint="default"/>
+        <w:sz w:val="20"/>
+      </w:rPr>
+    </w:lvl>
+    <w:lvl w:ilvl="4" w:tentative="1">
+      <w:start w:val="1"/>
+      <w:numFmt w:val="bullet"/>
+      <w:lvlText w:val=""/>
+      <w:lvlJc w:val="left"/>
+      <w:pPr>
+        <w:tabs>
+          <w:tab w:val="num" w:pos="3600"/>
+        </w:tabs>
+        <w:ind w:left="3600" w:hanging="360"/>
+      </w:pPr>
+      <w:rPr>
+        <w:rFonts w:ascii="Wingdings" w:hAnsi="Wingdings" w:hint="default"/>
+        <w:sz w:val="20"/>
+      </w:rPr>
+    </w:lvl>
+    <w:lvl w:ilvl="5" w:tentative="1">
+      <w:start w:val="1"/>
+      <w:numFmt w:val="bullet"/>
+      <w:lvlText w:val=""/>
+      <w:lvlJc w:val="left"/>
+      <w:pPr>
+        <w:tabs>
+          <w:tab w:val="num" w:pos="4320"/>
+        </w:tabs>
+        <w:ind w:left="4320" w:hanging="360"/>
+      </w:pPr>
+      <w:rPr>
+        <w:rFonts w:ascii="Wingdings" w:hAnsi="Wingdings" w:hint="default"/>
+        <w:sz w:val="20"/>
+      </w:rPr>
+    </w:lvl>
+    <w:lvl w:ilvl="6" w:tentative="1">
+      <w:start w:val="1"/>
+      <w:numFmt w:val="bullet"/>
+      <w:lvlText w:val=""/>
+      <w:lvlJc w:val="left"/>
+      <w:pPr>
+        <w:tabs>
+          <w:tab w:val="num" w:pos="5040"/>
+        </w:tabs>
+        <w:ind w:left="5040" w:hanging="360"/>
+      </w:pPr>
+      <w:rPr>
+        <w:rFonts w:ascii="Wingdings" w:hAnsi="Wingdings" w:hint="default"/>
+        <w:sz w:val="20"/>
+      </w:rPr>
+    </w:lvl>
+    <w:lvl w:ilvl="7" w:tentative="1">
+      <w:start w:val="1"/>
+      <w:numFmt w:val="bullet"/>
+      <w:lvlText w:val=""/>
+      <w:lvlJc w:val="left"/>
+      <w:pPr>
+        <w:tabs>
+          <w:tab w:val="num" w:pos="5760"/>
+        </w:tabs>
+        <w:ind w:left="5760" w:hanging="360"/>
+      </w:pPr>
+      <w:rPr>
+        <w:rFonts w:ascii="Wingdings" w:hAnsi="Wingdings" w:hint="default"/>
+        <w:sz w:val="20"/>
+      </w:rPr>
+    </w:lvl>
+    <w:lvl w:ilvl="8" w:tentative="1">
+      <w:start w:val="1"/>
+      <w:numFmt w:val="bullet"/>
+      <w:lvlText w:val=""/>
+      <w:lvlJc w:val="left"/>
+      <w:pPr>
+        <w:tabs>
+          <w:tab w:val="num" w:pos="6480"/>
+        </w:tabs>
+        <w:ind w:left="6480" w:hanging="360"/>
+      </w:pPr>
+      <w:rPr>
+        <w:rFonts w:ascii="Wingdings" w:hAnsi="Wingdings" w:hint="default"/>
+        <w:sz w:val="20"/>
+      </w:rPr>
+    </w:lvl>
+  </w:abstractNum>
   <w:num w:numId="1" w16cid:durableId="2101485227">
+    <w:abstractNumId w:val="1"/>
+  </w:num>
+  <w:num w:numId="2" w16cid:durableId="1387801386">
+    <w:abstractNumId w:val="8"/>
+  </w:num>
+  <w:num w:numId="3" w16cid:durableId="1154101411">
+    <w:abstractNumId w:val="10"/>
+  </w:num>
+  <w:num w:numId="4" w16cid:durableId="1827282999">
+    <w:abstractNumId w:val="3"/>
+  </w:num>
+  <w:num w:numId="5" w16cid:durableId="2073457742">
     <w:abstractNumId w:val="0"/>
   </w:num>
-  <w:num w:numId="2" w16cid:durableId="1387801386">
-    <w:abstractNumId w:val="1"/>
+  <w:num w:numId="6" w16cid:durableId="483857597">
+    <w:abstractNumId w:val="4"/>
+  </w:num>
+  <w:num w:numId="7" w16cid:durableId="2009206846">
+    <w:abstractNumId w:val="6"/>
+  </w:num>
+  <w:num w:numId="8" w16cid:durableId="2109234194">
+    <w:abstractNumId w:val="7"/>
+  </w:num>
+  <w:num w:numId="9" w16cid:durableId="2131701930">
+    <w:abstractNumId w:val="11"/>
+  </w:num>
+  <w:num w:numId="10" w16cid:durableId="233471071">
+    <w:abstractNumId w:val="5"/>
+  </w:num>
+  <w:num w:numId="11" w16cid:durableId="458233054">
+    <w:abstractNumId w:val="2"/>
+  </w:num>
+  <w:num w:numId="12" w16cid:durableId="364788882">
+    <w:abstractNumId w:val="9"/>
   </w:num>
 </w:numbering>
 </file>
@@ -7561,7 +9943,6 @@
   <w:style w:type="character" w:default="1" w:styleId="DefaultParagraphFont">
     <w:name w:val="Default Paragraph Font"/>
     <w:uiPriority w:val="1"/>
-    <w:semiHidden/>
     <w:unhideWhenUsed/>
   </w:style>
   <w:style w:type="table" w:default="1" w:styleId="TableNormal">
@@ -7890,6 +10271,17 @@
       <w:spacing w:val="5"/>
     </w:rPr>
   </w:style>
+  <w:style w:type="paragraph" w:styleId="NormalWeb">
+    <w:name w:val="Normal (Web)"/>
+    <w:basedOn w:val="Normal"/>
+    <w:uiPriority w:val="99"/>
+    <w:semiHidden/>
+    <w:unhideWhenUsed/>
+    <w:rsid w:val="001724A6"/>
+    <w:pPr>
+      <w:spacing w:before="100" w:beforeAutospacing="1" w:after="100" w:afterAutospacing="1"/>
+    </w:pPr>
+  </w:style>
 </w:styles>
 </file>
 

</xml_diff>

<commit_message>
V29: Formatted parts, minor edits to score. Updated Percussion Key and Front Matter
</commit_message>
<xml_diff>
--- a/2 Proofreading and Review/LARA Mosaic Maze - Errata_v2 (Page 1-60) - Major Changes.docx
+++ b/2 Proofreading and Review/LARA Mosaic Maze - Errata_v2 (Page 1-60) - Major Changes.docx
@@ -296,19 +296,8 @@
           <w:sz w:val="28"/>
           <w:szCs w:val="28"/>
         </w:rPr>
-        <w:t xml:space="preserve">: Second note should be B on upper staff and A on </w:t>
-      </w:r>
-      <w:proofErr w:type="gramStart"/>
-      <w:r>
-        <w:rPr>
-          <w:rFonts w:ascii="Aptos Display" w:hAnsi="Aptos Display" w:cs="Segoe UI"/>
-          <w:color w:val="000000"/>
-          <w:sz w:val="28"/>
-          <w:szCs w:val="28"/>
-        </w:rPr>
-        <w:t>lower</w:t>
-      </w:r>
-      <w:proofErr w:type="gramEnd"/>
+        <w:t>: Second note should be B on upper staff and A on lower</w:t>
+      </w:r>
     </w:p>
     <w:p>
       <w:pPr>
@@ -438,27 +427,7 @@
           <w:sz w:val="28"/>
           <w:szCs w:val="28"/>
         </w:rPr>
-        <w:t xml:space="preserve">I made some changes to Percussion Notation, </w:t>
-      </w:r>
-      <w:proofErr w:type="gramStart"/>
-      <w:r>
-        <w:rPr>
-          <w:rFonts w:ascii="Aptos Display" w:hAnsi="Aptos Display" w:cs="Segoe UI"/>
-          <w:color w:val="000000"/>
-          <w:sz w:val="28"/>
-          <w:szCs w:val="28"/>
-        </w:rPr>
-        <w:t>Please</w:t>
-      </w:r>
-      <w:proofErr w:type="gramEnd"/>
-      <w:r>
-        <w:rPr>
-          <w:rFonts w:ascii="Aptos Display" w:hAnsi="Aptos Display" w:cs="Segoe UI"/>
-          <w:color w:val="000000"/>
-          <w:sz w:val="28"/>
-          <w:szCs w:val="28"/>
-        </w:rPr>
-        <w:t xml:space="preserve"> adjust carefully!</w:t>
+        <w:t>I made some changes to Percussion Notation, Please adjust carefully!</w:t>
       </w:r>
     </w:p>
     <w:p>
@@ -543,76 +512,16 @@
           <w:sz w:val="28"/>
           <w:szCs w:val="28"/>
         </w:rPr>
-        <w:t xml:space="preserve"> for both Wood Plank and Wood blocks, because they are always coupled and not independent. </w:t>
-      </w:r>
-      <w:proofErr w:type="gramStart"/>
-      <w:r>
-        <w:rPr>
-          <w:rFonts w:ascii="Aptos Display" w:hAnsi="Aptos Display" w:cs="Segoe UI"/>
-          <w:color w:val="000000"/>
-          <w:sz w:val="28"/>
-          <w:szCs w:val="28"/>
-        </w:rPr>
-        <w:t>Also</w:t>
-      </w:r>
-      <w:proofErr w:type="gramEnd"/>
-      <w:r>
-        <w:rPr>
-          <w:rFonts w:ascii="Aptos Display" w:hAnsi="Aptos Display" w:cs="Segoe UI"/>
-          <w:color w:val="000000"/>
-          <w:sz w:val="28"/>
-          <w:szCs w:val="28"/>
-        </w:rPr>
-        <w:t xml:space="preserve"> I added 2 new toms, now totaling 5 toms</w:t>
-      </w:r>
-      <w:r>
-        <w:rPr>
-          <w:rFonts w:ascii="Aptos Display" w:hAnsi="Aptos Display" w:cs="Segoe UI"/>
-          <w:color w:val="000000"/>
-          <w:sz w:val="28"/>
-          <w:szCs w:val="28"/>
-        </w:rPr>
-        <w:t xml:space="preserve">. Also, please change instrument name from “Wood </w:t>
-      </w:r>
-      <w:proofErr w:type="spellStart"/>
-      <w:r>
-        <w:rPr>
-          <w:rFonts w:ascii="Aptos Display" w:hAnsi="Aptos Display" w:cs="Segoe UI"/>
-          <w:color w:val="000000"/>
-          <w:sz w:val="28"/>
-          <w:szCs w:val="28"/>
-        </w:rPr>
-        <w:t>Plancks</w:t>
-      </w:r>
-      <w:proofErr w:type="spellEnd"/>
-      <w:r>
-        <w:rPr>
-          <w:rFonts w:ascii="Aptos Display" w:hAnsi="Aptos Display" w:cs="Segoe UI"/>
-          <w:color w:val="000000"/>
-          <w:sz w:val="28"/>
-          <w:szCs w:val="28"/>
-        </w:rPr>
-        <w:t xml:space="preserve">” to “Low Wood </w:t>
-      </w:r>
-      <w:proofErr w:type="gramStart"/>
-      <w:r>
-        <w:rPr>
-          <w:rFonts w:ascii="Aptos Display" w:hAnsi="Aptos Display" w:cs="Segoe UI"/>
-          <w:color w:val="000000"/>
-          <w:sz w:val="28"/>
-          <w:szCs w:val="28"/>
-        </w:rPr>
-        <w:t>Planks</w:t>
-      </w:r>
-      <w:proofErr w:type="gramEnd"/>
-      <w:r>
-        <w:rPr>
-          <w:rFonts w:ascii="Aptos Display" w:hAnsi="Aptos Display" w:cs="Segoe UI"/>
-          <w:color w:val="000000"/>
-          <w:sz w:val="28"/>
-          <w:szCs w:val="28"/>
-        </w:rPr>
-        <w:t>”</w:t>
+        <w:t xml:space="preserve"> for both Wood Plank and Wood blocks, because they are always coupled and not independent. Also I added 2 new toms, now totaling 5 toms</w:t>
+      </w:r>
+      <w:r>
+        <w:rPr>
+          <w:rFonts w:ascii="Aptos Display" w:hAnsi="Aptos Display" w:cs="Segoe UI"/>
+          <w:color w:val="000000"/>
+          <w:sz w:val="28"/>
+          <w:szCs w:val="28"/>
+        </w:rPr>
+        <w:t>. Also, please change instrument name from “Wood Plancks” to “Low Wood Planks”</w:t>
       </w:r>
     </w:p>
     <w:p>
@@ -1069,7 +978,6 @@
         </w:rPr>
         <w:t xml:space="preserve">: please change dynamics from mf to </w:t>
       </w:r>
-      <w:proofErr w:type="gramStart"/>
       <w:r>
         <w:rPr>
           <w:rFonts w:ascii="Aptos Display" w:hAnsi="Aptos Display"/>
@@ -1080,7 +988,6 @@
         </w:rPr>
         <w:t>p</w:t>
       </w:r>
-      <w:proofErr w:type="gramEnd"/>
     </w:p>
     <w:p>
       <w:pPr>
@@ -1117,27 +1024,7 @@
           <w:sz w:val="28"/>
           <w:szCs w:val="28"/>
         </w:rPr>
-        <w:t xml:space="preserve">M11 – 13, </w:t>
-      </w:r>
-      <w:proofErr w:type="gramStart"/>
-      <w:r>
-        <w:rPr>
-          <w:rFonts w:ascii="Aptos Display" w:hAnsi="Aptos Display" w:cs="Segoe UI"/>
-          <w:color w:val="000000"/>
-          <w:sz w:val="28"/>
-          <w:szCs w:val="28"/>
-        </w:rPr>
-        <w:t>Perc ,</w:t>
-      </w:r>
-      <w:proofErr w:type="gramEnd"/>
-      <w:r>
-        <w:rPr>
-          <w:rFonts w:ascii="Aptos Display" w:hAnsi="Aptos Display" w:cs="Segoe UI"/>
-          <w:color w:val="000000"/>
-          <w:sz w:val="28"/>
-          <w:szCs w:val="28"/>
-        </w:rPr>
-        <w:t xml:space="preserve"> both hands: delete all material (Perc materials should return on M14)</w:t>
+        <w:t>M11 – 13, Perc , both hands: delete all material (Perc materials should return on M14)</w:t>
       </w:r>
     </w:p>
     <w:p>
@@ -1174,19 +1061,8 @@
           <w:sz w:val="28"/>
           <w:szCs w:val="28"/>
         </w:rPr>
-        <w:t xml:space="preserve">M18- 25, Perc 1, both hands: delete all </w:t>
-      </w:r>
-      <w:proofErr w:type="gramStart"/>
-      <w:r>
-        <w:rPr>
-          <w:rFonts w:ascii="Aptos Display" w:hAnsi="Aptos Display" w:cs="Segoe UI"/>
-          <w:color w:val="000000"/>
-          <w:sz w:val="28"/>
-          <w:szCs w:val="28"/>
-        </w:rPr>
-        <w:t>material</w:t>
-      </w:r>
-      <w:proofErr w:type="gramEnd"/>
+        <w:t>M18- 25, Perc 1, both hands: delete all material</w:t>
+      </w:r>
     </w:p>
     <w:p>
       <w:pPr>
@@ -1281,27 +1157,7 @@
           <w:szCs w:val="28"/>
         </w:rPr>
         <w:br/>
-        <w:t xml:space="preserve">(include </w:t>
-      </w:r>
-      <w:proofErr w:type="spellStart"/>
-      <w:r>
-        <w:rPr>
-          <w:rFonts w:ascii="Aptos Display" w:hAnsi="Aptos Display" w:cs="Segoe UI"/>
-          <w:color w:val="000000"/>
-          <w:sz w:val="28"/>
-          <w:szCs w:val="28"/>
-        </w:rPr>
-        <w:t>cresc</w:t>
-      </w:r>
-      <w:proofErr w:type="spellEnd"/>
-      <w:r>
-        <w:rPr>
-          <w:rFonts w:ascii="Aptos Display" w:hAnsi="Aptos Display" w:cs="Segoe UI"/>
-          <w:color w:val="000000"/>
-          <w:sz w:val="28"/>
-          <w:szCs w:val="28"/>
-        </w:rPr>
-        <w:t xml:space="preserve"> from mf to ff); then make M30-31 also </w:t>
+        <w:t xml:space="preserve">(include cresc from mf to ff); then make M30-31 also </w:t>
       </w:r>
       <w:r>
         <w:rPr>
@@ -1433,27 +1289,7 @@
           <w:szCs w:val="28"/>
         </w:rPr>
         <w:lastRenderedPageBreak/>
-        <w:t xml:space="preserve">M26, then crescendo </w:t>
-      </w:r>
-      <w:proofErr w:type="gramStart"/>
-      <w:r>
-        <w:rPr>
-          <w:rFonts w:ascii="Aptos Display" w:hAnsi="Aptos Display" w:cs="Segoe UI"/>
-          <w:color w:val="000000"/>
-          <w:sz w:val="28"/>
-          <w:szCs w:val="28"/>
-        </w:rPr>
-        <w:t>from  pp</w:t>
-      </w:r>
-      <w:proofErr w:type="gramEnd"/>
-      <w:r>
-        <w:rPr>
-          <w:rFonts w:ascii="Aptos Display" w:hAnsi="Aptos Display" w:cs="Segoe UI"/>
-          <w:color w:val="000000"/>
-          <w:sz w:val="28"/>
-          <w:szCs w:val="28"/>
-        </w:rPr>
-        <w:t xml:space="preserve"> in M27 to ff in M30</w:t>
+        <w:t>M26, then crescendo from  pp in M27 to ff in M30</w:t>
       </w:r>
       <w:r>
         <w:rPr>
@@ -1542,7 +1378,6 @@
         </w:rPr>
         <w:t xml:space="preserve">M48 – 54, Perc 2: make entire part </w:t>
       </w:r>
-      <w:proofErr w:type="gramStart"/>
       <w:r>
         <w:rPr>
           <w:rFonts w:ascii="Aptos Display" w:hAnsi="Aptos Display"/>
@@ -1551,7 +1386,6 @@
         </w:rPr>
         <w:t>Skins</w:t>
       </w:r>
-      <w:proofErr w:type="gramEnd"/>
     </w:p>
     <w:p>
       <w:pPr>
@@ -1595,33 +1429,15 @@
           <w:sz w:val="28"/>
           <w:szCs w:val="28"/>
         </w:rPr>
-        <w:t xml:space="preserve">make entire </w:t>
-      </w:r>
-      <w:proofErr w:type="gramStart"/>
-      <w:r>
-        <w:rPr>
-          <w:rFonts w:ascii="Aptos Display" w:hAnsi="Aptos Display"/>
-          <w:sz w:val="28"/>
-          <w:szCs w:val="28"/>
-        </w:rPr>
-        <w:t xml:space="preserve">part </w:t>
-      </w:r>
-      <w:r>
-        <w:rPr>
-          <w:rFonts w:ascii="Aptos Display" w:hAnsi="Aptos Display"/>
-          <w:sz w:val="28"/>
-          <w:szCs w:val="28"/>
-        </w:rPr>
-        <w:t xml:space="preserve"> only</w:t>
-      </w:r>
-      <w:proofErr w:type="gramEnd"/>
-      <w:r>
-        <w:rPr>
-          <w:rFonts w:ascii="Aptos Display" w:hAnsi="Aptos Display"/>
-          <w:sz w:val="28"/>
-          <w:szCs w:val="28"/>
-        </w:rPr>
-        <w:t xml:space="preserve"> one staff of </w:t>
+        <w:t xml:space="preserve">make entire part </w:t>
+      </w:r>
+      <w:r>
+        <w:rPr>
+          <w:rFonts w:ascii="Aptos Display" w:hAnsi="Aptos Display"/>
+          <w:sz w:val="28"/>
+          <w:szCs w:val="28"/>
+        </w:rPr>
+        <w:t xml:space="preserve"> only one staff of </w:t>
       </w:r>
       <w:r>
         <w:rPr>
@@ -1664,25 +1480,7 @@
           <w:sz w:val="28"/>
           <w:szCs w:val="28"/>
         </w:rPr>
-        <w:t>M55, Perc 1: make dynamics for last note “</w:t>
-      </w:r>
-      <w:proofErr w:type="gramStart"/>
-      <w:r>
-        <w:rPr>
-          <w:rFonts w:ascii="Aptos Display" w:hAnsi="Aptos Display"/>
-          <w:sz w:val="28"/>
-          <w:szCs w:val="28"/>
-        </w:rPr>
-        <w:t>p</w:t>
-      </w:r>
-      <w:proofErr w:type="gramEnd"/>
-      <w:r>
-        <w:rPr>
-          <w:rFonts w:ascii="Aptos Display" w:hAnsi="Aptos Display"/>
-          <w:sz w:val="28"/>
-          <w:szCs w:val="28"/>
-        </w:rPr>
-        <w:t>”</w:t>
+        <w:t>M55, Perc 1: make dynamics for last note “p”</w:t>
       </w:r>
     </w:p>
     <w:p>
@@ -1716,27 +1514,7 @@
           <w:sz w:val="28"/>
           <w:szCs w:val="28"/>
         </w:rPr>
-        <w:t>M56, Perc 2: make dynamic “</w:t>
-      </w:r>
-      <w:proofErr w:type="spellStart"/>
-      <w:proofErr w:type="gramStart"/>
-      <w:r>
-        <w:rPr>
-          <w:rFonts w:ascii="Aptos Display" w:hAnsi="Aptos Display"/>
-          <w:sz w:val="28"/>
-          <w:szCs w:val="28"/>
-        </w:rPr>
-        <w:t>mp</w:t>
-      </w:r>
-      <w:proofErr w:type="spellEnd"/>
-      <w:proofErr w:type="gramEnd"/>
-      <w:r>
-        <w:rPr>
-          <w:rFonts w:ascii="Aptos Display" w:hAnsi="Aptos Display"/>
-          <w:sz w:val="28"/>
-          <w:szCs w:val="28"/>
-        </w:rPr>
-        <w:t>”</w:t>
+        <w:t>M56, Perc 2: make dynamic “mp”</w:t>
       </w:r>
     </w:p>
     <w:p>
@@ -1804,25 +1582,7 @@
           <w:sz w:val="28"/>
           <w:szCs w:val="28"/>
         </w:rPr>
-        <w:t>M58, Perc 1: make “</w:t>
-      </w:r>
-      <w:proofErr w:type="gramStart"/>
-      <w:r>
-        <w:rPr>
-          <w:rFonts w:ascii="Aptos Display" w:hAnsi="Aptos Display"/>
-          <w:sz w:val="28"/>
-          <w:szCs w:val="28"/>
-        </w:rPr>
-        <w:t>ff</w:t>
-      </w:r>
-      <w:proofErr w:type="gramEnd"/>
-      <w:r>
-        <w:rPr>
-          <w:rFonts w:ascii="Aptos Display" w:hAnsi="Aptos Display"/>
-          <w:sz w:val="28"/>
-          <w:szCs w:val="28"/>
-        </w:rPr>
-        <w:t>”</w:t>
+        <w:t>M58, Perc 1: make “ff”</w:t>
       </w:r>
     </w:p>
     <w:p>
@@ -1867,25 +1627,7 @@
           <w:sz w:val="28"/>
           <w:szCs w:val="28"/>
         </w:rPr>
-        <w:t xml:space="preserve">make entire </w:t>
-      </w:r>
-      <w:proofErr w:type="gramStart"/>
-      <w:r>
-        <w:rPr>
-          <w:rFonts w:ascii="Aptos Display" w:hAnsi="Aptos Display"/>
-          <w:sz w:val="28"/>
-          <w:szCs w:val="28"/>
-        </w:rPr>
-        <w:t>part  only</w:t>
-      </w:r>
-      <w:proofErr w:type="gramEnd"/>
-      <w:r>
-        <w:rPr>
-          <w:rFonts w:ascii="Aptos Display" w:hAnsi="Aptos Display"/>
-          <w:sz w:val="28"/>
-          <w:szCs w:val="28"/>
-        </w:rPr>
-        <w:t xml:space="preserve"> one staff of Skins each, then back to original wood percussion on M62</w:t>
+        <w:t>make entire part  only one staff of Skins each, then back to original wood percussion on M62</w:t>
       </w:r>
     </w:p>
     <w:p>
@@ -1959,27 +1701,7 @@
           <w:sz w:val="28"/>
           <w:szCs w:val="28"/>
         </w:rPr>
-        <w:t xml:space="preserve">Perc 1 right hand (delete beats 2 of M62, 63, 64, and </w:t>
-      </w:r>
-      <w:proofErr w:type="gramStart"/>
-      <w:r>
-        <w:rPr>
-          <w:rFonts w:ascii="Aptos Display" w:hAnsi="Aptos Display" w:cs="Segoe UI"/>
-          <w:color w:val="000000"/>
-          <w:sz w:val="28"/>
-          <w:szCs w:val="28"/>
-        </w:rPr>
-        <w:t>all of</w:t>
-      </w:r>
-      <w:proofErr w:type="gramEnd"/>
-      <w:r>
-        <w:rPr>
-          <w:rFonts w:ascii="Aptos Display" w:hAnsi="Aptos Display" w:cs="Segoe UI"/>
-          <w:color w:val="000000"/>
-          <w:sz w:val="28"/>
-          <w:szCs w:val="28"/>
-        </w:rPr>
-        <w:t xml:space="preserve"> M67</w:t>
+        <w:t>Perc 1 right hand (delete beats 2 of M62, 63, 64, and all of M67</w:t>
       </w:r>
     </w:p>
     <w:p>
@@ -2016,27 +1738,7 @@
           <w:sz w:val="28"/>
           <w:szCs w:val="28"/>
         </w:rPr>
-        <w:t xml:space="preserve">Perc 1 left hand (delete </w:t>
-      </w:r>
-      <w:proofErr w:type="gramStart"/>
-      <w:r>
-        <w:rPr>
-          <w:rFonts w:ascii="Aptos Display" w:hAnsi="Aptos Display" w:cs="Segoe UI"/>
-          <w:color w:val="000000"/>
-          <w:sz w:val="28"/>
-          <w:szCs w:val="28"/>
-        </w:rPr>
-        <w:t>all of</w:t>
-      </w:r>
-      <w:proofErr w:type="gramEnd"/>
-      <w:r>
-        <w:rPr>
-          <w:rFonts w:ascii="Aptos Display" w:hAnsi="Aptos Display" w:cs="Segoe UI"/>
-          <w:color w:val="000000"/>
-          <w:sz w:val="28"/>
-          <w:szCs w:val="28"/>
-        </w:rPr>
-        <w:t xml:space="preserve"> M63, M66, Beat 3 of M67, and all of M68)</w:t>
+        <w:t>Perc 1 left hand (delete all of M63, M66, Beat 3 of M67, and all of M68)</w:t>
       </w:r>
       <w:r>
         <w:rPr>
@@ -2069,27 +1771,7 @@
           <w:sz w:val="28"/>
           <w:szCs w:val="28"/>
         </w:rPr>
-        <w:t xml:space="preserve">Perc 2 (delete beat 2 of M62, beat 3 of 63, </w:t>
-      </w:r>
-      <w:proofErr w:type="gramStart"/>
-      <w:r>
-        <w:rPr>
-          <w:rFonts w:ascii="Aptos Display" w:hAnsi="Aptos Display" w:cs="Segoe UI"/>
-          <w:color w:val="000000"/>
-          <w:sz w:val="28"/>
-          <w:szCs w:val="28"/>
-        </w:rPr>
-        <w:t>all of</w:t>
-      </w:r>
-      <w:proofErr w:type="gramEnd"/>
-      <w:r>
-        <w:rPr>
-          <w:rFonts w:ascii="Aptos Display" w:hAnsi="Aptos Display" w:cs="Segoe UI"/>
-          <w:color w:val="000000"/>
-          <w:sz w:val="28"/>
-          <w:szCs w:val="28"/>
-        </w:rPr>
-        <w:t xml:space="preserve"> M64, </w:t>
+        <w:t xml:space="preserve">Perc 2 (delete beat 2 of M62, beat 3 of 63, all of M64, </w:t>
       </w:r>
       <w:r>
         <w:rPr>
@@ -2242,19 +1924,8 @@
           <w:sz w:val="28"/>
           <w:szCs w:val="28"/>
         </w:rPr>
-        <w:t xml:space="preserve">M73 – 77, Perc 1: make part into Skins, keep only one </w:t>
-      </w:r>
-      <w:proofErr w:type="gramStart"/>
-      <w:r>
-        <w:rPr>
-          <w:rFonts w:ascii="Aptos Display" w:hAnsi="Aptos Display" w:cs="Segoe UI"/>
-          <w:color w:val="000000"/>
-          <w:sz w:val="28"/>
-          <w:szCs w:val="28"/>
-        </w:rPr>
-        <w:t>staff</w:t>
-      </w:r>
-      <w:proofErr w:type="gramEnd"/>
+        <w:t>M73 – 77, Perc 1: make part into Skins, keep only one staff</w:t>
+      </w:r>
     </w:p>
     <w:p>
       <w:pPr>
@@ -2290,19 +1961,8 @@
           <w:sz w:val="28"/>
           <w:szCs w:val="28"/>
         </w:rPr>
-        <w:t xml:space="preserve">M76-77, Perc 2: make part into </w:t>
-      </w:r>
-      <w:proofErr w:type="gramStart"/>
-      <w:r>
-        <w:rPr>
-          <w:rFonts w:ascii="Aptos Display" w:hAnsi="Aptos Display" w:cs="Segoe UI"/>
-          <w:color w:val="000000"/>
-          <w:sz w:val="28"/>
-          <w:szCs w:val="28"/>
-        </w:rPr>
-        <w:t>Skins</w:t>
-      </w:r>
-      <w:proofErr w:type="gramEnd"/>
+        <w:t>M76-77, Perc 2: make part into Skins</w:t>
+      </w:r>
     </w:p>
     <w:p>
       <w:pPr>
@@ -2349,27 +2009,7 @@
           <w:sz w:val="28"/>
           <w:szCs w:val="28"/>
         </w:rPr>
-        <w:t xml:space="preserve">ALSO make ALL bouncy gestures (except ff ones) start at </w:t>
-      </w:r>
-      <w:proofErr w:type="spellStart"/>
-      <w:r>
-        <w:rPr>
-          <w:rFonts w:ascii="Aptos Display" w:hAnsi="Aptos Display" w:cs="Segoe UI"/>
-          <w:color w:val="000000"/>
-          <w:sz w:val="28"/>
-          <w:szCs w:val="28"/>
-        </w:rPr>
-        <w:t>mp</w:t>
-      </w:r>
-      <w:proofErr w:type="spellEnd"/>
-      <w:r>
-        <w:rPr>
-          <w:rFonts w:ascii="Aptos Display" w:hAnsi="Aptos Display" w:cs="Segoe UI"/>
-          <w:color w:val="000000"/>
-          <w:sz w:val="28"/>
-          <w:szCs w:val="28"/>
-        </w:rPr>
-        <w:t xml:space="preserve">. </w:t>
+        <w:t xml:space="preserve">ALSO make ALL bouncy gestures (except ff ones) start at mp. </w:t>
       </w:r>
     </w:p>
     <w:p>
@@ -2645,47 +2285,7 @@
           <w:sz w:val="28"/>
           <w:szCs w:val="28"/>
         </w:rPr>
-        <w:t xml:space="preserve">tremolo roll and crescendo from </w:t>
-      </w:r>
-      <w:proofErr w:type="spellStart"/>
-      <w:r>
-        <w:rPr>
-          <w:rFonts w:ascii="Aptos Display" w:hAnsi="Aptos Display" w:cs="Segoe UI"/>
-          <w:color w:val="000000"/>
-          <w:sz w:val="28"/>
-          <w:szCs w:val="28"/>
-        </w:rPr>
-        <w:t>ppp</w:t>
-      </w:r>
-      <w:proofErr w:type="spellEnd"/>
-      <w:r>
-        <w:rPr>
-          <w:rFonts w:ascii="Aptos Display" w:hAnsi="Aptos Display" w:cs="Segoe UI"/>
-          <w:color w:val="000000"/>
-          <w:sz w:val="28"/>
-          <w:szCs w:val="28"/>
-        </w:rPr>
-        <w:t>&lt;</w:t>
-      </w:r>
-      <w:proofErr w:type="gramStart"/>
-      <w:r>
-        <w:rPr>
-          <w:rFonts w:ascii="Aptos Display" w:hAnsi="Aptos Display" w:cs="Segoe UI"/>
-          <w:color w:val="000000"/>
-          <w:sz w:val="28"/>
-          <w:szCs w:val="28"/>
-        </w:rPr>
-        <w:t>ff ,</w:t>
-      </w:r>
-      <w:proofErr w:type="gramEnd"/>
-      <w:r>
-        <w:rPr>
-          <w:rFonts w:ascii="Aptos Display" w:hAnsi="Aptos Display" w:cs="Segoe UI"/>
-          <w:color w:val="000000"/>
-          <w:sz w:val="28"/>
-          <w:szCs w:val="28"/>
-        </w:rPr>
-        <w:t xml:space="preserve"> on note from first attack on M102 (second highest skin instrument). In other words, introduce first attack on M102 starting on beat 4 of M100 through a tremolo roll.</w:t>
+        <w:t>tremolo roll and crescendo from ppp&lt;ff , on note from first attack on M102 (second highest skin instrument). In other words, introduce first attack on M102 starting on beat 4 of M100 through a tremolo roll.</w:t>
       </w:r>
       <w:r>
         <w:rPr>
@@ -2783,27 +2383,7 @@
           <w:sz w:val="28"/>
           <w:szCs w:val="28"/>
         </w:rPr>
-        <w:t xml:space="preserve">; also delete bottom </w:t>
-      </w:r>
-      <w:proofErr w:type="gramStart"/>
-      <w:r>
-        <w:rPr>
-          <w:rFonts w:ascii="Aptos Display" w:hAnsi="Aptos Display" w:cs="Segoe UI"/>
-          <w:color w:val="000000"/>
-          <w:sz w:val="28"/>
-          <w:szCs w:val="28"/>
-        </w:rPr>
-        <w:t>staff</w:t>
-      </w:r>
-      <w:proofErr w:type="gramEnd"/>
-      <w:r>
-        <w:rPr>
-          <w:rFonts w:ascii="Aptos Display" w:hAnsi="Aptos Display" w:cs="Segoe UI"/>
-          <w:color w:val="000000"/>
-          <w:sz w:val="28"/>
-          <w:szCs w:val="28"/>
-        </w:rPr>
-        <w:t xml:space="preserve"> </w:t>
+        <w:t xml:space="preserve">; also delete bottom staff </w:t>
       </w:r>
     </w:p>
     <w:p>
@@ -2843,27 +2423,7 @@
           <w:sz w:val="28"/>
           <w:szCs w:val="28"/>
         </w:rPr>
-        <w:t xml:space="preserve">M105 – 115, Perc 1: Should be now all Skin. Make all wood attacks into respective </w:t>
-      </w:r>
-      <w:proofErr w:type="gramStart"/>
-      <w:r>
-        <w:rPr>
-          <w:rFonts w:ascii="Aptos Display" w:hAnsi="Aptos Display" w:cs="Segoe UI"/>
-          <w:color w:val="000000"/>
-          <w:sz w:val="28"/>
-          <w:szCs w:val="28"/>
-        </w:rPr>
-        <w:t>Skins, and</w:t>
-      </w:r>
-      <w:proofErr w:type="gramEnd"/>
-      <w:r>
-        <w:rPr>
-          <w:rFonts w:ascii="Aptos Display" w:hAnsi="Aptos Display" w:cs="Segoe UI"/>
-          <w:color w:val="000000"/>
-          <w:sz w:val="28"/>
-          <w:szCs w:val="28"/>
-        </w:rPr>
-        <w:t xml:space="preserve"> keep current tom toms where they are</w:t>
+        <w:t>M105 – 115, Perc 1: Should be now all Skin. Make all wood attacks into respective Skins, and keep current tom toms where they are</w:t>
       </w:r>
       <w:r>
         <w:rPr>
@@ -2907,27 +2467,7 @@
           <w:sz w:val="28"/>
           <w:szCs w:val="28"/>
         </w:rPr>
-        <w:t xml:space="preserve">Delete M105 right hand beat 1, M106 right hand, M109 right hand, M110 right </w:t>
-      </w:r>
-      <w:proofErr w:type="gramStart"/>
-      <w:r>
-        <w:rPr>
-          <w:rFonts w:ascii="Aptos Display" w:hAnsi="Aptos Display" w:cs="Segoe UI"/>
-          <w:color w:val="000000"/>
-          <w:sz w:val="28"/>
-          <w:szCs w:val="28"/>
-        </w:rPr>
-        <w:t>hand;</w:t>
-      </w:r>
-      <w:proofErr w:type="gramEnd"/>
-      <w:r>
-        <w:rPr>
-          <w:rFonts w:ascii="Aptos Display" w:hAnsi="Aptos Display" w:cs="Segoe UI"/>
-          <w:color w:val="000000"/>
-          <w:sz w:val="28"/>
-          <w:szCs w:val="28"/>
-        </w:rPr>
-        <w:t xml:space="preserve"> </w:t>
+        <w:t xml:space="preserve">Delete M105 right hand beat 1, M106 right hand, M109 right hand, M110 right hand; </w:t>
       </w:r>
     </w:p>
     <w:p>
@@ -2962,27 +2502,7 @@
           <w:sz w:val="28"/>
           <w:szCs w:val="28"/>
         </w:rPr>
-        <w:t xml:space="preserve">Delete M112 – 115, all </w:t>
-      </w:r>
-      <w:proofErr w:type="gramStart"/>
-      <w:r>
-        <w:rPr>
-          <w:rFonts w:ascii="Aptos Display" w:hAnsi="Aptos Display" w:cs="Segoe UI"/>
-          <w:color w:val="000000"/>
-          <w:sz w:val="28"/>
-          <w:szCs w:val="28"/>
-        </w:rPr>
-        <w:t>right hand</w:t>
-      </w:r>
-      <w:proofErr w:type="gramEnd"/>
-      <w:r>
-        <w:rPr>
-          <w:rFonts w:ascii="Aptos Display" w:hAnsi="Aptos Display" w:cs="Segoe UI"/>
-          <w:color w:val="000000"/>
-          <w:sz w:val="28"/>
-          <w:szCs w:val="28"/>
-        </w:rPr>
-        <w:t xml:space="preserve"> part (keep one staff and should now be Skins)</w:t>
+        <w:t>Delete M112 – 115, all right hand part (keep one staff and should now be Skins)</w:t>
       </w:r>
     </w:p>
     <w:p>
@@ -3009,19 +2529,8 @@
           <w:szCs w:val="28"/>
         </w:rPr>
         <w:lastRenderedPageBreak/>
-        <w:t xml:space="preserve">M122, Perc 1 and 2: Make both parts into respective Skins and make Perc 1 just one </w:t>
-      </w:r>
-      <w:proofErr w:type="gramStart"/>
-      <w:r>
-        <w:rPr>
-          <w:rFonts w:ascii="Aptos Display" w:hAnsi="Aptos Display" w:cs="Segoe UI"/>
-          <w:color w:val="000000"/>
-          <w:sz w:val="28"/>
-          <w:szCs w:val="28"/>
-        </w:rPr>
-        <w:t>staff</w:t>
-      </w:r>
-      <w:proofErr w:type="gramEnd"/>
+        <w:t>M122, Perc 1 and 2: Make both parts into respective Skins and make Perc 1 just one staff</w:t>
+      </w:r>
     </w:p>
     <w:p>
       <w:pPr>
@@ -3060,25 +2569,7 @@
           <w:sz w:val="28"/>
           <w:szCs w:val="28"/>
         </w:rPr>
-        <w:t>M123, Perc 1: BACK TO WOODS AS ORIGINAL, both hands (2 staffs), make dynamics “</w:t>
-      </w:r>
-      <w:proofErr w:type="gramStart"/>
-      <w:r>
-        <w:rPr>
-          <w:rFonts w:ascii="Aptos Display" w:hAnsi="Aptos Display"/>
-          <w:sz w:val="28"/>
-          <w:szCs w:val="28"/>
-        </w:rPr>
-        <w:t>p</w:t>
-      </w:r>
-      <w:proofErr w:type="gramEnd"/>
-      <w:r>
-        <w:rPr>
-          <w:rFonts w:ascii="Aptos Display" w:hAnsi="Aptos Display"/>
-          <w:sz w:val="28"/>
-          <w:szCs w:val="28"/>
-        </w:rPr>
-        <w:t>”</w:t>
+        <w:t>M123, Perc 1: BACK TO WOODS AS ORIGINAL, both hands (2 staffs), make dynamics “p”</w:t>
       </w:r>
     </w:p>
     <w:p>
@@ -3204,19 +2695,8 @@
           <w:sz w:val="28"/>
           <w:szCs w:val="28"/>
         </w:rPr>
-        <w:t xml:space="preserve">M141, Perc 2: make part into respective </w:t>
-      </w:r>
-      <w:proofErr w:type="gramStart"/>
-      <w:r>
-        <w:rPr>
-          <w:rFonts w:ascii="Aptos Display" w:hAnsi="Aptos Display" w:cs="Segoe UI"/>
-          <w:color w:val="000000"/>
-          <w:sz w:val="28"/>
-          <w:szCs w:val="28"/>
-        </w:rPr>
-        <w:t>Skin</w:t>
-      </w:r>
-      <w:proofErr w:type="gramEnd"/>
+        <w:t>M141, Perc 2: make part into respective Skin</w:t>
+      </w:r>
     </w:p>
     <w:p>
       <w:pPr>
@@ -3263,36 +2743,16 @@
           <w:sz w:val="28"/>
           <w:szCs w:val="28"/>
         </w:rPr>
-        <w:t xml:space="preserve"> with Perc 1 in 2 staffs</w:t>
-      </w:r>
-      <w:proofErr w:type="gramStart"/>
-      <w:r>
-        <w:rPr>
-          <w:rFonts w:ascii="Aptos Display" w:hAnsi="Aptos Display" w:cs="Segoe UI"/>
-          <w:color w:val="000000"/>
-          <w:sz w:val="28"/>
-          <w:szCs w:val="28"/>
-        </w:rPr>
-        <w:t xml:space="preserve">) </w:t>
-      </w:r>
-      <w:r>
-        <w:rPr>
-          <w:rFonts w:ascii="Aptos Display" w:hAnsi="Aptos Display" w:cs="Segoe UI"/>
-          <w:color w:val="000000"/>
-          <w:sz w:val="28"/>
-          <w:szCs w:val="28"/>
-        </w:rPr>
-        <w:t>,</w:t>
-      </w:r>
-      <w:proofErr w:type="gramEnd"/>
-      <w:r>
-        <w:rPr>
-          <w:rFonts w:ascii="Aptos Display" w:hAnsi="Aptos Display" w:cs="Segoe UI"/>
-          <w:color w:val="000000"/>
-          <w:sz w:val="28"/>
-          <w:szCs w:val="28"/>
-        </w:rPr>
-        <w:t xml:space="preserve"> but now dynamics should be “pp” for Perc 1 and “p” for Perc 2.</w:t>
+        <w:t xml:space="preserve"> with Perc 1 in 2 staffs) </w:t>
+      </w:r>
+      <w:r>
+        <w:rPr>
+          <w:rFonts w:ascii="Aptos Display" w:hAnsi="Aptos Display" w:cs="Segoe UI"/>
+          <w:color w:val="000000"/>
+          <w:sz w:val="28"/>
+          <w:szCs w:val="28"/>
+        </w:rPr>
+        <w:t>, but now dynamics should be “pp” for Perc 1 and “p” for Perc 2.</w:t>
       </w:r>
       <w:r>
         <w:rPr>
@@ -3477,25 +2937,7 @@
           <w:sz w:val="28"/>
           <w:szCs w:val="28"/>
         </w:rPr>
-        <w:t xml:space="preserve">M4 – 9, All Strings: please delete all up </w:t>
-      </w:r>
-      <w:proofErr w:type="gramStart"/>
-      <w:r>
-        <w:rPr>
-          <w:rFonts w:ascii="Aptos Display" w:hAnsi="Aptos Display"/>
-          <w:sz w:val="28"/>
-          <w:szCs w:val="28"/>
-        </w:rPr>
-        <w:t>bows;</w:t>
-      </w:r>
-      <w:proofErr w:type="gramEnd"/>
-      <w:r>
-        <w:rPr>
-          <w:rFonts w:ascii="Aptos Display" w:hAnsi="Aptos Display"/>
-          <w:sz w:val="28"/>
-          <w:szCs w:val="28"/>
-        </w:rPr>
-        <w:t xml:space="preserve"> </w:t>
+        <w:t xml:space="preserve">M4 – 9, All Strings: please delete all up bows; </w:t>
       </w:r>
     </w:p>
     <w:p>
@@ -3526,43 +2968,7 @@
           <w:sz w:val="28"/>
           <w:szCs w:val="28"/>
         </w:rPr>
-        <w:t xml:space="preserve">M12, All winds, vl1, vl2, </w:t>
-      </w:r>
-      <w:proofErr w:type="spellStart"/>
-      <w:r>
-        <w:rPr>
-          <w:rFonts w:ascii="Aptos Display" w:hAnsi="Aptos Display"/>
-          <w:sz w:val="28"/>
-          <w:szCs w:val="28"/>
-        </w:rPr>
-        <w:t>vcl</w:t>
-      </w:r>
-      <w:proofErr w:type="spellEnd"/>
-      <w:r>
-        <w:rPr>
-          <w:rFonts w:ascii="Aptos Display" w:hAnsi="Aptos Display"/>
-          <w:sz w:val="28"/>
-          <w:szCs w:val="28"/>
-        </w:rPr>
-        <w:t>: write “non-</w:t>
-      </w:r>
-      <w:proofErr w:type="gramStart"/>
-      <w:r>
-        <w:rPr>
-          <w:rFonts w:ascii="Aptos Display" w:hAnsi="Aptos Display"/>
-          <w:sz w:val="28"/>
-          <w:szCs w:val="28"/>
-        </w:rPr>
-        <w:t>legato”  before</w:t>
-      </w:r>
-      <w:proofErr w:type="gramEnd"/>
-      <w:r>
-        <w:rPr>
-          <w:rFonts w:ascii="Aptos Display" w:hAnsi="Aptos Display"/>
-          <w:sz w:val="28"/>
-          <w:szCs w:val="28"/>
-        </w:rPr>
-        <w:t xml:space="preserve"> phrase starts</w:t>
+        <w:t>M12, All winds, vl1, vl2, vcl: write “non-legato”  before phrase starts</w:t>
       </w:r>
       <w:r>
         <w:rPr>
@@ -3602,18 +3008,8 @@
           <w:sz w:val="28"/>
           <w:szCs w:val="28"/>
         </w:rPr>
-        <w:t xml:space="preserve">M13, Clarinet: second attack should be F ¼ flat, not </w:t>
-      </w:r>
-      <w:proofErr w:type="gramStart"/>
-      <w:r>
-        <w:rPr>
-          <w:rFonts w:ascii="Aptos Display" w:hAnsi="Aptos Display"/>
-          <w:sz w:val="28"/>
-          <w:szCs w:val="28"/>
-        </w:rPr>
-        <w:t>Fb</w:t>
-      </w:r>
-      <w:proofErr w:type="gramEnd"/>
+        <w:t>M13, Clarinet: second attack should be F ¼ flat, not Fb</w:t>
+      </w:r>
     </w:p>
     <w:p>
       <w:pPr>
@@ -3644,71 +3040,7 @@
           <w:sz w:val="28"/>
           <w:szCs w:val="28"/>
         </w:rPr>
-        <w:t>M14-16, viola: delete dynamic change for entire passage, leave viola “</w:t>
-      </w:r>
-      <w:proofErr w:type="spellStart"/>
-      <w:r>
-        <w:rPr>
-          <w:rFonts w:ascii="Aptos Display" w:hAnsi="Aptos Display"/>
-          <w:sz w:val="28"/>
-          <w:szCs w:val="28"/>
-        </w:rPr>
-        <w:t>mp</w:t>
-      </w:r>
-      <w:proofErr w:type="spellEnd"/>
-      <w:r>
-        <w:rPr>
-          <w:rFonts w:ascii="Aptos Display" w:hAnsi="Aptos Display"/>
-          <w:sz w:val="28"/>
-          <w:szCs w:val="28"/>
-        </w:rPr>
-        <w:t xml:space="preserve">” until M16 beat 4, where should now </w:t>
-      </w:r>
-      <w:proofErr w:type="gramStart"/>
-      <w:r>
-        <w:rPr>
-          <w:rFonts w:ascii="Aptos Display" w:hAnsi="Aptos Display"/>
-          <w:sz w:val="28"/>
-          <w:szCs w:val="28"/>
-        </w:rPr>
-        <w:t>be”(</w:t>
-      </w:r>
-      <w:proofErr w:type="spellStart"/>
-      <w:proofErr w:type="gramEnd"/>
-      <w:r>
-        <w:rPr>
-          <w:rFonts w:ascii="Aptos Display" w:hAnsi="Aptos Display"/>
-          <w:sz w:val="28"/>
-          <w:szCs w:val="28"/>
-        </w:rPr>
-        <w:t>mp</w:t>
-      </w:r>
-      <w:proofErr w:type="spellEnd"/>
-      <w:r>
-        <w:rPr>
-          <w:rFonts w:ascii="Aptos Display" w:hAnsi="Aptos Display"/>
-          <w:sz w:val="28"/>
-          <w:szCs w:val="28"/>
-        </w:rPr>
-        <w:t xml:space="preserve">)” followed by diminuendo. ALSO, add </w:t>
-      </w:r>
-      <w:proofErr w:type="spellStart"/>
-      <w:r>
-        <w:rPr>
-          <w:rFonts w:ascii="Aptos Display" w:hAnsi="Aptos Display"/>
-          <w:sz w:val="28"/>
-          <w:szCs w:val="28"/>
-        </w:rPr>
-        <w:t>gliss</w:t>
-      </w:r>
-      <w:proofErr w:type="spellEnd"/>
-      <w:r>
-        <w:rPr>
-          <w:rFonts w:ascii="Aptos Display" w:hAnsi="Aptos Display"/>
-          <w:sz w:val="28"/>
-          <w:szCs w:val="28"/>
-        </w:rPr>
-        <w:t xml:space="preserve"> arrow from bottom note of M15 to Bb on M16</w:t>
+        <w:t>M14-16, viola: delete dynamic change for entire passage, leave viola “mp” until M16 beat 4, where should now be”(mp)” followed by diminuendo. ALSO, add gliss arrow from bottom note of M15 to Bb on M16</w:t>
       </w:r>
     </w:p>
     <w:p>
@@ -3740,25 +3072,7 @@
           <w:sz w:val="28"/>
           <w:szCs w:val="28"/>
         </w:rPr>
-        <w:t xml:space="preserve">M17, violin 1: start </w:t>
-      </w:r>
-      <w:proofErr w:type="spellStart"/>
-      <w:r>
-        <w:rPr>
-          <w:rFonts w:ascii="Aptos Display" w:hAnsi="Aptos Display"/>
-          <w:sz w:val="28"/>
-          <w:szCs w:val="28"/>
-        </w:rPr>
-        <w:t>cresc</w:t>
-      </w:r>
-      <w:proofErr w:type="spellEnd"/>
-      <w:r>
-        <w:rPr>
-          <w:rFonts w:ascii="Aptos Display" w:hAnsi="Aptos Display"/>
-          <w:sz w:val="28"/>
-          <w:szCs w:val="28"/>
-        </w:rPr>
-        <w:t xml:space="preserve"> on M18 on Beat 2 of M17</w:t>
+        <w:t>M17, violin 1: start cresc on M18 on Beat 2 of M17</w:t>
       </w:r>
       <w:r>
         <w:rPr>
@@ -3814,18 +3128,8 @@
           <w:sz w:val="28"/>
           <w:szCs w:val="28"/>
         </w:rPr>
-        <w:t xml:space="preserve"> – 28, Strings: delete all up </w:t>
-      </w:r>
-      <w:proofErr w:type="gramStart"/>
-      <w:r>
-        <w:rPr>
-          <w:rFonts w:ascii="Aptos Display" w:hAnsi="Aptos Display"/>
-          <w:sz w:val="28"/>
-          <w:szCs w:val="28"/>
-        </w:rPr>
-        <w:t>bows;</w:t>
-      </w:r>
-      <w:proofErr w:type="gramEnd"/>
+        <w:t xml:space="preserve"> – 28, Strings: delete all up bows;</w:t>
+      </w:r>
     </w:p>
     <w:p>
       <w:pPr>
@@ -3872,25 +3176,7 @@
           <w:sz w:val="28"/>
           <w:szCs w:val="28"/>
         </w:rPr>
-        <w:t>boe: Change dynamics to “mf (shape dynamics freely)</w:t>
-      </w:r>
-      <w:proofErr w:type="gramStart"/>
-      <w:r>
-        <w:rPr>
-          <w:rFonts w:ascii="Aptos Display" w:hAnsi="Aptos Display"/>
-          <w:sz w:val="28"/>
-          <w:szCs w:val="28"/>
-        </w:rPr>
-        <w:t>” ;</w:t>
-      </w:r>
-      <w:proofErr w:type="gramEnd"/>
-      <w:r>
-        <w:rPr>
-          <w:rFonts w:ascii="Aptos Display" w:hAnsi="Aptos Display"/>
-          <w:sz w:val="28"/>
-          <w:szCs w:val="28"/>
-        </w:rPr>
-        <w:t xml:space="preserve"> also change “solo” to “solo, espressivo”</w:t>
+        <w:t>boe: Change dynamics to “mf (shape dynamics freely)” ; also change “solo” to “solo, espressivo”</w:t>
       </w:r>
     </w:p>
     <w:p>
@@ -3980,7 +3266,6 @@
         </w:rPr>
         <w:t>“</w:t>
       </w:r>
-      <w:proofErr w:type="spellStart"/>
       <w:r>
         <w:rPr>
           <w:rFonts w:ascii="Aptos Display" w:hAnsi="Aptos Display"/>
@@ -3989,7 +3274,6 @@
         </w:rPr>
         <w:t>bisb</w:t>
       </w:r>
-      <w:proofErr w:type="spellEnd"/>
       <w:r>
         <w:rPr>
           <w:rFonts w:ascii="Aptos Display" w:hAnsi="Aptos Display"/>
@@ -4006,7 +3290,6 @@
         </w:rPr>
         <w:t xml:space="preserve"> to last note of M22 (D) into beat 1 on M23…show </w:t>
       </w:r>
-      <w:proofErr w:type="spellStart"/>
       <w:r>
         <w:rPr>
           <w:rFonts w:ascii="Aptos Display" w:hAnsi="Aptos Display"/>
@@ -4015,7 +3298,6 @@
         </w:rPr>
         <w:t>bisbigliando</w:t>
       </w:r>
-      <w:proofErr w:type="spellEnd"/>
       <w:r>
         <w:rPr>
           <w:rFonts w:ascii="Aptos Display" w:hAnsi="Aptos Display"/>
@@ -4054,25 +3336,7 @@
           <w:sz w:val="28"/>
           <w:szCs w:val="28"/>
         </w:rPr>
-        <w:t xml:space="preserve">M31, TUTTI: add 2” fermata above </w:t>
-      </w:r>
-      <w:proofErr w:type="spellStart"/>
-      <w:r>
-        <w:rPr>
-          <w:rFonts w:ascii="Aptos Display" w:hAnsi="Aptos Display"/>
-          <w:sz w:val="28"/>
-          <w:szCs w:val="28"/>
-        </w:rPr>
-        <w:t>barline</w:t>
-      </w:r>
-      <w:proofErr w:type="spellEnd"/>
-      <w:r>
-        <w:rPr>
-          <w:rFonts w:ascii="Aptos Display" w:hAnsi="Aptos Display"/>
-          <w:sz w:val="28"/>
-          <w:szCs w:val="28"/>
-        </w:rPr>
-        <w:t xml:space="preserve"> between M31-32</w:t>
+        <w:t>M31, TUTTI: add 2” fermata above barline between M31-32</w:t>
       </w:r>
     </w:p>
     <w:p>
@@ -4184,18 +3448,8 @@
           <w:sz w:val="28"/>
           <w:szCs w:val="28"/>
         </w:rPr>
-        <w:t xml:space="preserve">M37 – 51, Strings, delete all up </w:t>
-      </w:r>
-      <w:proofErr w:type="gramStart"/>
-      <w:r>
-        <w:rPr>
-          <w:rFonts w:ascii="Aptos Display" w:hAnsi="Aptos Display"/>
-          <w:sz w:val="28"/>
-          <w:szCs w:val="28"/>
-        </w:rPr>
-        <w:t>bows;</w:t>
-      </w:r>
-      <w:proofErr w:type="gramEnd"/>
+        <w:t>M37 – 51, Strings, delete all up bows;</w:t>
+      </w:r>
     </w:p>
     <w:p>
       <w:pPr>
@@ -4225,45 +3479,7 @@
           <w:sz w:val="28"/>
           <w:szCs w:val="28"/>
         </w:rPr>
-        <w:t>M52 and 54, Winds and Strings: make “</w:t>
-      </w:r>
-      <w:proofErr w:type="spellStart"/>
-      <w:r>
-        <w:rPr>
-          <w:rFonts w:ascii="Aptos Display" w:hAnsi="Aptos Display"/>
-          <w:sz w:val="28"/>
-          <w:szCs w:val="28"/>
-        </w:rPr>
-        <w:t>sfz</w:t>
-      </w:r>
-      <w:proofErr w:type="spellEnd"/>
-      <w:r>
-        <w:rPr>
-          <w:rFonts w:ascii="Aptos Display" w:hAnsi="Aptos Display"/>
-          <w:sz w:val="28"/>
-          <w:szCs w:val="28"/>
-        </w:rPr>
-        <w:t>&gt;p” into “</w:t>
-      </w:r>
-      <w:proofErr w:type="spellStart"/>
-      <w:proofErr w:type="gramStart"/>
-      <w:r>
-        <w:rPr>
-          <w:rFonts w:ascii="Aptos Display" w:hAnsi="Aptos Display"/>
-          <w:sz w:val="28"/>
-          <w:szCs w:val="28"/>
-        </w:rPr>
-        <w:t>sfzp</w:t>
-      </w:r>
-      <w:proofErr w:type="spellEnd"/>
-      <w:proofErr w:type="gramEnd"/>
-      <w:r>
-        <w:rPr>
-          <w:rFonts w:ascii="Aptos Display" w:hAnsi="Aptos Display"/>
-          <w:sz w:val="28"/>
-          <w:szCs w:val="28"/>
-        </w:rPr>
-        <w:t>”</w:t>
+        <w:t>M52 and 54, Winds and Strings: make “sfz&gt;p” into “sfzp”</w:t>
       </w:r>
     </w:p>
     <w:p>
@@ -4357,45 +3573,7 @@
           <w:sz w:val="28"/>
           <w:szCs w:val="28"/>
         </w:rPr>
-        <w:t>60, Winds and Strings: make “</w:t>
-      </w:r>
-      <w:proofErr w:type="spellStart"/>
-      <w:r>
-        <w:rPr>
-          <w:rFonts w:ascii="Aptos Display" w:hAnsi="Aptos Display"/>
-          <w:sz w:val="28"/>
-          <w:szCs w:val="28"/>
-        </w:rPr>
-        <w:t>sfz</w:t>
-      </w:r>
-      <w:proofErr w:type="spellEnd"/>
-      <w:r>
-        <w:rPr>
-          <w:rFonts w:ascii="Aptos Display" w:hAnsi="Aptos Display"/>
-          <w:sz w:val="28"/>
-          <w:szCs w:val="28"/>
-        </w:rPr>
-        <w:t>&gt;p” into “</w:t>
-      </w:r>
-      <w:proofErr w:type="spellStart"/>
-      <w:proofErr w:type="gramStart"/>
-      <w:r>
-        <w:rPr>
-          <w:rFonts w:ascii="Aptos Display" w:hAnsi="Aptos Display"/>
-          <w:sz w:val="28"/>
-          <w:szCs w:val="28"/>
-        </w:rPr>
-        <w:t>sfzp</w:t>
-      </w:r>
-      <w:proofErr w:type="spellEnd"/>
-      <w:proofErr w:type="gramEnd"/>
-      <w:r>
-        <w:rPr>
-          <w:rFonts w:ascii="Aptos Display" w:hAnsi="Aptos Display"/>
-          <w:sz w:val="28"/>
-          <w:szCs w:val="28"/>
-        </w:rPr>
-        <w:t>”</w:t>
+        <w:t>60, Winds and Strings: make “sfz&gt;p” into “sfzp”</w:t>
       </w:r>
     </w:p>
     <w:p>
@@ -4522,27 +3700,7 @@
           <w:sz w:val="28"/>
           <w:szCs w:val="28"/>
         </w:rPr>
-        <w:t>, piano: make note heads “x” and write “</w:t>
-      </w:r>
-      <w:proofErr w:type="spellStart"/>
-      <w:proofErr w:type="gramStart"/>
-      <w:r>
-        <w:rPr>
-          <w:rFonts w:ascii="Aptos Display" w:hAnsi="Aptos Display"/>
-          <w:sz w:val="28"/>
-          <w:szCs w:val="28"/>
-        </w:rPr>
-        <w:t>gestopft</w:t>
-      </w:r>
-      <w:proofErr w:type="spellEnd"/>
-      <w:proofErr w:type="gramEnd"/>
-      <w:r>
-        <w:rPr>
-          <w:rFonts w:ascii="Aptos Display" w:hAnsi="Aptos Display"/>
-          <w:sz w:val="28"/>
-          <w:szCs w:val="28"/>
-        </w:rPr>
-        <w:t xml:space="preserve">” </w:t>
+        <w:t xml:space="preserve">, piano: make note heads “x” and write “gestopft” </w:t>
       </w:r>
     </w:p>
     <w:p>
@@ -4576,18 +3734,8 @@
           <w:sz w:val="28"/>
           <w:szCs w:val="28"/>
         </w:rPr>
-        <w:t xml:space="preserve">M62 – 70: Strings, delete all up </w:t>
-      </w:r>
-      <w:proofErr w:type="gramStart"/>
-      <w:r>
-        <w:rPr>
-          <w:rFonts w:ascii="Aptos Display" w:hAnsi="Aptos Display"/>
-          <w:sz w:val="28"/>
-          <w:szCs w:val="28"/>
-        </w:rPr>
-        <w:t>bows;</w:t>
-      </w:r>
-      <w:proofErr w:type="gramEnd"/>
+        <w:t>M62 – 70: Strings, delete all up bows;</w:t>
+      </w:r>
     </w:p>
     <w:p>
       <w:pPr>
@@ -4620,18 +3768,8 @@
           <w:sz w:val="28"/>
           <w:szCs w:val="28"/>
         </w:rPr>
-        <w:t xml:space="preserve">M64-70, piano: ALL attacks should now be “f” not </w:t>
-      </w:r>
-      <w:proofErr w:type="spellStart"/>
-      <w:r>
-        <w:rPr>
-          <w:rFonts w:ascii="Aptos Display" w:hAnsi="Aptos Display"/>
-          <w:sz w:val="28"/>
-          <w:szCs w:val="28"/>
-        </w:rPr>
-        <w:t>mp</w:t>
-      </w:r>
-      <w:proofErr w:type="spellEnd"/>
+        <w:t>M64-70, piano: ALL attacks should now be “f” not mp</w:t>
+      </w:r>
       <w:r>
         <w:rPr>
           <w:rFonts w:ascii="Aptos Display" w:hAnsi="Aptos Display"/>
@@ -4672,45 +3810,7 @@
           <w:sz w:val="28"/>
           <w:szCs w:val="28"/>
         </w:rPr>
-        <w:t>M71, Winds and Strings: make “</w:t>
-      </w:r>
-      <w:proofErr w:type="spellStart"/>
-      <w:r>
-        <w:rPr>
-          <w:rFonts w:ascii="Aptos Display" w:hAnsi="Aptos Display"/>
-          <w:sz w:val="28"/>
-          <w:szCs w:val="28"/>
-        </w:rPr>
-        <w:t>sfz</w:t>
-      </w:r>
-      <w:proofErr w:type="spellEnd"/>
-      <w:r>
-        <w:rPr>
-          <w:rFonts w:ascii="Aptos Display" w:hAnsi="Aptos Display"/>
-          <w:sz w:val="28"/>
-          <w:szCs w:val="28"/>
-        </w:rPr>
-        <w:t>&gt;p” into “</w:t>
-      </w:r>
-      <w:proofErr w:type="spellStart"/>
-      <w:proofErr w:type="gramStart"/>
-      <w:r>
-        <w:rPr>
-          <w:rFonts w:ascii="Aptos Display" w:hAnsi="Aptos Display"/>
-          <w:sz w:val="28"/>
-          <w:szCs w:val="28"/>
-        </w:rPr>
-        <w:t>sfzp</w:t>
-      </w:r>
-      <w:proofErr w:type="spellEnd"/>
-      <w:proofErr w:type="gramEnd"/>
-      <w:r>
-        <w:rPr>
-          <w:rFonts w:ascii="Aptos Display" w:hAnsi="Aptos Display"/>
-          <w:sz w:val="28"/>
-          <w:szCs w:val="28"/>
-        </w:rPr>
-        <w:t>”</w:t>
+        <w:t>M71, Winds and Strings: make “sfz&gt;p” into “sfzp”</w:t>
       </w:r>
     </w:p>
     <w:p>
@@ -4750,18 +3850,8 @@
           <w:sz w:val="28"/>
           <w:szCs w:val="28"/>
         </w:rPr>
-        <w:t xml:space="preserve">71, Horn, delete strange natural sign after notehead, should be just Bb 1/6 </w:t>
-      </w:r>
-      <w:proofErr w:type="gramStart"/>
-      <w:r>
-        <w:rPr>
-          <w:rFonts w:ascii="Aptos Display" w:hAnsi="Aptos Display"/>
-          <w:sz w:val="28"/>
-          <w:szCs w:val="28"/>
-        </w:rPr>
-        <w:t>flat</w:t>
-      </w:r>
-      <w:proofErr w:type="gramEnd"/>
+        <w:t>71, Horn, delete strange natural sign after notehead, should be just Bb 1/6 flat</w:t>
+      </w:r>
     </w:p>
     <w:p>
       <w:pPr>
@@ -4810,18 +3900,8 @@
           <w:sz w:val="28"/>
           <w:szCs w:val="28"/>
         </w:rPr>
-        <w:t xml:space="preserve">, Horn: add </w:t>
-      </w:r>
-      <w:proofErr w:type="gramStart"/>
-      <w:r>
-        <w:rPr>
-          <w:rFonts w:ascii="Aptos Display" w:hAnsi="Aptos Display"/>
-          <w:sz w:val="28"/>
-          <w:szCs w:val="28"/>
-        </w:rPr>
-        <w:t>slur</w:t>
-      </w:r>
-      <w:proofErr w:type="gramEnd"/>
+        <w:t>, Horn: add slur</w:t>
+      </w:r>
     </w:p>
     <w:p>
       <w:pPr>
@@ -4854,45 +3934,7 @@
           <w:sz w:val="28"/>
           <w:szCs w:val="28"/>
         </w:rPr>
-        <w:t>M76, Winds and Strings: make “</w:t>
-      </w:r>
-      <w:proofErr w:type="spellStart"/>
-      <w:r>
-        <w:rPr>
-          <w:rFonts w:ascii="Aptos Display" w:hAnsi="Aptos Display"/>
-          <w:sz w:val="28"/>
-          <w:szCs w:val="28"/>
-        </w:rPr>
-        <w:t>sfz</w:t>
-      </w:r>
-      <w:proofErr w:type="spellEnd"/>
-      <w:r>
-        <w:rPr>
-          <w:rFonts w:ascii="Aptos Display" w:hAnsi="Aptos Display"/>
-          <w:sz w:val="28"/>
-          <w:szCs w:val="28"/>
-        </w:rPr>
-        <w:t>&gt;p” into “</w:t>
-      </w:r>
-      <w:proofErr w:type="spellStart"/>
-      <w:proofErr w:type="gramStart"/>
-      <w:r>
-        <w:rPr>
-          <w:rFonts w:ascii="Aptos Display" w:hAnsi="Aptos Display"/>
-          <w:sz w:val="28"/>
-          <w:szCs w:val="28"/>
-        </w:rPr>
-        <w:t>sfzp</w:t>
-      </w:r>
-      <w:proofErr w:type="spellEnd"/>
-      <w:proofErr w:type="gramEnd"/>
-      <w:r>
-        <w:rPr>
-          <w:rFonts w:ascii="Aptos Display" w:hAnsi="Aptos Display"/>
-          <w:sz w:val="28"/>
-          <w:szCs w:val="28"/>
-        </w:rPr>
-        <w:t>”</w:t>
+        <w:t>M76, Winds and Strings: make “sfz&gt;p” into “sfzp”</w:t>
       </w:r>
     </w:p>
     <w:p>
@@ -4926,61 +3968,7 @@
           <w:sz w:val="28"/>
           <w:szCs w:val="28"/>
         </w:rPr>
-        <w:t>M77, Harp: Beat 4, Add Low “</w:t>
-      </w:r>
-      <w:proofErr w:type="spellStart"/>
-      <w:r>
-        <w:rPr>
-          <w:rFonts w:ascii="Aptos Display" w:hAnsi="Aptos Display"/>
-          <w:sz w:val="28"/>
-          <w:szCs w:val="28"/>
-        </w:rPr>
-        <w:t>fff</w:t>
-      </w:r>
-      <w:proofErr w:type="spellEnd"/>
-      <w:r>
-        <w:rPr>
-          <w:rFonts w:ascii="Aptos Display" w:hAnsi="Aptos Display"/>
-          <w:sz w:val="28"/>
-          <w:szCs w:val="28"/>
-        </w:rPr>
-        <w:t>” D 3/4 flat with HALF PEDAL sign and (</w:t>
-      </w:r>
-      <w:proofErr w:type="spellStart"/>
-      <w:r>
-        <w:rPr>
-          <w:rFonts w:ascii="Aptos Display" w:hAnsi="Aptos Display"/>
-          <w:sz w:val="28"/>
-          <w:szCs w:val="28"/>
-        </w:rPr>
-        <w:t>l.v.</w:t>
-      </w:r>
-      <w:proofErr w:type="spellEnd"/>
-      <w:r>
-        <w:rPr>
-          <w:rFonts w:ascii="Aptos Display" w:hAnsi="Aptos Display"/>
-          <w:sz w:val="28"/>
-          <w:szCs w:val="28"/>
-        </w:rPr>
-        <w:t>) slur in rhythmic unison with Piano</w:t>
-      </w:r>
-      <w:proofErr w:type="gramStart"/>
-      <w:r>
-        <w:rPr>
-          <w:rFonts w:ascii="Aptos Display" w:hAnsi="Aptos Display"/>
-          <w:sz w:val="28"/>
-          <w:szCs w:val="28"/>
-        </w:rPr>
-        <w:t>….also</w:t>
-      </w:r>
-      <w:proofErr w:type="gramEnd"/>
-      <w:r>
-        <w:rPr>
-          <w:rFonts w:ascii="Aptos Display" w:hAnsi="Aptos Display"/>
-          <w:sz w:val="28"/>
-          <w:szCs w:val="28"/>
-        </w:rPr>
-        <w:t xml:space="preserve"> add dampen Sign (*) together with piano’s on M79.</w:t>
+        <w:t>M77, Harp: Beat 4, Add Low “fff” D 3/4 flat with HALF PEDAL sign and (l.v.) slur in rhythmic unison with Piano….also add dampen Sign (*) together with piano’s on M79.</w:t>
       </w:r>
     </w:p>
     <w:p>
@@ -5013,25 +4001,7 @@
           <w:sz w:val="28"/>
           <w:szCs w:val="28"/>
         </w:rPr>
-        <w:t>M79, Oboe: Change dynamics to “mf (shape dynamics freely)</w:t>
-      </w:r>
-      <w:proofErr w:type="gramStart"/>
-      <w:r>
-        <w:rPr>
-          <w:rFonts w:ascii="Aptos Display" w:hAnsi="Aptos Display"/>
-          <w:sz w:val="28"/>
-          <w:szCs w:val="28"/>
-        </w:rPr>
-        <w:t>” ;</w:t>
-      </w:r>
-      <w:proofErr w:type="gramEnd"/>
-      <w:r>
-        <w:rPr>
-          <w:rFonts w:ascii="Aptos Display" w:hAnsi="Aptos Display"/>
-          <w:sz w:val="28"/>
-          <w:szCs w:val="28"/>
-        </w:rPr>
-        <w:t xml:space="preserve"> also change “solo” to “solo, espressivo”</w:t>
+        <w:t>M79, Oboe: Change dynamics to “mf (shape dynamics freely)” ; also change “solo” to “solo, espressivo”</w:t>
       </w:r>
       <w:r>
         <w:rPr>
@@ -5061,18 +4031,8 @@
           <w:sz w:val="28"/>
           <w:szCs w:val="28"/>
         </w:rPr>
-        <w:t xml:space="preserve">M82, Vl2: missing half note </w:t>
-      </w:r>
-      <w:proofErr w:type="gramStart"/>
-      <w:r>
-        <w:rPr>
-          <w:rFonts w:ascii="Aptos Display" w:hAnsi="Aptos Display"/>
-          <w:sz w:val="28"/>
-          <w:szCs w:val="28"/>
-        </w:rPr>
-        <w:t>rest</w:t>
-      </w:r>
-      <w:proofErr w:type="gramEnd"/>
+        <w:t>M82, Vl2: missing half note rest</w:t>
+      </w:r>
     </w:p>
     <w:p>
       <w:pPr>
@@ -5124,55 +4084,17 @@
         </w:numPr>
         <w:rPr>
           <w:rFonts w:ascii="Aptos Display" w:hAnsi="Aptos Display"/>
-          <w:b/>
-          <w:bCs/>
-          <w:sz w:val="28"/>
-          <w:szCs w:val="28"/>
-        </w:rPr>
-      </w:pPr>
-      <w:r>
-        <w:rPr>
-          <w:rFonts w:ascii="Aptos Display" w:hAnsi="Aptos Display"/>
-          <w:b/>
-          <w:bCs/>
-          <w:sz w:val="28"/>
-          <w:szCs w:val="28"/>
-        </w:rPr>
-        <w:t xml:space="preserve">M79 – 100: strings: add number of </w:t>
-      </w:r>
-      <w:proofErr w:type="spellStart"/>
-      <w:proofErr w:type="gramStart"/>
-      <w:r>
-        <w:rPr>
-          <w:rFonts w:ascii="Aptos Display" w:hAnsi="Aptos Display"/>
-          <w:b/>
-          <w:bCs/>
-          <w:sz w:val="28"/>
-          <w:szCs w:val="28"/>
-        </w:rPr>
-        <w:t>gracenotes</w:t>
-      </w:r>
-      <w:proofErr w:type="spellEnd"/>
-      <w:r>
-        <w:rPr>
-          <w:rFonts w:ascii="Aptos Display" w:hAnsi="Aptos Display"/>
-          <w:b/>
-          <w:bCs/>
-          <w:sz w:val="28"/>
-          <w:szCs w:val="28"/>
-        </w:rPr>
-        <w:t xml:space="preserve">  to</w:t>
-      </w:r>
-      <w:proofErr w:type="gramEnd"/>
-      <w:r>
-        <w:rPr>
-          <w:rFonts w:ascii="Aptos Display" w:hAnsi="Aptos Display"/>
-          <w:b/>
-          <w:bCs/>
-          <w:sz w:val="28"/>
-          <w:szCs w:val="28"/>
-        </w:rPr>
-        <w:t xml:space="preserve"> anything larger than 3 attacks, such as “(5 attacks)” , “(8 attacks)” , “(13 attacks)”</w:t>
+          <w:sz w:val="28"/>
+          <w:szCs w:val="28"/>
+        </w:rPr>
+      </w:pPr>
+      <w:r>
+        <w:rPr>
+          <w:rFonts w:ascii="Aptos Display" w:hAnsi="Aptos Display"/>
+          <w:sz w:val="28"/>
+          <w:szCs w:val="28"/>
+        </w:rPr>
+        <w:t>M79 – 100: strings: add number of gracenotes  to anything larger than 3 attacks, such as “(5 attacks)” , “(8 attacks)” , “(13 attacks)”</w:t>
       </w:r>
     </w:p>
     <w:p>
@@ -5243,43 +4165,7 @@
           <w:sz w:val="28"/>
           <w:szCs w:val="28"/>
         </w:rPr>
-        <w:t xml:space="preserve">M100, oboe: tie oboe </w:t>
-      </w:r>
-      <w:proofErr w:type="gramStart"/>
-      <w:r>
-        <w:rPr>
-          <w:rFonts w:ascii="Aptos Display" w:hAnsi="Aptos Display"/>
-          <w:sz w:val="28"/>
-          <w:szCs w:val="28"/>
-        </w:rPr>
-        <w:t>note</w:t>
-      </w:r>
-      <w:proofErr w:type="gramEnd"/>
-      <w:r>
-        <w:rPr>
-          <w:rFonts w:ascii="Aptos Display" w:hAnsi="Aptos Display"/>
-          <w:sz w:val="28"/>
-          <w:szCs w:val="28"/>
-        </w:rPr>
-        <w:t xml:space="preserve"> across bar into 101, and diminuendo throughout 100-101 to “</w:t>
-      </w:r>
-      <w:proofErr w:type="spellStart"/>
-      <w:r>
-        <w:rPr>
-          <w:rFonts w:ascii="Aptos Display" w:hAnsi="Aptos Display"/>
-          <w:sz w:val="28"/>
-          <w:szCs w:val="28"/>
-        </w:rPr>
-        <w:t>ppp</w:t>
-      </w:r>
-      <w:proofErr w:type="spellEnd"/>
-      <w:r>
-        <w:rPr>
-          <w:rFonts w:ascii="Aptos Display" w:hAnsi="Aptos Display"/>
-          <w:sz w:val="28"/>
-          <w:szCs w:val="28"/>
-        </w:rPr>
-        <w:t>”</w:t>
+        <w:t>M100, oboe: tie oboe note across bar into 101, and diminuendo throughout 100-101 to “ppp”</w:t>
       </w:r>
     </w:p>
     <w:p>
@@ -5310,45 +4196,7 @@
           <w:sz w:val="28"/>
           <w:szCs w:val="28"/>
         </w:rPr>
-        <w:t>M102, Winds and Strings: make “</w:t>
-      </w:r>
-      <w:proofErr w:type="spellStart"/>
-      <w:r>
-        <w:rPr>
-          <w:rFonts w:ascii="Aptos Display" w:hAnsi="Aptos Display"/>
-          <w:sz w:val="28"/>
-          <w:szCs w:val="28"/>
-        </w:rPr>
-        <w:t>sfz</w:t>
-      </w:r>
-      <w:proofErr w:type="spellEnd"/>
-      <w:r>
-        <w:rPr>
-          <w:rFonts w:ascii="Aptos Display" w:hAnsi="Aptos Display"/>
-          <w:sz w:val="28"/>
-          <w:szCs w:val="28"/>
-        </w:rPr>
-        <w:t>&gt;p” into “</w:t>
-      </w:r>
-      <w:proofErr w:type="spellStart"/>
-      <w:proofErr w:type="gramStart"/>
-      <w:r>
-        <w:rPr>
-          <w:rFonts w:ascii="Aptos Display" w:hAnsi="Aptos Display"/>
-          <w:sz w:val="28"/>
-          <w:szCs w:val="28"/>
-        </w:rPr>
-        <w:t>sfzp</w:t>
-      </w:r>
-      <w:proofErr w:type="spellEnd"/>
-      <w:proofErr w:type="gramEnd"/>
-      <w:r>
-        <w:rPr>
-          <w:rFonts w:ascii="Aptos Display" w:hAnsi="Aptos Display"/>
-          <w:sz w:val="28"/>
-          <w:szCs w:val="28"/>
-        </w:rPr>
-        <w:t>”</w:t>
+        <w:t>M102, Winds and Strings: make “sfz&gt;p” into “sfzp”</w:t>
       </w:r>
     </w:p>
     <w:p>
@@ -5495,61 +4343,7 @@
           <w:sz w:val="28"/>
           <w:szCs w:val="28"/>
         </w:rPr>
-        <w:t xml:space="preserve">M121, </w:t>
-      </w:r>
-      <w:proofErr w:type="spellStart"/>
-      <w:r>
-        <w:rPr>
-          <w:rFonts w:ascii="Aptos Display" w:hAnsi="Aptos Display"/>
-          <w:sz w:val="28"/>
-          <w:szCs w:val="28"/>
-        </w:rPr>
-        <w:t>fl</w:t>
-      </w:r>
-      <w:proofErr w:type="spellEnd"/>
-      <w:r>
-        <w:rPr>
-          <w:rFonts w:ascii="Aptos Display" w:hAnsi="Aptos Display"/>
-          <w:sz w:val="28"/>
-          <w:szCs w:val="28"/>
-        </w:rPr>
-        <w:t xml:space="preserve">, </w:t>
-      </w:r>
-      <w:proofErr w:type="spellStart"/>
-      <w:r>
-        <w:rPr>
-          <w:rFonts w:ascii="Aptos Display" w:hAnsi="Aptos Display"/>
-          <w:sz w:val="28"/>
-          <w:szCs w:val="28"/>
-        </w:rPr>
-        <w:t>ob</w:t>
-      </w:r>
-      <w:proofErr w:type="spellEnd"/>
-      <w:r>
-        <w:rPr>
-          <w:rFonts w:ascii="Aptos Display" w:hAnsi="Aptos Display"/>
-          <w:sz w:val="28"/>
-          <w:szCs w:val="28"/>
-        </w:rPr>
-        <w:t xml:space="preserve">, cl: Beat 1, remove </w:t>
-      </w:r>
-      <w:proofErr w:type="gramStart"/>
-      <w:r>
-        <w:rPr>
-          <w:rFonts w:ascii="Aptos Display" w:hAnsi="Aptos Display"/>
-          <w:sz w:val="28"/>
-          <w:szCs w:val="28"/>
-        </w:rPr>
-        <w:t>dot</w:t>
-      </w:r>
-      <w:proofErr w:type="gramEnd"/>
-      <w:r>
-        <w:rPr>
-          <w:rFonts w:ascii="Aptos Display" w:hAnsi="Aptos Display"/>
-          <w:sz w:val="28"/>
-          <w:szCs w:val="28"/>
-        </w:rPr>
-        <w:t xml:space="preserve"> and add 32</w:t>
+        <w:t>M121, fl, ob, cl: Beat 1, remove dot and add 32</w:t>
       </w:r>
       <w:r>
         <w:rPr>
@@ -5608,45 +4402,7 @@
           <w:sz w:val="28"/>
           <w:szCs w:val="28"/>
         </w:rPr>
-        <w:t>Winds and Strings: make “</w:t>
-      </w:r>
-      <w:proofErr w:type="spellStart"/>
-      <w:r>
-        <w:rPr>
-          <w:rFonts w:ascii="Aptos Display" w:hAnsi="Aptos Display"/>
-          <w:sz w:val="28"/>
-          <w:szCs w:val="28"/>
-        </w:rPr>
-        <w:t>sfz</w:t>
-      </w:r>
-      <w:proofErr w:type="spellEnd"/>
-      <w:r>
-        <w:rPr>
-          <w:rFonts w:ascii="Aptos Display" w:hAnsi="Aptos Display"/>
-          <w:sz w:val="28"/>
-          <w:szCs w:val="28"/>
-        </w:rPr>
-        <w:t>&gt;p” into “</w:t>
-      </w:r>
-      <w:proofErr w:type="spellStart"/>
-      <w:proofErr w:type="gramStart"/>
-      <w:r>
-        <w:rPr>
-          <w:rFonts w:ascii="Aptos Display" w:hAnsi="Aptos Display"/>
-          <w:sz w:val="28"/>
-          <w:szCs w:val="28"/>
-        </w:rPr>
-        <w:t>sfzp</w:t>
-      </w:r>
-      <w:proofErr w:type="spellEnd"/>
-      <w:proofErr w:type="gramEnd"/>
-      <w:r>
-        <w:rPr>
-          <w:rFonts w:ascii="Aptos Display" w:hAnsi="Aptos Display"/>
-          <w:sz w:val="28"/>
-          <w:szCs w:val="28"/>
-        </w:rPr>
-        <w:t>”</w:t>
+        <w:t>Winds and Strings: make “sfz&gt;p” into “sfzp”</w:t>
       </w:r>
     </w:p>
     <w:p>
@@ -5680,18 +4436,8 @@
           <w:sz w:val="28"/>
           <w:szCs w:val="28"/>
         </w:rPr>
-        <w:t xml:space="preserve">M127, Sax: Beat 2 has wrong notes, should just continue descending by ¼ tone…should be Eb, E3/4 flat, </w:t>
-      </w:r>
-      <w:proofErr w:type="gramStart"/>
-      <w:r>
-        <w:rPr>
-          <w:rFonts w:ascii="Aptos Display" w:hAnsi="Aptos Display"/>
-          <w:sz w:val="28"/>
-          <w:szCs w:val="28"/>
-        </w:rPr>
-        <w:t>D</w:t>
-      </w:r>
-      <w:proofErr w:type="gramEnd"/>
+        <w:t>M127, Sax: Beat 2 has wrong notes, should just continue descending by ¼ tone…should be Eb, E3/4 flat, D</w:t>
+      </w:r>
     </w:p>
     <w:p>
       <w:pPr>
@@ -5732,25 +4478,7 @@
           <w:sz w:val="28"/>
           <w:szCs w:val="28"/>
         </w:rPr>
-        <w:t>9, Winds and Strings (except viola): Beat 1, make crescendo from “P” on first note to “</w:t>
-      </w:r>
-      <w:proofErr w:type="spellStart"/>
-      <w:r>
-        <w:rPr>
-          <w:rFonts w:ascii="Aptos Display" w:hAnsi="Aptos Display"/>
-          <w:sz w:val="28"/>
-          <w:szCs w:val="28"/>
-        </w:rPr>
-        <w:t>mp</w:t>
-      </w:r>
-      <w:proofErr w:type="spellEnd"/>
-      <w:r>
-        <w:rPr>
-          <w:rFonts w:ascii="Aptos Display" w:hAnsi="Aptos Display"/>
-          <w:sz w:val="28"/>
-          <w:szCs w:val="28"/>
-        </w:rPr>
-        <w:t>”; then make BEAT 2 “sub f” instead of just “f”</w:t>
+        <w:t>9, Winds and Strings (except viola): Beat 1, make crescendo from “P” on first note to “mp”; then make BEAT 2 “sub f” instead of just “f”</w:t>
       </w:r>
       <w:r>
         <w:rPr>
@@ -5792,18 +4520,8 @@
           <w:sz w:val="28"/>
           <w:szCs w:val="28"/>
         </w:rPr>
-        <w:t xml:space="preserve">M131, Fl and Cl: Beat 4, flip flute note with clarinet </w:t>
-      </w:r>
-      <w:proofErr w:type="gramStart"/>
-      <w:r>
-        <w:rPr>
-          <w:rFonts w:ascii="Aptos Display" w:hAnsi="Aptos Display"/>
-          <w:sz w:val="28"/>
-          <w:szCs w:val="28"/>
-        </w:rPr>
-        <w:t>note</w:t>
-      </w:r>
-      <w:proofErr w:type="gramEnd"/>
+        <w:t>M131, Fl and Cl: Beat 4, flip flute note with clarinet note</w:t>
+      </w:r>
     </w:p>
     <w:p>
       <w:pPr>
@@ -5928,25 +4646,7 @@
           <w:sz w:val="28"/>
           <w:szCs w:val="28"/>
         </w:rPr>
-        <w:t>M143, Oboe, Change dynamics to “mf (shape dynamics freely)</w:t>
-      </w:r>
-      <w:proofErr w:type="gramStart"/>
-      <w:r>
-        <w:rPr>
-          <w:rFonts w:ascii="Aptos Display" w:hAnsi="Aptos Display"/>
-          <w:sz w:val="28"/>
-          <w:szCs w:val="28"/>
-        </w:rPr>
-        <w:t>” ;</w:t>
-      </w:r>
-      <w:proofErr w:type="gramEnd"/>
-      <w:r>
-        <w:rPr>
-          <w:rFonts w:ascii="Aptos Display" w:hAnsi="Aptos Display"/>
-          <w:sz w:val="28"/>
-          <w:szCs w:val="28"/>
-        </w:rPr>
-        <w:t xml:space="preserve"> also change “solo” to “solo, espressivo”</w:t>
+        <w:t>M143, Oboe, Change dynamics to “mf (shape dynamics freely)” ; also change “solo” to “solo, espressivo”</w:t>
       </w:r>
     </w:p>
     <w:p>
@@ -5980,25 +4680,7 @@
           <w:sz w:val="28"/>
           <w:szCs w:val="28"/>
         </w:rPr>
-        <w:t xml:space="preserve">M148, Sax, delete “legato </w:t>
-      </w:r>
-      <w:proofErr w:type="spellStart"/>
-      <w:r>
-        <w:rPr>
-          <w:rFonts w:ascii="Aptos Display" w:hAnsi="Aptos Display"/>
-          <w:sz w:val="28"/>
-          <w:szCs w:val="28"/>
-        </w:rPr>
-        <w:t>posibile</w:t>
-      </w:r>
-      <w:proofErr w:type="spellEnd"/>
-      <w:r>
-        <w:rPr>
-          <w:rFonts w:ascii="Aptos Display" w:hAnsi="Aptos Display"/>
-          <w:sz w:val="28"/>
-          <w:szCs w:val="28"/>
-        </w:rPr>
-        <w:t>” and instead slur until Beat 2 of m151. Then slur M151-153.</w:t>
+        <w:t>M148, Sax, delete “legato posibile” and instead slur until Beat 2 of m151. Then slur M151-153.</w:t>
       </w:r>
     </w:p>
     <w:p>
@@ -6065,18 +4747,8 @@
           <w:sz w:val="28"/>
           <w:szCs w:val="28"/>
         </w:rPr>
-        <w:t xml:space="preserve">M153, oboe: beat 1, add A# grace note and slur (above) first attack G1/4 </w:t>
-      </w:r>
-      <w:proofErr w:type="gramStart"/>
-      <w:r>
-        <w:rPr>
-          <w:rFonts w:ascii="Aptos Display" w:hAnsi="Aptos Display"/>
-          <w:sz w:val="28"/>
-          <w:szCs w:val="28"/>
-        </w:rPr>
-        <w:t>flat</w:t>
-      </w:r>
-      <w:proofErr w:type="gramEnd"/>
+        <w:t>M153, oboe: beat 1, add A# grace note and slur (above) first attack G1/4 flat</w:t>
+      </w:r>
     </w:p>
     <w:p>
       <w:pPr>
@@ -6109,25 +4781,7 @@
           <w:sz w:val="28"/>
           <w:szCs w:val="28"/>
         </w:rPr>
-        <w:t xml:space="preserve">M154, Oboe and Flute: delete tie from oboe bar before and swap notes between </w:t>
-      </w:r>
-      <w:proofErr w:type="spellStart"/>
-      <w:r>
-        <w:rPr>
-          <w:rFonts w:ascii="Aptos Display" w:hAnsi="Aptos Display"/>
-          <w:sz w:val="28"/>
-          <w:szCs w:val="28"/>
-        </w:rPr>
-        <w:t>ob</w:t>
-      </w:r>
-      <w:proofErr w:type="spellEnd"/>
-      <w:r>
-        <w:rPr>
-          <w:rFonts w:ascii="Aptos Display" w:hAnsi="Aptos Display"/>
-          <w:sz w:val="28"/>
-          <w:szCs w:val="28"/>
-        </w:rPr>
-        <w:t xml:space="preserve"> and flute…</w:t>
+        <w:t>M154, Oboe and Flute: delete tie from oboe bar before and swap notes between ob and flute…</w:t>
       </w:r>
     </w:p>
     <w:p>
@@ -6161,43 +4815,7 @@
           <w:sz w:val="28"/>
           <w:szCs w:val="28"/>
         </w:rPr>
-        <w:t>M154, Winds and strings: make “</w:t>
-      </w:r>
-      <w:proofErr w:type="spellStart"/>
-      <w:r>
-        <w:rPr>
-          <w:rFonts w:ascii="Aptos Display" w:hAnsi="Aptos Display"/>
-          <w:sz w:val="28"/>
-          <w:szCs w:val="28"/>
-        </w:rPr>
-        <w:t>sfz</w:t>
-      </w:r>
-      <w:proofErr w:type="spellEnd"/>
-      <w:r>
-        <w:rPr>
-          <w:rFonts w:ascii="Aptos Display" w:hAnsi="Aptos Display"/>
-          <w:sz w:val="28"/>
-          <w:szCs w:val="28"/>
-        </w:rPr>
-        <w:t>&gt;p” into “</w:t>
-      </w:r>
-      <w:proofErr w:type="spellStart"/>
-      <w:r>
-        <w:rPr>
-          <w:rFonts w:ascii="Aptos Display" w:hAnsi="Aptos Display"/>
-          <w:sz w:val="28"/>
-          <w:szCs w:val="28"/>
-        </w:rPr>
-        <w:t>sfzp</w:t>
-      </w:r>
-      <w:proofErr w:type="spellEnd"/>
-      <w:r>
-        <w:rPr>
-          <w:rFonts w:ascii="Aptos Display" w:hAnsi="Aptos Display"/>
-          <w:sz w:val="28"/>
-          <w:szCs w:val="28"/>
-        </w:rPr>
-        <w:t>”, including oboe (previously “p”)</w:t>
+        <w:t>M154, Winds and strings: make “sfz&gt;p” into “sfzp”, including oboe (previously “p”)</w:t>
       </w:r>
     </w:p>
     <w:p>
@@ -6832,23 +5450,38 @@
           <w:color w:val="500050"/>
           <w:shd w:val="clear" w:color="auto" w:fill="FFFFFF"/>
         </w:rPr>
-        <w:t xml:space="preserve">3. - M154, Oboe and Flute: delete tie from oboe bar before and swap notes between </w:t>
-      </w:r>
-      <w:proofErr w:type="spellStart"/>
-      <w:r>
+        <w:t>3. - M154, Oboe and Flute: delete tie from oboe bar before and swap notes between ob and flute…</w:t>
+      </w:r>
+    </w:p>
+    <w:p>
+      <w:pPr>
         <w:rPr>
           <w:color w:val="500050"/>
           <w:shd w:val="clear" w:color="auto" w:fill="FFFFFF"/>
         </w:rPr>
-        <w:t>ob</w:t>
-      </w:r>
-      <w:proofErr w:type="spellEnd"/>
-      <w:r>
-        <w:rPr>
+      </w:pPr>
+      <w:r>
+        <w:rPr>
+          <w:b/>
+          <w:bCs/>
           <w:color w:val="500050"/>
           <w:shd w:val="clear" w:color="auto" w:fill="FFFFFF"/>
         </w:rPr>
-        <w:t xml:space="preserve"> and flute…</w:t>
+        <w:t>Would you like the slur to end in m. 153 as well or keep it until 154?</w:t>
+      </w:r>
+    </w:p>
+    <w:p>
+      <w:pPr>
+        <w:shd w:val="clear" w:color="auto" w:fill="FFFFFF"/>
+        <w:rPr>
+          <w:color w:val="ED5C57"/>
+        </w:rPr>
+      </w:pPr>
+      <w:r>
+        <w:rPr>
+          <w:color w:val="ED5C57"/>
+        </w:rPr>
+        <w:t>Slur can end on 153</w:t>
       </w:r>
     </w:p>
     <w:p>
@@ -6858,217 +5491,275 @@
           <w:shd w:val="clear" w:color="auto" w:fill="FFFFFF"/>
         </w:rPr>
       </w:pPr>
-      <w:r>
-        <w:rPr>
-          <w:b/>
-          <w:bCs/>
+    </w:p>
+    <w:p>
+      <w:pPr>
+        <w:rPr>
           <w:color w:val="500050"/>
           <w:shd w:val="clear" w:color="auto" w:fill="FFFFFF"/>
         </w:rPr>
-        <w:t>Would you like the slur to end in m. 153 as well or keep it until 154?</w:t>
-      </w:r>
-    </w:p>
-    <w:p>
-      <w:pPr>
-        <w:shd w:val="clear" w:color="auto" w:fill="FFFFFF"/>
-        <w:rPr>
-          <w:color w:val="ED5C57"/>
-        </w:rPr>
-      </w:pPr>
-      <w:r>
-        <w:rPr>
-          <w:color w:val="ED5C57"/>
-        </w:rPr>
-        <w:t xml:space="preserve">Slur can end on </w:t>
-      </w:r>
-      <w:proofErr w:type="gramStart"/>
-      <w:r>
-        <w:rPr>
-          <w:color w:val="ED5C57"/>
-        </w:rPr>
-        <w:t>153</w:t>
-      </w:r>
-      <w:proofErr w:type="gramEnd"/>
-    </w:p>
-    <w:p>
-      <w:pPr>
+      </w:pPr>
+      <w:r>
         <w:rPr>
           <w:color w:val="500050"/>
           <w:shd w:val="clear" w:color="auto" w:fill="FFFFFF"/>
         </w:rPr>
-      </w:pPr>
-    </w:p>
-    <w:p>
-      <w:pPr>
+        <w:t>4. For the Skins in Perc. 2 - right now the noteheads fall on the same spaces as the Temple blocks. Should we approach it differently?</w:t>
+      </w:r>
+      <w:r>
         <w:rPr>
           <w:color w:val="500050"/>
           <w:shd w:val="clear" w:color="auto" w:fill="FFFFFF"/>
         </w:rPr>
-      </w:pPr>
+        <w:fldChar w:fldCharType="begin"/>
+      </w:r>
       <w:r>
         <w:rPr>
           <w:color w:val="500050"/>
           <w:shd w:val="clear" w:color="auto" w:fill="FFFFFF"/>
         </w:rPr>
-        <w:t>4. For the Skins in Perc. 2 - right now the noteheads fall on the same spaces as the Temple blocks. Should we approach it differently?</w:t>
+        <w:instrText xml:space="preserve"> INCLUDEPICTURE "https://mail.google.com/mail/u/0?ui=2&amp;ik=2652d32d0a&amp;attid=0.3&amp;permmsgid=msg-f:1794858290058637249&amp;th=18e89e1af11c2fc1&amp;view=fimg&amp;fur=ip&amp;sz=s0-l75-ft&amp;attbid=ANGjdJ-PG4M9blaisRXXjlaZTgFrKe7KvG-FRxmSzD96ayxhPILFExXEoapA7Fkp3yOElFyS9hY2FauYhU9hr2OaCbCVskfLgxcVahPZIfOFMchyOEWr4LcHmnycb6o&amp;disp=emb" \* MERGEFORMATINET </w:instrText>
       </w:r>
       <w:r>
         <w:rPr>
           <w:color w:val="500050"/>
           <w:shd w:val="clear" w:color="auto" w:fill="FFFFFF"/>
         </w:rPr>
-        <w:fldChar w:fldCharType="begin"/>
+        <w:fldChar w:fldCharType="separate"/>
       </w:r>
       <w:r>
         <w:rPr>
           <w:color w:val="500050"/>
           <w:shd w:val="clear" w:color="auto" w:fill="FFFFFF"/>
         </w:rPr>
-        <w:instrText xml:space="preserve"> INCLUDEPICTURE "https://mail.google.com/mail/u/0?ui=2&amp;ik=2652d32d0a&amp;attid=0.3&amp;permmsgid=msg-f:1794858290058637249&amp;th=18e89e1af11c2fc1&amp;view=fimg&amp;fur=ip&amp;sz=s0-l75-ft&amp;attbid=ANGjdJ-PG4M9blaisRXXjlaZTgFrKe7KvG-FRxmSzD96ayxhPILFExXEoapA7Fkp3yOElFyS9hY2FauYhU9hr2OaCbCVskfLgxcVahPZIfOFMchyOEWr4LcHmnycb6o&amp;disp=emb" \* MERGEFORMATINET </w:instrText>
-      </w:r>
-      <w:r>
+        <w:fldChar w:fldCharType="end"/>
+      </w:r>
+    </w:p>
+    <w:p>
+      <w:pPr>
         <w:rPr>
           <w:color w:val="500050"/>
           <w:shd w:val="clear" w:color="auto" w:fill="FFFFFF"/>
         </w:rPr>
-        <w:fldChar w:fldCharType="separate"/>
-      </w:r>
-      <w:r>
-        <w:rPr>
-          <w:color w:val="500050"/>
+      </w:pPr>
+    </w:p>
+    <w:p>
+      <w:pPr>
+        <w:shd w:val="clear" w:color="auto" w:fill="FFFFFF"/>
+        <w:rPr>
+          <w:color w:val="ED5C57"/>
+        </w:rPr>
+      </w:pPr>
+      <w:r>
+        <w:rPr>
+          <w:color w:val="ED5C57"/>
+        </w:rPr>
+        <w:t>lets definitely move skins to lines</w:t>
+      </w:r>
+    </w:p>
+    <w:p>
+      <w:pPr>
+        <w:rPr>
+          <w:rFonts w:ascii="Aptos Display" w:hAnsi="Aptos Display"/>
+          <w:b/>
+          <w:bCs/>
+          <w:sz w:val="28"/>
+          <w:szCs w:val="28"/>
+        </w:rPr>
+      </w:pPr>
+    </w:p>
+    <w:p>
+      <w:pPr>
+        <w:rPr>
+          <w:rFonts w:ascii="Aptos Display" w:hAnsi="Aptos Display"/>
+          <w:b/>
+          <w:bCs/>
+          <w:sz w:val="28"/>
+          <w:szCs w:val="28"/>
+        </w:rPr>
+      </w:pPr>
+    </w:p>
+    <w:p>
+      <w:pPr>
+        <w:rPr>
+          <w:rFonts w:ascii="Aptos Display" w:hAnsi="Aptos Display"/>
+          <w:b/>
+          <w:bCs/>
+          <w:sz w:val="28"/>
+          <w:szCs w:val="28"/>
+        </w:rPr>
+      </w:pPr>
+    </w:p>
+    <w:p>
+      <w:pPr>
+        <w:shd w:val="clear" w:color="auto" w:fill="FFFFFF"/>
+        <w:rPr>
+          <w:rFonts w:ascii="Calibri" w:hAnsi="Calibri" w:cs="Calibri"/>
+          <w:color w:val="000000"/>
+          <w:sz w:val="28"/>
+          <w:szCs w:val="28"/>
+        </w:rPr>
+      </w:pPr>
+      <w:r>
+        <w:rPr>
+          <w:rFonts w:ascii="Calibri" w:hAnsi="Calibri" w:cs="Calibri"/>
+          <w:color w:val="000000"/>
+          <w:sz w:val="28"/>
+          <w:szCs w:val="28"/>
+        </w:rPr>
+        <w:t>M1 - PERC 1 – sorry, let’s just call RH “5 Wood Planks” throughout the piece, remove “Low” (Same for percussion diagram in the beginning).</w:t>
+      </w:r>
+    </w:p>
+    <w:p>
+      <w:pPr>
+        <w:shd w:val="clear" w:color="auto" w:fill="FFFFFF"/>
+        <w:rPr>
+          <w:rFonts w:ascii="Calibri" w:hAnsi="Calibri" w:cs="Calibri"/>
+          <w:color w:val="000000"/>
+          <w:sz w:val="28"/>
+          <w:szCs w:val="28"/>
+        </w:rPr>
+      </w:pPr>
+    </w:p>
+    <w:p>
+      <w:pPr>
+        <w:shd w:val="clear" w:color="auto" w:fill="FFFFFF"/>
+        <w:rPr>
+          <w:rFonts w:ascii="Calibri" w:hAnsi="Calibri" w:cs="Calibri"/>
+          <w:color w:val="000000"/>
+          <w:sz w:val="28"/>
+          <w:szCs w:val="28"/>
+        </w:rPr>
+      </w:pPr>
+      <w:r>
+        <w:rPr>
+          <w:rFonts w:ascii="Calibri" w:hAnsi="Calibri" w:cs="Calibri"/>
+          <w:color w:val="000000"/>
+          <w:sz w:val="28"/>
+          <w:szCs w:val="28"/>
+        </w:rPr>
+        <w:t>M80, harp should be a half pedal buzz. </w:t>
+      </w:r>
+    </w:p>
+    <w:p>
+      <w:pPr>
+        <w:shd w:val="clear" w:color="auto" w:fill="FFFFFF"/>
+        <w:rPr>
+          <w:rFonts w:ascii="Calibri" w:hAnsi="Calibri" w:cs="Calibri"/>
+          <w:b/>
+          <w:bCs/>
+          <w:color w:val="000000"/>
+          <w:sz w:val="28"/>
+          <w:szCs w:val="28"/>
+        </w:rPr>
+      </w:pPr>
+    </w:p>
+    <w:p>
+      <w:pPr>
+        <w:shd w:val="clear" w:color="auto" w:fill="FFFFFF"/>
+        <w:rPr>
+          <w:rFonts w:ascii="Calibri" w:hAnsi="Calibri" w:cs="Calibri"/>
+          <w:color w:val="000000"/>
+          <w:sz w:val="28"/>
+          <w:szCs w:val="28"/>
+        </w:rPr>
+      </w:pPr>
+      <w:r>
+        <w:rPr>
+          <w:rFonts w:ascii="Calibri" w:hAnsi="Calibri" w:cs="Calibri"/>
+          <w:color w:val="000000"/>
+          <w:sz w:val="28"/>
+          <w:szCs w:val="28"/>
+        </w:rPr>
+        <w:t xml:space="preserve">Oboe solo parts – remove mf-f sempre as applicable. </w:t>
+      </w:r>
+    </w:p>
+    <w:p>
+      <w:pPr>
+        <w:shd w:val="clear" w:color="auto" w:fill="FFFFFF"/>
+        <w:rPr>
+          <w:color w:val="222222"/>
+        </w:rPr>
+      </w:pPr>
+    </w:p>
+    <w:p>
+      <w:pPr>
+        <w:shd w:val="clear" w:color="auto" w:fill="FFFFFF"/>
+        <w:rPr>
+          <w:rFonts w:ascii="Calibri" w:hAnsi="Calibri" w:cs="Calibri"/>
+          <w:b/>
+          <w:bCs/>
+          <w:sz w:val="28"/>
+          <w:szCs w:val="28"/>
           <w:shd w:val="clear" w:color="auto" w:fill="FFFFFF"/>
         </w:rPr>
-        <w:fldChar w:fldCharType="end"/>
-      </w:r>
-    </w:p>
-    <w:p>
-      <w:pPr>
-        <w:rPr>
-          <w:color w:val="500050"/>
+      </w:pPr>
+      <w:r>
+        <w:rPr>
+          <w:rFonts w:ascii="Calibri" w:hAnsi="Calibri" w:cs="Calibri"/>
+          <w:sz w:val="28"/>
+          <w:szCs w:val="28"/>
           <w:shd w:val="clear" w:color="auto" w:fill="FFFFFF"/>
         </w:rPr>
-      </w:pPr>
-    </w:p>
-    <w:p>
-      <w:pPr>
-        <w:shd w:val="clear" w:color="auto" w:fill="FFFFFF"/>
-        <w:rPr>
-          <w:color w:val="ED5C57"/>
-        </w:rPr>
-      </w:pPr>
-      <w:proofErr w:type="spellStart"/>
-      <w:proofErr w:type="gramStart"/>
-      <w:r>
-        <w:rPr>
-          <w:color w:val="ED5C57"/>
-        </w:rPr>
-        <w:t>lets</w:t>
-      </w:r>
-      <w:proofErr w:type="spellEnd"/>
-      <w:proofErr w:type="gramEnd"/>
-      <w:r>
-        <w:rPr>
-          <w:color w:val="ED5C57"/>
-        </w:rPr>
-        <w:t xml:space="preserve"> definitely move skins to lines</w:t>
-      </w:r>
-    </w:p>
-    <w:p>
-      <w:pPr>
-        <w:rPr>
-          <w:rFonts w:ascii="Aptos Display" w:hAnsi="Aptos Display"/>
-          <w:b/>
-          <w:bCs/>
-          <w:sz w:val="28"/>
-          <w:szCs w:val="28"/>
-        </w:rPr>
-      </w:pPr>
-    </w:p>
-    <w:p>
-      <w:pPr>
-        <w:rPr>
-          <w:rFonts w:ascii="Aptos Display" w:hAnsi="Aptos Display"/>
-          <w:b/>
-          <w:bCs/>
-          <w:sz w:val="28"/>
-          <w:szCs w:val="28"/>
-        </w:rPr>
-      </w:pPr>
-    </w:p>
-    <w:p>
-      <w:pPr>
-        <w:rPr>
-          <w:rFonts w:ascii="Aptos Display" w:hAnsi="Aptos Display"/>
-          <w:b/>
-          <w:bCs/>
-          <w:sz w:val="28"/>
-          <w:szCs w:val="28"/>
-        </w:rPr>
-      </w:pPr>
-    </w:p>
-    <w:p>
-      <w:pPr>
-        <w:shd w:val="clear" w:color="auto" w:fill="FFFFFF"/>
+        <w:t>For hard section</w:t>
+      </w:r>
+      <w:r>
         <w:rPr>
           <w:rFonts w:ascii="Calibri" w:hAnsi="Calibri" w:cs="Calibri"/>
-          <w:color w:val="000000"/>
-          <w:sz w:val="28"/>
-          <w:szCs w:val="28"/>
-        </w:rPr>
-      </w:pPr>
+          <w:sz w:val="28"/>
+          <w:szCs w:val="28"/>
+          <w:shd w:val="clear" w:color="auto" w:fill="FFFFFF"/>
+        </w:rPr>
+        <w:t xml:space="preserve"> -</w:t>
+      </w:r>
       <w:r>
         <w:rPr>
           <w:rFonts w:ascii="Calibri" w:hAnsi="Calibri" w:cs="Calibri"/>
-          <w:color w:val="000000"/>
-          <w:sz w:val="28"/>
-          <w:szCs w:val="28"/>
-        </w:rPr>
-        <w:t>M1 - PERC 1 – sorry, let’s just call RH “5 Wood Planks” throughout the piece, remove “Low” (Same for percussion diagram in the beginning).</w:t>
-      </w:r>
-    </w:p>
-    <w:p>
-      <w:pPr>
-        <w:shd w:val="clear" w:color="auto" w:fill="FFFFFF"/>
+          <w:b/>
+          <w:bCs/>
+          <w:sz w:val="28"/>
+          <w:szCs w:val="28"/>
+          <w:shd w:val="clear" w:color="auto" w:fill="FFFFFF"/>
+        </w:rPr>
+        <w:t xml:space="preserve"> </w:t>
+      </w:r>
+      <w:r>
         <w:rPr>
           <w:rFonts w:ascii="Calibri" w:hAnsi="Calibri" w:cs="Calibri"/>
-          <w:color w:val="000000"/>
-          <w:sz w:val="28"/>
-          <w:szCs w:val="28"/>
-        </w:rPr>
-      </w:pPr>
+          <w:sz w:val="28"/>
+          <w:szCs w:val="28"/>
+          <w:shd w:val="clear" w:color="auto" w:fill="FFFFFF"/>
+        </w:rPr>
+        <w:t>Let’s actually leave it exactly as manuscript</w:t>
+      </w:r>
     </w:p>
     <w:p>
       <w:pPr>
         <w:shd w:val="clear" w:color="auto" w:fill="FFFFFF"/>
         <w:rPr>
           <w:rFonts w:ascii="Calibri" w:hAnsi="Calibri" w:cs="Calibri"/>
-          <w:color w:val="000000"/>
-          <w:sz w:val="28"/>
-          <w:szCs w:val="28"/>
-        </w:rPr>
-      </w:pPr>
-      <w:r>
+          <w:sz w:val="28"/>
+          <w:szCs w:val="28"/>
+          <w:shd w:val="clear" w:color="auto" w:fill="FFFFFF"/>
+        </w:rPr>
+      </w:pPr>
+    </w:p>
+    <w:p>
+      <w:pPr>
+        <w:shd w:val="clear" w:color="auto" w:fill="FFFFFF"/>
         <w:rPr>
           <w:rFonts w:ascii="Calibri" w:hAnsi="Calibri" w:cs="Calibri"/>
-          <w:color w:val="000000"/>
-          <w:sz w:val="28"/>
-          <w:szCs w:val="28"/>
-        </w:rPr>
-        <w:t>M80, harp should be a half pedal buzz. </w:t>
-      </w:r>
-    </w:p>
-    <w:p>
-      <w:pPr>
-        <w:shd w:val="clear" w:color="auto" w:fill="FFFFFF"/>
+        </w:rPr>
+      </w:pPr>
+      <w:r>
         <w:rPr>
           <w:rFonts w:ascii="Calibri" w:hAnsi="Calibri" w:cs="Calibri"/>
-          <w:b/>
-          <w:bCs/>
-          <w:color w:val="000000"/>
-          <w:sz w:val="28"/>
-          <w:szCs w:val="28"/>
-        </w:rPr>
-      </w:pPr>
+          <w:sz w:val="28"/>
+          <w:szCs w:val="28"/>
+          <w:shd w:val="clear" w:color="auto" w:fill="FFFFFF"/>
+        </w:rPr>
+        <w:t>M177 (manuscript), which we should change it to Skins and only have 1 staff for Perc 1</w:t>
+      </w:r>
     </w:p>
     <w:p>
       <w:pPr>
@@ -7080,6 +5771,15 @@
           <w:szCs w:val="28"/>
         </w:rPr>
       </w:pPr>
+    </w:p>
+    <w:p>
+      <w:pPr>
+        <w:shd w:val="clear" w:color="auto" w:fill="FFFFFF"/>
+        <w:rPr>
+          <w:rFonts w:ascii="Aptos" w:hAnsi="Aptos"/>
+          <w:color w:val="000000"/>
+        </w:rPr>
+      </w:pPr>
       <w:r>
         <w:rPr>
           <w:rFonts w:ascii="Calibri" w:hAnsi="Calibri" w:cs="Calibri"/>
@@ -7087,155 +5787,8 @@
           <w:sz w:val="28"/>
           <w:szCs w:val="28"/>
         </w:rPr>
-        <w:t xml:space="preserve">Oboe solo parts – remove mf-f sempre as applicable. </w:t>
-      </w:r>
-    </w:p>
-    <w:p>
-      <w:pPr>
-        <w:shd w:val="clear" w:color="auto" w:fill="FFFFFF"/>
-        <w:rPr>
-          <w:color w:val="222222"/>
-        </w:rPr>
-      </w:pPr>
-    </w:p>
-    <w:p>
-      <w:pPr>
-        <w:shd w:val="clear" w:color="auto" w:fill="FFFFFF"/>
-        <w:rPr>
-          <w:rFonts w:ascii="Calibri" w:hAnsi="Calibri" w:cs="Calibri"/>
-          <w:b/>
-          <w:bCs/>
-          <w:sz w:val="28"/>
-          <w:szCs w:val="28"/>
-          <w:shd w:val="clear" w:color="auto" w:fill="FFFFFF"/>
-        </w:rPr>
-      </w:pPr>
-      <w:r>
-        <w:rPr>
-          <w:rFonts w:ascii="Calibri" w:hAnsi="Calibri" w:cs="Calibri"/>
-          <w:sz w:val="28"/>
-          <w:szCs w:val="28"/>
-          <w:shd w:val="clear" w:color="auto" w:fill="FFFFFF"/>
-        </w:rPr>
-        <w:t>For hard section</w:t>
-      </w:r>
-      <w:r>
-        <w:rPr>
-          <w:rFonts w:ascii="Calibri" w:hAnsi="Calibri" w:cs="Calibri"/>
-          <w:sz w:val="28"/>
-          <w:szCs w:val="28"/>
-          <w:shd w:val="clear" w:color="auto" w:fill="FFFFFF"/>
-        </w:rPr>
-        <w:t xml:space="preserve"> -</w:t>
-      </w:r>
-      <w:r>
-        <w:rPr>
-          <w:rFonts w:ascii="Calibri" w:hAnsi="Calibri" w:cs="Calibri"/>
-          <w:b/>
-          <w:bCs/>
-          <w:sz w:val="28"/>
-          <w:szCs w:val="28"/>
-          <w:shd w:val="clear" w:color="auto" w:fill="FFFFFF"/>
-        </w:rPr>
-        <w:t xml:space="preserve"> </w:t>
-      </w:r>
-      <w:r>
-        <w:rPr>
-          <w:rFonts w:ascii="Calibri" w:hAnsi="Calibri" w:cs="Calibri"/>
-          <w:sz w:val="28"/>
-          <w:szCs w:val="28"/>
-          <w:shd w:val="clear" w:color="auto" w:fill="FFFFFF"/>
-        </w:rPr>
-        <w:t xml:space="preserve">Let’s </w:t>
-      </w:r>
-      <w:proofErr w:type="gramStart"/>
-      <w:r>
-        <w:rPr>
-          <w:rFonts w:ascii="Calibri" w:hAnsi="Calibri" w:cs="Calibri"/>
-          <w:sz w:val="28"/>
-          <w:szCs w:val="28"/>
-          <w:shd w:val="clear" w:color="auto" w:fill="FFFFFF"/>
-        </w:rPr>
-        <w:t>actually leave</w:t>
-      </w:r>
-      <w:proofErr w:type="gramEnd"/>
-      <w:r>
-        <w:rPr>
-          <w:rFonts w:ascii="Calibri" w:hAnsi="Calibri" w:cs="Calibri"/>
-          <w:sz w:val="28"/>
-          <w:szCs w:val="28"/>
-          <w:shd w:val="clear" w:color="auto" w:fill="FFFFFF"/>
-        </w:rPr>
-        <w:t xml:space="preserve"> it exactly as manuscript</w:t>
-      </w:r>
-    </w:p>
-    <w:p>
-      <w:pPr>
-        <w:shd w:val="clear" w:color="auto" w:fill="FFFFFF"/>
-        <w:rPr>
-          <w:rFonts w:ascii="Calibri" w:hAnsi="Calibri" w:cs="Calibri"/>
-          <w:sz w:val="28"/>
-          <w:szCs w:val="28"/>
-          <w:shd w:val="clear" w:color="auto" w:fill="FFFFFF"/>
-        </w:rPr>
-      </w:pPr>
-    </w:p>
-    <w:p>
-      <w:pPr>
-        <w:shd w:val="clear" w:color="auto" w:fill="FFFFFF"/>
-        <w:rPr>
-          <w:rFonts w:ascii="Calibri" w:hAnsi="Calibri" w:cs="Calibri"/>
-        </w:rPr>
-      </w:pPr>
-      <w:r>
-        <w:rPr>
-          <w:rFonts w:ascii="Calibri" w:hAnsi="Calibri" w:cs="Calibri"/>
-          <w:sz w:val="28"/>
-          <w:szCs w:val="28"/>
-          <w:shd w:val="clear" w:color="auto" w:fill="FFFFFF"/>
-        </w:rPr>
-        <w:t>M177 (manuscript), which we should change it to Skins and only have 1 staff for Perc 1</w:t>
-      </w:r>
-    </w:p>
-    <w:p>
-      <w:pPr>
-        <w:shd w:val="clear" w:color="auto" w:fill="FFFFFF"/>
-        <w:rPr>
-          <w:rFonts w:ascii="Calibri" w:hAnsi="Calibri" w:cs="Calibri"/>
-          <w:color w:val="000000"/>
-          <w:sz w:val="28"/>
-          <w:szCs w:val="28"/>
-        </w:rPr>
-      </w:pPr>
-    </w:p>
-    <w:p>
-      <w:pPr>
-        <w:shd w:val="clear" w:color="auto" w:fill="FFFFFF"/>
-        <w:rPr>
-          <w:rFonts w:ascii="Aptos" w:hAnsi="Aptos"/>
-          <w:color w:val="000000"/>
-        </w:rPr>
-      </w:pPr>
-      <w:r>
-        <w:rPr>
-          <w:rFonts w:ascii="Calibri" w:hAnsi="Calibri" w:cs="Calibri"/>
-          <w:color w:val="000000"/>
-          <w:sz w:val="28"/>
-          <w:szCs w:val="28"/>
-        </w:rPr>
-        <w:t xml:space="preserve">M185 – should be Skins for both Perc; one </w:t>
-      </w:r>
-      <w:proofErr w:type="gramStart"/>
-      <w:r>
-        <w:rPr>
-          <w:rFonts w:ascii="Calibri" w:hAnsi="Calibri" w:cs="Calibri"/>
-          <w:color w:val="000000"/>
-          <w:sz w:val="28"/>
-          <w:szCs w:val="28"/>
-        </w:rPr>
-        <w:t>staff</w:t>
-      </w:r>
-      <w:proofErr w:type="gramEnd"/>
+        <w:t>M185 – should be Skins for both Perc; one staff</w:t>
+      </w:r>
     </w:p>
     <w:p>
       <w:pPr>
@@ -7263,19 +5816,8 @@
           <w:sz w:val="28"/>
           <w:szCs w:val="28"/>
         </w:rPr>
-        <w:t xml:space="preserve">M186, FL – Missing natural sign on second </w:t>
-      </w:r>
-      <w:proofErr w:type="gramStart"/>
-      <w:r>
-        <w:rPr>
-          <w:rFonts w:ascii="Calibri" w:hAnsi="Calibri" w:cs="Calibri"/>
-          <w:color w:val="000000"/>
-          <w:sz w:val="28"/>
-          <w:szCs w:val="28"/>
-        </w:rPr>
-        <w:t>note</w:t>
-      </w:r>
-      <w:proofErr w:type="gramEnd"/>
+        <w:t>M186, FL – Missing natural sign on second note</w:t>
+      </w:r>
     </w:p>
     <w:p>
       <w:pPr>
@@ -7332,19 +5874,8 @@
           <w:sz w:val="28"/>
           <w:szCs w:val="28"/>
         </w:rPr>
-        <w:t xml:space="preserve">M199, Perc 1 and 2: Make both perc </w:t>
-      </w:r>
-      <w:proofErr w:type="gramStart"/>
-      <w:r>
-        <w:rPr>
-          <w:rFonts w:ascii="Calibri" w:hAnsi="Calibri" w:cs="Calibri"/>
-          <w:color w:val="000000"/>
-          <w:sz w:val="28"/>
-          <w:szCs w:val="28"/>
-        </w:rPr>
-        <w:t>Skins</w:t>
-      </w:r>
-      <w:proofErr w:type="gramEnd"/>
+        <w:t>M199, Perc 1 and 2: Make both perc Skins</w:t>
+      </w:r>
     </w:p>
     <w:p>
       <w:pPr>
@@ -7373,39 +5904,8 @@
           <w:szCs w:val="28"/>
         </w:rPr>
         <w:lastRenderedPageBreak/>
-        <w:t xml:space="preserve">M199, fermata: clean up fermata so it </w:t>
-      </w:r>
-      <w:proofErr w:type="spellStart"/>
-      <w:r>
-        <w:rPr>
-          <w:rFonts w:ascii="Calibri" w:hAnsi="Calibri" w:cs="Calibri"/>
-          <w:color w:val="000000"/>
-          <w:sz w:val="28"/>
-          <w:szCs w:val="28"/>
-        </w:rPr>
-        <w:t>doen’t</w:t>
-      </w:r>
-      <w:proofErr w:type="spellEnd"/>
-      <w:r>
-        <w:rPr>
-          <w:rFonts w:ascii="Calibri" w:hAnsi="Calibri" w:cs="Calibri"/>
-          <w:color w:val="000000"/>
-          <w:sz w:val="28"/>
-          <w:szCs w:val="28"/>
-        </w:rPr>
-        <w:t xml:space="preserve"> touch </w:t>
-      </w:r>
-      <w:proofErr w:type="gramStart"/>
-      <w:r>
-        <w:rPr>
-          <w:rFonts w:ascii="Calibri" w:hAnsi="Calibri" w:cs="Calibri"/>
-          <w:color w:val="000000"/>
-          <w:sz w:val="28"/>
-          <w:szCs w:val="28"/>
-        </w:rPr>
-        <w:t>meter</w:t>
-      </w:r>
-      <w:proofErr w:type="gramEnd"/>
+        <w:t>M199, fermata: clean up fermata so it doen’t touch meter</w:t>
+      </w:r>
     </w:p>
     <w:p>
       <w:pPr>
@@ -7433,19 +5933,8 @@
           <w:sz w:val="28"/>
           <w:szCs w:val="28"/>
         </w:rPr>
-        <w:t xml:space="preserve">M200 – REMOVE REPEATS and percussion back to woods after </w:t>
-      </w:r>
-      <w:proofErr w:type="gramStart"/>
-      <w:r>
-        <w:rPr>
-          <w:rFonts w:ascii="Calibri" w:hAnsi="Calibri" w:cs="Calibri"/>
-          <w:color w:val="000000"/>
-          <w:sz w:val="28"/>
-          <w:szCs w:val="28"/>
-        </w:rPr>
-        <w:t>Skins</w:t>
-      </w:r>
-      <w:proofErr w:type="gramEnd"/>
+        <w:t>M200 – REMOVE REPEATS and percussion back to woods after Skins</w:t>
+      </w:r>
     </w:p>
     <w:p>
       <w:pPr>
@@ -7473,27 +5962,7 @@
           <w:sz w:val="28"/>
           <w:szCs w:val="28"/>
         </w:rPr>
-        <w:t xml:space="preserve">M235, </w:t>
-      </w:r>
-      <w:proofErr w:type="gramStart"/>
-      <w:r>
-        <w:rPr>
-          <w:rFonts w:ascii="Calibri" w:hAnsi="Calibri" w:cs="Calibri"/>
-          <w:color w:val="000000"/>
-          <w:sz w:val="28"/>
-          <w:szCs w:val="28"/>
-        </w:rPr>
-        <w:t>PERC :</w:t>
-      </w:r>
-      <w:proofErr w:type="gramEnd"/>
-      <w:r>
-        <w:rPr>
-          <w:rFonts w:ascii="Calibri" w:hAnsi="Calibri" w:cs="Calibri"/>
-          <w:color w:val="000000"/>
-          <w:sz w:val="28"/>
-          <w:szCs w:val="28"/>
-        </w:rPr>
-        <w:t xml:space="preserve"> Make M235 both Perc parts Skins;</w:t>
+        <w:t>M235, PERC : Make M235 both Perc parts Skins;</w:t>
       </w:r>
     </w:p>
     <w:p>
@@ -7522,29 +5991,7 @@
           <w:sz w:val="28"/>
           <w:szCs w:val="28"/>
         </w:rPr>
-        <w:t>M236 – Perc: Delete Both percussion parts entirely, except for BEAT 4 of M236, which should now have a “</w:t>
-      </w:r>
-      <w:proofErr w:type="spellStart"/>
-      <w:proofErr w:type="gramStart"/>
-      <w:r>
-        <w:rPr>
-          <w:rFonts w:ascii="Calibri" w:hAnsi="Calibri" w:cs="Calibri"/>
-          <w:color w:val="000000"/>
-          <w:sz w:val="28"/>
-          <w:szCs w:val="28"/>
-        </w:rPr>
-        <w:t>fff</w:t>
-      </w:r>
-      <w:proofErr w:type="spellEnd"/>
-      <w:proofErr w:type="gramEnd"/>
-      <w:r>
-        <w:rPr>
-          <w:rFonts w:ascii="Calibri" w:hAnsi="Calibri" w:cs="Calibri"/>
-          <w:color w:val="000000"/>
-          <w:sz w:val="28"/>
-          <w:szCs w:val="28"/>
-        </w:rPr>
-        <w:t>”</w:t>
+        <w:t>M236 – Perc: Delete Both percussion parts entirely, except for BEAT 4 of M236, which should now have a “fff”</w:t>
       </w:r>
     </w:p>
     <w:p>
@@ -7581,27 +6028,7 @@
           <w:sz w:val="28"/>
           <w:szCs w:val="28"/>
         </w:rPr>
-        <w:t>Further changes (3</w:t>
-      </w:r>
-      <w:r>
-        <w:rPr>
-          <w:rFonts w:ascii="Aptos Display" w:hAnsi="Aptos Display"/>
-          <w:b/>
-          <w:bCs/>
-          <w:sz w:val="28"/>
-          <w:szCs w:val="28"/>
-        </w:rPr>
-        <w:t>1</w:t>
-      </w:r>
-      <w:r>
-        <w:rPr>
-          <w:rFonts w:ascii="Aptos Display" w:hAnsi="Aptos Display"/>
-          <w:b/>
-          <w:bCs/>
-          <w:sz w:val="28"/>
-          <w:szCs w:val="28"/>
-        </w:rPr>
-        <w:t xml:space="preserve"> Mar)</w:t>
+        <w:t>Further changes (31 Mar)</w:t>
       </w:r>
     </w:p>
     <w:p>
@@ -7614,41 +6041,12 @@
     </w:p>
     <w:p>
       <w:r>
-        <w:t xml:space="preserve">Last note of the perc (bass and kick) (end of </w:t>
-      </w:r>
-      <w:proofErr w:type="gramStart"/>
-      <w:r>
-        <w:t>piece)Please</w:t>
-      </w:r>
-      <w:proofErr w:type="gramEnd"/>
-      <w:r>
-        <w:t xml:space="preserve"> remove staccato.</w:t>
+        <w:t>Last note of the perc (bass and kick) (end of piece)Please remove staccato.</w:t>
       </w:r>
       <w:r>
         <w:br/>
-        <w:t>Just accent will do and (</w:t>
-      </w:r>
-      <w:proofErr w:type="spellStart"/>
-      <w:r>
-        <w:t>l.v.</w:t>
-      </w:r>
-      <w:proofErr w:type="spellEnd"/>
-      <w:r>
-        <w:t xml:space="preserve">) - you can just use an lv </w:t>
-      </w:r>
-      <w:proofErr w:type="spellStart"/>
-      <w:r>
-        <w:t>tie.I</w:t>
-      </w:r>
-      <w:proofErr w:type="spellEnd"/>
-      <w:r>
-        <w:t xml:space="preserve"> think I removed the fermata from that note, but I haven't, remove that too. So the fermata should just be the big 7" one at the </w:t>
-      </w:r>
-      <w:proofErr w:type="spellStart"/>
-      <w:r>
-        <w:t>barline</w:t>
-      </w:r>
-      <w:proofErr w:type="spellEnd"/>
+        <w:t>Just accent will do and (l.v.) - you can just use an lv tie.I think I removed the fermata from that note, but I haven't, remove that too. So the fermata should just be the big 7" one at the barline</w:t>
+      </w:r>
     </w:p>
     <w:p>
       <w:pPr>
@@ -10010,6 +8408,7 @@
   <w:style w:type="character" w:default="1" w:styleId="DefaultParagraphFont">
     <w:name w:val="Default Paragraph Font"/>
     <w:uiPriority w:val="1"/>
+    <w:semiHidden/>
     <w:unhideWhenUsed/>
   </w:style>
   <w:style w:type="table" w:default="1" w:styleId="TableNormal">

</xml_diff>